<commit_message>
Attività 7.10: allinea il .docx finale alla formattazione delle RP di progetto
Replica lo stile delle relazioni finali (es. RP 7.4):
- titoli in Times New Roman grassetto verde scuro (#024C41): sezioni 16pt
  (Heading 2, in maiuscolo) e sottosezioni 13pt (Heading 3);
- corpo Arial Narrow 11pt giustificato; titolo di testata Arial Narrow 28pt
  grassetto; metadati Calibri 18pt grassetto (N° RP7.10, versione, data,
  responsabilità);
- didascalie di figure e tabelle a 10pt centrate; immagini centrate;
- rimossa la doppia didascalia delle figure (disabilitato implicit_figures).

Sezioni principali della relazione portate in maiuscolo (1. INTRODUZIONE, ...).

Co-Authored-By: Claude Opus 4.8 <noreply@anthropic.com>
Claude-Session: https://claude.ai/code/session_015QT2JA1oFXsRPjgDL4ULzw
</commit_message>
<xml_diff>
--- a/docs/RP7.10_AI_Business_Model.docx
+++ b/docs/RP7.10_AI_Business_Model.docx
@@ -12,7 +12,7 @@
         <w:rPr>
           <w:rFonts w:ascii="Arial Narrow" w:hAnsi="Arial Narrow"/>
           <w:b/>
-          <w:sz w:val="48"/>
+          <w:sz w:val="56"/>
         </w:rPr>
         <w:t>Sviluppo di un modello di business basato sull'Intelligenza Artificiale (AI-BM)</w:t>
       </w:r>
@@ -26,9 +26,9 @@
         <w:rPr>
           <w:rFonts w:ascii="Calibri" w:hAnsi="Calibri"/>
           <w:b/>
-          <w:sz w:val="30"/>
-        </w:rPr>
-        <w:t>Progetto START — SusTainable dAta-dRiven manufacTuring</w:t>
+          <w:sz w:val="36"/>
+        </w:rPr>
+        <w:t>Relazione Parziale N°: RP7.10</w:t>
       </w:r>
     </w:p>
     <w:p>
@@ -40,9 +40,9 @@
         <w:rPr>
           <w:rFonts w:ascii="Calibri" w:hAnsi="Calibri"/>
           <w:b/>
-          <w:sz w:val="30"/>
-        </w:rPr>
-        <w:t>OR 7 — Validazione in ambiente operativo della Intelligent Industry · Attività 7.10</w:t>
+          <w:sz w:val="36"/>
+        </w:rPr>
+        <w:t>Versione del Documento: RV.1</w:t>
       </w:r>
     </w:p>
     <w:p>
@@ -54,9 +54,9 @@
         <w:rPr>
           <w:rFonts w:ascii="Calibri" w:hAnsi="Calibri"/>
           <w:b/>
-          <w:sz w:val="30"/>
-        </w:rPr>
-        <w:t>Relazione Parziale N°: RP 7.10</w:t>
+          <w:sz w:val="36"/>
+        </w:rPr>
+        <w:t>Data di Revisione del Documento: 07.08.2026</w:t>
       </w:r>
     </w:p>
     <w:p>
@@ -68,23 +68,9 @@
         <w:rPr>
           <w:rFonts w:ascii="Calibri" w:hAnsi="Calibri"/>
           <w:b/>
-          <w:sz w:val="30"/>
-        </w:rPr>
-        <w:t>Versione del Documento: R1.0 — Data di Revisione del Documento: 07.08.2026</w:t>
-      </w:r>
-    </w:p>
-    <w:p>
-      <w:pPr>
-        <w:spacing w:after="60"/>
-        <w:jc w:val="center"/>
-      </w:pPr>
-      <w:r>
-        <w:rPr>
-          <w:rFonts w:ascii="Calibri" w:hAnsi="Calibri"/>
-          <w:b/>
-          <w:sz w:val="30"/>
-        </w:rPr>
-        <w:t>Responsabilità: Gresmalt S.p.A. — Capofila</w:t>
+          <w:sz w:val="36"/>
+        </w:rPr>
+        <w:t>Responsabilità: Gresmalt — Capofila</w:t>
       </w:r>
     </w:p>
     <w:p>
@@ -97,16 +83,16 @@
     </w:p>
     <w:p>
       <w:pPr>
-        <w:pStyle w:val="Heading1"/>
-      </w:pPr>
-      <w:r>
-        <w:t xml:space="preserve">1. Introduzione</w:t>
+        <w:pStyle w:val="Heading2"/>
+      </w:pPr>
+      <w:r>
+        <w:t xml:space="preserve">1. INTRODUZIONE</w:t>
       </w:r>
     </w:p>
     <w:bookmarkStart w:id="20" w:name="background"/>
     <w:p>
       <w:pPr>
-        <w:pStyle w:val="Heading2"/>
+        <w:pStyle w:val="Heading3"/>
       </w:pPr>
       <w:r>
         <w:t xml:space="preserve">1.1 Background</w:t>
@@ -328,7 +314,7 @@
     <w:bookmarkStart w:id="21" w:name="Xa5b2ad20cc57e1d2111a580dd09802b180148e1"/>
     <w:p>
       <w:pPr>
-        <w:pStyle w:val="Heading2"/>
+        <w:pStyle w:val="Heading3"/>
       </w:pPr>
       <w:r>
         <w:t xml:space="preserve">1.2 Il modello di business guidato dalla AI e la sua costruzione</w:t>
@@ -590,7 +576,7 @@
     <w:bookmarkStart w:id="22" w:name="baseline"/>
     <w:p>
       <w:pPr>
-        <w:pStyle w:val="Heading2"/>
+        <w:pStyle w:val="Heading3"/>
       </w:pPr>
       <w:r>
         <w:t xml:space="preserve">1.3 Baseline</w:t>
@@ -676,7 +662,7 @@
     <w:bookmarkStart w:id="23" w:name="scopi-dellattività"/>
     <w:p>
       <w:pPr>
-        <w:pStyle w:val="Heading2"/>
+        <w:pStyle w:val="Heading3"/>
       </w:pPr>
       <w:r>
         <w:t xml:space="preserve">1.4 Scopi dell’attività</w:t>
@@ -817,16 +803,16 @@
     <w:bookmarkStart w:id="33" w:name="metodologia"/>
     <w:p>
       <w:pPr>
-        <w:pStyle w:val="Heading1"/>
-      </w:pPr>
-      <w:r>
-        <w:t xml:space="preserve">2. Metodologia</w:t>
+        <w:pStyle w:val="Heading2"/>
+      </w:pPr>
+      <w:r>
+        <w:t xml:space="preserve">2. METODOLOGIA</w:t>
       </w:r>
     </w:p>
     <w:bookmarkStart w:id="28" w:name="dallevidenza-dei-collaudi-allai-bm"/>
     <w:p>
       <w:pPr>
-        <w:pStyle w:val="Heading2"/>
+        <w:pStyle w:val="Heading3"/>
       </w:pPr>
       <w:r>
         <w:t xml:space="preserve">2.1 Dall’evidenza dei collaudi all’AI-BM</w:t>
@@ -974,7 +960,8 @@
     </w:p>
     <w:p>
       <w:pPr>
-        <w:pStyle w:val="CaptionedFigure"/>
+        <w:pStyle w:val="BodyText"/>
+        <w:jc w:val="center"/>
       </w:pPr>
       <w:r>
         <w:drawing>
@@ -1021,20 +1008,14 @@
     </w:p>
     <w:p>
       <w:pPr>
-        <w:pStyle w:val="ImageCaption"/>
-      </w:pPr>
-      <w:r>
-        <w:t xml:space="preserve">Figura 1 — Metodo dell’attività 7.10.</w:t>
-      </w:r>
-    </w:p>
-    <w:p>
-      <w:pPr>
         <w:pStyle w:val="BodyText"/>
+        <w:jc w:val="center"/>
       </w:pPr>
       <w:r>
         <w:rPr>
           <w:iCs/>
           <w:i/>
+          <w:sz w:val="20"/>
         </w:rPr>
         <w:t xml:space="preserve">Figura 1. Dall’evidenza dei collaudi dell’OR 7 all’AI-BM: la catena dato → informazione → valore alimenta il Business Model Canvas (KPI) e l’analisi strategica (baseline: BM tradizionale → obiettivo: AI-BM).</w:t>
       </w:r>
@@ -1043,7 +1024,7 @@
     <w:bookmarkStart w:id="29" w:name="il-business-model-canvas-come-kpi"/>
     <w:p>
       <w:pPr>
-        <w:pStyle w:val="Heading2"/>
+        <w:pStyle w:val="Heading3"/>
       </w:pPr>
       <w:r>
         <w:t xml:space="preserve">2.2 Il Business Model Canvas come KPI</w:t>
@@ -1135,7 +1116,7 @@
     <w:bookmarkStart w:id="30" w:name="limpianto-di-analisi-strategica"/>
     <w:p>
       <w:pPr>
-        <w:pStyle w:val="Heading2"/>
+        <w:pStyle w:val="Heading3"/>
       </w:pPr>
       <w:r>
         <w:t xml:space="preserve">2.3 L’impianto di analisi strategica</w:t>
@@ -1360,7 +1341,7 @@
     <w:bookmarkStart w:id="31" w:name="X8a59671842ed881cb06b8fdc4dadaebe202d056"/>
     <w:p>
       <w:pPr>
-        <w:pStyle w:val="Heading2"/>
+        <w:pStyle w:val="Heading3"/>
       </w:pPr>
       <w:r>
         <w:t xml:space="preserve">2.4 Trattamento del problema progettuale n. 10</w:t>
@@ -1407,7 +1388,7 @@
     <w:bookmarkStart w:id="32" w:name="riproducibilità"/>
     <w:p>
       <w:pPr>
-        <w:pStyle w:val="Heading2"/>
+        <w:pStyle w:val="Heading3"/>
       </w:pPr>
       <w:r>
         <w:t xml:space="preserve">2.5 Riproducibilità</w:t>
@@ -1478,16 +1459,16 @@
     <w:bookmarkStart w:id="52" w:name="risultati"/>
     <w:p>
       <w:pPr>
-        <w:pStyle w:val="Heading1"/>
-      </w:pPr>
-      <w:r>
-        <w:t xml:space="preserve">3. Risultati</w:t>
+        <w:pStyle w:val="Heading2"/>
+      </w:pPr>
+      <w:r>
+        <w:t xml:space="preserve">3. RISULTATI</w:t>
       </w:r>
     </w:p>
     <w:bookmarkStart w:id="37" w:name="il-business-model-canvas-dellai-bm-kpi"/>
     <w:p>
       <w:pPr>
-        <w:pStyle w:val="Heading2"/>
+        <w:pStyle w:val="Heading3"/>
       </w:pPr>
       <w:r>
         <w:t xml:space="preserve">3.1 Il Business Model Canvas dell’AI-BM (KPI)</w:t>
@@ -1551,7 +1532,8 @@
     </w:p>
     <w:p>
       <w:pPr>
-        <w:pStyle w:val="CaptionedFigure"/>
+        <w:pStyle w:val="BodyText"/>
+        <w:jc w:val="center"/>
       </w:pPr>
       <w:r>
         <w:drawing>
@@ -1598,20 +1580,14 @@
     </w:p>
     <w:p>
       <w:pPr>
-        <w:pStyle w:val="ImageCaption"/>
-      </w:pPr>
-      <w:r>
-        <w:t xml:space="preserve">Figura 2 — Business Model Canvas: da Modello tradizionale ad AI-BM.</w:t>
-      </w:r>
-    </w:p>
-    <w:p>
-      <w:pPr>
         <w:pStyle w:val="BodyText"/>
+        <w:jc w:val="center"/>
       </w:pPr>
       <w:r>
         <w:rPr>
           <w:iCs/>
           <w:i/>
+          <w:sz w:val="20"/>
         </w:rPr>
         <w:t xml:space="preserve">Figura 2. Il Business Model Canvas dell’AI-BM (KPI qualitativo). Per ogni blocco: configurazione tradizionale (as-is, in grigio) e configurazione AI-BM (to-be, evidenziata in verde).</w:t>
       </w:r>
@@ -1619,11 +1595,13 @@
     <w:p>
       <w:pPr>
         <w:pStyle w:val="BodyText"/>
-      </w:pPr>
-      <w:r>
-        <w:rPr>
-          <w:bCs/>
-          <w:b/>
+        <w:jc w:val="center"/>
+      </w:pPr>
+      <w:r>
+        <w:rPr>
+          <w:bCs/>
+          <w:b/>
+          <w:sz w:val="20"/>
         </w:rPr>
         <w:t xml:space="preserve">Tabella 1 — Business Model Canvas: as-is (tradizionale) → to-be (AI-BM).</w:t>
       </w:r>
@@ -2269,11 +2247,13 @@
     <w:p>
       <w:pPr>
         <w:pStyle w:val="BodyText"/>
-      </w:pPr>
-      <w:r>
-        <w:rPr>
-          <w:bCs/>
-          <w:b/>
+        <w:jc w:val="center"/>
+      </w:pPr>
+      <w:r>
+        <w:rPr>
+          <w:bCs/>
+          <w:b/>
+          <w:sz w:val="20"/>
         </w:rPr>
         <w:t xml:space="preserve">Tabella 2 — Verifica del KPI.</w:t>
       </w:r>
@@ -2424,7 +2404,7 @@
     <w:bookmarkStart w:id="38" w:name="la-catena-dato-informazione-valore"/>
     <w:p>
       <w:pPr>
-        <w:pStyle w:val="Heading2"/>
+        <w:pStyle w:val="Heading3"/>
       </w:pPr>
       <w:r>
         <w:t xml:space="preserve">3.2 La catena dato → informazione → valore</w:t>
@@ -2537,7 +2517,7 @@
     <w:bookmarkStart w:id="42" w:name="analisi-swot-dellai-bm"/>
     <w:p>
       <w:pPr>
-        <w:pStyle w:val="Heading2"/>
+        <w:pStyle w:val="Heading3"/>
       </w:pPr>
       <w:r>
         <w:t xml:space="preserve">3.3 Analisi SWOT dell’AI-BM</w:t>
@@ -2646,7 +2626,8 @@
     </w:p>
     <w:p>
       <w:pPr>
-        <w:pStyle w:val="CaptionedFigure"/>
+        <w:pStyle w:val="BodyText"/>
+        <w:jc w:val="center"/>
       </w:pPr>
       <w:r>
         <w:drawing>
@@ -2693,20 +2674,14 @@
     </w:p>
     <w:p>
       <w:pPr>
-        <w:pStyle w:val="ImageCaption"/>
-      </w:pPr>
-      <w:r>
-        <w:t xml:space="preserve">Figura 3 — Analisi SWOT dell’AI-BM.</w:t>
-      </w:r>
-    </w:p>
-    <w:p>
-      <w:pPr>
         <w:pStyle w:val="BodyText"/>
+        <w:jc w:val="center"/>
       </w:pPr>
       <w:r>
         <w:rPr>
           <w:iCs/>
           <w:i/>
+          <w:sz w:val="20"/>
         </w:rPr>
         <w:t xml:space="preserve">Figura 3. Matrice SWOT: fattori interni (forze/debolezze) ed esterni (opportunità/minacce) dell’AI-BM.</w:t>
       </w:r>
@@ -2715,7 +2690,7 @@
     <w:bookmarkStart w:id="46" w:name="Xaabcf5fa73b2790af27c63e484473f75223c06b"/>
     <w:p>
       <w:pPr>
-        <w:pStyle w:val="Heading2"/>
+        <w:pStyle w:val="Heading3"/>
       </w:pPr>
       <w:r>
         <w:t xml:space="preserve">3.4 Il transition model e le tensioni sistemiche</w:t>
@@ -2837,7 +2812,8 @@
     </w:p>
     <w:p>
       <w:pPr>
-        <w:pStyle w:val="CaptionedFigure"/>
+        <w:pStyle w:val="BodyText"/>
+        <w:jc w:val="center"/>
       </w:pPr>
       <w:r>
         <w:drawing>
@@ -2884,20 +2860,14 @@
     </w:p>
     <w:p>
       <w:pPr>
-        <w:pStyle w:val="ImageCaption"/>
-      </w:pPr>
-      <w:r>
-        <w:t xml:space="preserve">Figura 4 — Transition model, catena del valore e tensioni sistemiche.</w:t>
-      </w:r>
-    </w:p>
-    <w:p>
-      <w:pPr>
         <w:pStyle w:val="BodyText"/>
+        <w:jc w:val="center"/>
       </w:pPr>
       <w:r>
         <w:rPr>
           <w:iCs/>
           <w:i/>
+          <w:sz w:val="20"/>
         </w:rPr>
         <w:t xml:space="preserve">Figura 4. Transition model (as-is → to-be) su sei dimensioni; catena dato → informazione → valore; tensioni sistemiche dell’embodied AI-BM.</w:t>
       </w:r>
@@ -2906,7 +2876,7 @@
     <w:bookmarkStart w:id="50" w:name="quantificazione-economica-roiroa"/>
     <w:p>
       <w:pPr>
-        <w:pStyle w:val="Heading2"/>
+        <w:pStyle w:val="Heading3"/>
       </w:pPr>
       <w:r>
         <w:t xml:space="preserve">3.5 Quantificazione economica (ROI/ROA)</w:t>
@@ -3093,7 +3063,8 @@
     </w:p>
     <w:p>
       <w:pPr>
-        <w:pStyle w:val="CaptionedFigure"/>
+        <w:pStyle w:val="BodyText"/>
+        <w:jc w:val="center"/>
       </w:pPr>
       <w:r>
         <w:drawing>
@@ -3140,20 +3111,14 @@
     </w:p>
     <w:p>
       <w:pPr>
-        <w:pStyle w:val="ImageCaption"/>
-      </w:pPr>
-      <w:r>
-        <w:t xml:space="preserve">Figura 5 — Validazione economica dell’AI-BM (ROI, payback, ROA).</w:t>
-      </w:r>
-    </w:p>
-    <w:p>
-      <w:pPr>
         <w:pStyle w:val="BodyText"/>
+        <w:jc w:val="center"/>
       </w:pPr>
       <w:r>
         <w:rPr>
           <w:iCs/>
           <w:i/>
+          <w:sz w:val="20"/>
         </w:rPr>
         <w:t xml:space="preserve">Figura 5. Benefici netti annui, ROI/payback (livello di progetto) e ROA di gruppo di contesto con il contributo marginale dell’AI-BM (valori rappresentativi).</w:t>
       </w:r>
@@ -3161,11 +3126,13 @@
     <w:p>
       <w:pPr>
         <w:pStyle w:val="BodyText"/>
-      </w:pPr>
-      <w:r>
-        <w:rPr>
-          <w:bCs/>
-          <w:b/>
+        <w:jc w:val="center"/>
+      </w:pPr>
+      <w:r>
+        <w:rPr>
+          <w:bCs/>
+          <w:b/>
+          <w:sz w:val="20"/>
         </w:rPr>
         <w:t xml:space="preserve">Tabella 3 — Sintesi della validazione economica (valori rappresentativi, k€).</w:t>
       </w:r>
@@ -3423,7 +3390,7 @@
     <w:bookmarkStart w:id="51" w:name="esito"/>
     <w:p>
       <w:pPr>
-        <w:pStyle w:val="Heading2"/>
+        <w:pStyle w:val="Heading3"/>
       </w:pPr>
       <w:r>
         <w:t xml:space="preserve">3.6 Esito</w:t>
@@ -3478,16 +3445,16 @@
     <w:bookmarkStart w:id="58" w:name="discussione-e-conclusioni"/>
     <w:p>
       <w:pPr>
-        <w:pStyle w:val="Heading1"/>
-      </w:pPr>
-      <w:r>
-        <w:t xml:space="preserve">4. Discussione e conclusioni</w:t>
+        <w:pStyle w:val="Heading2"/>
+      </w:pPr>
+      <w:r>
+        <w:t xml:space="preserve">4. DISCUSSIONE E CONCLUSIONI</w:t>
       </w:r>
     </w:p>
     <w:bookmarkStart w:id="53" w:name="discussione-critica"/>
     <w:p>
       <w:pPr>
-        <w:pStyle w:val="Heading2"/>
+        <w:pStyle w:val="Heading3"/>
       </w:pPr>
       <w:r>
         <w:t xml:space="preserve">4.1 Discussione critica</w:t>
@@ -3595,7 +3562,7 @@
     <w:bookmarkStart w:id="54" w:name="X4a558afea6c9bb5f5308c7d4bb42ee93283a2dc"/>
     <w:p>
       <w:pPr>
-        <w:pStyle w:val="Heading2"/>
+        <w:pStyle w:val="Heading3"/>
       </w:pPr>
       <w:r>
         <w:t xml:space="preserve">4.2 Interdipendenze con altri OR e chiusura dell’OR 7</w:t>
@@ -3867,7 +3834,7 @@
     <w:bookmarkStart w:id="55" w:name="X76edcf1af8cd26072153b698b980e8b0ef68e1a"/>
     <w:p>
       <w:pPr>
-        <w:pStyle w:val="Heading2"/>
+        <w:pStyle w:val="Heading3"/>
       </w:pPr>
       <w:r>
         <w:t xml:space="preserve">4.3 Implicazioni operative rispetto alle Finalità del progetto</w:t>
@@ -3901,7 +3868,7 @@
     <w:bookmarkStart w:id="56" w:name="limiti-e-sviluppi"/>
     <w:p>
       <w:pPr>
-        <w:pStyle w:val="Heading2"/>
+        <w:pStyle w:val="Heading3"/>
       </w:pPr>
       <w:r>
         <w:t xml:space="preserve">4.4 Limiti e sviluppi</w:t>
@@ -3999,7 +3966,7 @@
     <w:bookmarkStart w:id="57" w:name="conclusioni"/>
     <w:p>
       <w:pPr>
-        <w:pStyle w:val="Heading2"/>
+        <w:pStyle w:val="Heading3"/>
       </w:pPr>
       <w:r>
         <w:t xml:space="preserve">4.5 Conclusioni</w:t>
@@ -4067,7 +4034,7 @@
     <w:bookmarkStart w:id="59" w:name="appendice-a-riproducibilità"/>
     <w:p>
       <w:pPr>
-        <w:pStyle w:val="Heading1"/>
+        <w:pStyle w:val="Heading2"/>
       </w:pPr>
       <w:r>
         <w:t xml:space="preserve">Appendice A — Riproducibilità</w:t>
@@ -4243,7 +4210,7 @@
     <w:bookmarkStart w:id="60" w:name="appendice-b-riferimenti"/>
     <w:p>
       <w:pPr>
-        <w:pStyle w:val="Heading1"/>
+        <w:pStyle w:val="Heading2"/>
       </w:pPr>
       <w:r>
         <w:t xml:space="preserve">Appendice B — Riferimenti</w:t>
@@ -4621,7 +4588,7 @@
     <w:rPr>
       <w:rFonts w:ascii="Arial Narrow" w:cs="Arial Narrow" w:hAnsi="Arial Narrow"/>
       <w:color w:val="000000"/>
-      <w:sz w:val="24"/>
+      <w:sz w:val="22"/>
     </w:rPr>
   </w:style>
   <w:style w:styleId="BodyText" w:type="paragraph">
@@ -4630,14 +4597,28 @@
     <w:link w:val="BodyTextChar"/>
     <w:pPr>
       <w:spacing w:after="180" w:before="180"/>
+      <w:jc w:val="both"/>
     </w:pPr>
     <w:qFormat/>
+    <w:rPr>
+      <w:rFonts w:ascii="Arial Narrow" w:cs="Arial Narrow" w:hAnsi="Arial Narrow"/>
+      <w:color w:val="000000"/>
+      <w:sz w:val="22"/>
+    </w:rPr>
   </w:style>
   <w:style w:customStyle="1" w:styleId="FirstParagraph" w:type="paragraph">
     <w:name w:val="First Paragraph"/>
     <w:basedOn w:val="BodyText"/>
     <w:next w:val="BodyText"/>
     <w:qFormat/>
+    <w:pPr>
+      <w:jc w:val="both"/>
+    </w:pPr>
+    <w:rPr>
+      <w:rFonts w:ascii="Arial Narrow" w:cs="Arial Narrow" w:hAnsi="Arial Narrow"/>
+      <w:color w:val="000000"/>
+      <w:sz w:val="22"/>
+    </w:rPr>
   </w:style>
   <w:style w:customStyle="1" w:styleId="Compact" w:type="paragraph">
     <w:name w:val="Compact"/>
@@ -4645,7 +4626,13 @@
     <w:qFormat/>
     <w:pPr>
       <w:spacing w:after="36" w:before="36"/>
+      <w:jc w:val="both"/>
     </w:pPr>
+    <w:rPr>
+      <w:rFonts w:ascii="Arial Narrow" w:cs="Arial Narrow" w:hAnsi="Arial Narrow"/>
+      <w:color w:val="000000"/>
+      <w:sz w:val="22"/>
+    </w:rPr>
   </w:style>
   <w:style w:styleId="Title" w:type="paragraph">
     <w:name w:val="Title"/>
@@ -4659,11 +4646,11 @@
       <w:jc w:val="center"/>
     </w:pPr>
     <w:rPr>
-      <w:rFonts w:ascii="Arial Narrow" w:asciiTheme="majorHAnsi" w:cs="Arial Narrow" w:cstheme="majorBidi" w:eastAsiaTheme="majorEastAsia" w:hAnsi="Arial Narrow" w:hAnsiTheme="majorHAnsi"/>
+      <w:rFonts w:asciiTheme="majorHAnsi" w:cstheme="majorBidi" w:eastAsiaTheme="majorEastAsia" w:hAnsiTheme="majorHAnsi"/>
       <w:b/>
       <w:bCs/>
-      <w:color w:val="000000"/>
-      <w:sz w:val="52"/>
+      <w:color w:themeColor="accent1" w:themeShade="B5" w:val="345A8A"/>
+      <w:sz w:val="36"/>
       <w:szCs w:val="36"/>
     </w:rPr>
   </w:style>
@@ -4754,15 +4741,16 @@
     <w:pPr>
       <w:keepNext/>
       <w:keepLines/>
-      <w:spacing w:after="80" w:before="200"/>
+      <w:spacing w:after="120" w:before="240"/>
+      <w:jc w:val="center"/>
       <w:outlineLvl w:val="0"/>
     </w:pPr>
     <w:rPr>
-      <w:rFonts w:ascii="Arial Narrow" w:asciiTheme="majorHAnsi" w:cs="Arial Narrow" w:cstheme="majorBidi" w:eastAsiaTheme="majorEastAsia" w:hAnsi="Arial Narrow" w:hAnsiTheme="majorHAnsi"/>
+      <w:rFonts w:ascii="Times New Roman" w:asciiTheme="majorHAnsi" w:cs="Times New Roman" w:cstheme="majorBidi" w:eastAsiaTheme="majorEastAsia" w:hAnsi="Times New Roman" w:hAnsiTheme="majorHAnsi"/>
       <w:b/>
       <w:bCs/>
-      <w:color w:val="000000"/>
-      <w:sz w:val="36"/>
+      <w:color w:val="024C41"/>
+      <w:sz w:val="40"/>
       <w:szCs w:val="32"/>
     </w:rPr>
   </w:style>
@@ -4776,15 +4764,16 @@
     <w:pPr>
       <w:keepNext/>
       <w:keepLines/>
-      <w:spacing w:after="80" w:before="200"/>
+      <w:spacing w:after="120" w:before="240"/>
+      <w:jc w:val="both"/>
       <w:outlineLvl w:val="1"/>
     </w:pPr>
     <w:rPr>
-      <w:rFonts w:ascii="Arial Narrow" w:asciiTheme="majorHAnsi" w:cs="Arial Narrow" w:cstheme="majorBidi" w:eastAsiaTheme="majorEastAsia" w:hAnsi="Arial Narrow" w:hAnsiTheme="majorHAnsi"/>
+      <w:rFonts w:ascii="Times New Roman" w:asciiTheme="majorHAnsi" w:cs="Times New Roman" w:cstheme="majorBidi" w:eastAsiaTheme="majorEastAsia" w:hAnsi="Times New Roman" w:hAnsiTheme="majorHAnsi"/>
       <w:b/>
       <w:bCs/>
-      <w:color w:val="000000"/>
-      <w:sz w:val="26"/>
+      <w:color w:val="024C41"/>
+      <w:sz w:val="32"/>
       <w:szCs w:val="28"/>
     </w:rPr>
   </w:style>
@@ -4798,15 +4787,16 @@
     <w:pPr>
       <w:keepNext/>
       <w:keepLines/>
-      <w:spacing w:after="80" w:before="200"/>
+      <w:spacing w:after="120" w:before="240"/>
+      <w:jc w:val="both"/>
       <w:outlineLvl w:val="2"/>
     </w:pPr>
     <w:rPr>
-      <w:rFonts w:ascii="Arial Narrow" w:asciiTheme="majorHAnsi" w:cs="Arial Narrow" w:cstheme="majorBidi" w:eastAsiaTheme="majorEastAsia" w:hAnsi="Arial Narrow" w:hAnsiTheme="majorHAnsi"/>
+      <w:rFonts w:ascii="Times New Roman" w:asciiTheme="majorHAnsi" w:cs="Times New Roman" w:cstheme="majorBidi" w:eastAsiaTheme="majorEastAsia" w:hAnsi="Times New Roman" w:hAnsiTheme="majorHAnsi"/>
       <w:b/>
       <w:bCs/>
-      <w:color w:val="000000"/>
-      <w:sz w:val="24"/>
+      <w:color w:val="024C41"/>
+      <w:sz w:val="26"/>
       <w:szCs w:val="24"/>
     </w:rPr>
   </w:style>

</xml_diff>

<commit_message>
Attività 7.10: .docx finale con testata/piè di pagina di progetto (stile RP 7.4)
- docs/assets/rp_format_reference.docx: reference di formato derivato dalla RP 7.4
  (corpo svuotato) che porta stili, impostazione di pagina e la grafica di progetto
  (intestazione con logo START; piè di pagina con banner www.start-innovability.it
  e numero di pagina).
- scripts/build_docx.py: usa tale reference come reference-doc di pandoc, così il
  documento finale eredita testata e piè di pagina; il corpo resta in Normal
  (Arial Narrow 11) come nelle RP finali; titoli Times New Roman verde (#024C41).
- docs/RP7.10_AI_Business_Model.docx rigenerato; README aggiornato.

Co-Authored-By: Claude Opus 4.8 <noreply@anthropic.com>
Claude-Session: https://claude.ai/code/session_015QT2JA1oFXsRPjgDL4ULzw
</commit_message>
<xml_diff>
--- a/docs/RP7.10_AI_Business_Model.docx
+++ b/docs/RP7.10_AI_Business_Model.docx
@@ -76,14 +76,14 @@
     <w:p>
       <w:pPr>
         <w:pBdr>
-          <w:bottom w:val="single" w:sz="6" w:space="1" w:color="000000"/>
+          <w:bottom w:val="single" w:sz="6" w:space="1" w:color="024C41"/>
         </w:pBdr>
         <w:spacing w:after="200"/>
       </w:pPr>
     </w:p>
     <w:p>
       <w:pPr>
-        <w:pStyle w:val="Heading2"/>
+        <w:pStyle w:val="Titolo2"/>
       </w:pPr>
       <w:r>
         <w:t xml:space="preserve">1. INTRODUZIONE</w:t>
@@ -92,7 +92,7 @@
     <w:bookmarkStart w:id="20" w:name="background"/>
     <w:p>
       <w:pPr>
-        <w:pStyle w:val="Heading3"/>
+        <w:pStyle w:val="Titolo3"/>
       </w:pPr>
       <w:r>
         <w:t xml:space="preserve">1.1 Background</w:t>
@@ -314,7 +314,7 @@
     <w:bookmarkStart w:id="21" w:name="Xa5b2ad20cc57e1d2111a580dd09802b180148e1"/>
     <w:p>
       <w:pPr>
-        <w:pStyle w:val="Heading3"/>
+        <w:pStyle w:val="Titolo3"/>
       </w:pPr>
       <w:r>
         <w:t xml:space="preserve">1.2 Il modello di business guidato dalla AI e la sua costruzione</w:t>
@@ -576,7 +576,7 @@
     <w:bookmarkStart w:id="22" w:name="baseline"/>
     <w:p>
       <w:pPr>
-        <w:pStyle w:val="Heading3"/>
+        <w:pStyle w:val="Titolo3"/>
       </w:pPr>
       <w:r>
         <w:t xml:space="preserve">1.3 Baseline</w:t>
@@ -662,7 +662,7 @@
     <w:bookmarkStart w:id="23" w:name="scopi-dellattività"/>
     <w:p>
       <w:pPr>
-        <w:pStyle w:val="Heading3"/>
+        <w:pStyle w:val="Titolo3"/>
       </w:pPr>
       <w:r>
         <w:t xml:space="preserve">1.4 Scopi dell’attività</w:t>
@@ -803,7 +803,7 @@
     <w:bookmarkStart w:id="33" w:name="metodologia"/>
     <w:p>
       <w:pPr>
-        <w:pStyle w:val="Heading2"/>
+        <w:pStyle w:val="Titolo2"/>
       </w:pPr>
       <w:r>
         <w:t xml:space="preserve">2. METODOLOGIA</w:t>
@@ -812,7 +812,7 @@
     <w:bookmarkStart w:id="28" w:name="dallevidenza-dei-collaudi-allai-bm"/>
     <w:p>
       <w:pPr>
-        <w:pStyle w:val="Heading3"/>
+        <w:pStyle w:val="Titolo3"/>
       </w:pPr>
       <w:r>
         <w:t xml:space="preserve">2.1 Dall’evidenza dei collaudi all’AI-BM</w:t>
@@ -1024,7 +1024,7 @@
     <w:bookmarkStart w:id="29" w:name="il-business-model-canvas-come-kpi"/>
     <w:p>
       <w:pPr>
-        <w:pStyle w:val="Heading3"/>
+        <w:pStyle w:val="Titolo3"/>
       </w:pPr>
       <w:r>
         <w:t xml:space="preserve">2.2 Il Business Model Canvas come KPI</w:t>
@@ -1116,7 +1116,7 @@
     <w:bookmarkStart w:id="30" w:name="limpianto-di-analisi-strategica"/>
     <w:p>
       <w:pPr>
-        <w:pStyle w:val="Heading3"/>
+        <w:pStyle w:val="Titolo3"/>
       </w:pPr>
       <w:r>
         <w:t xml:space="preserve">2.3 L’impianto di analisi strategica</w:t>
@@ -1341,7 +1341,7 @@
     <w:bookmarkStart w:id="31" w:name="X8a59671842ed881cb06b8fdc4dadaebe202d056"/>
     <w:p>
       <w:pPr>
-        <w:pStyle w:val="Heading3"/>
+        <w:pStyle w:val="Titolo3"/>
       </w:pPr>
       <w:r>
         <w:t xml:space="preserve">2.4 Trattamento del problema progettuale n. 10</w:t>
@@ -1388,7 +1388,7 @@
     <w:bookmarkStart w:id="32" w:name="riproducibilità"/>
     <w:p>
       <w:pPr>
-        <w:pStyle w:val="Heading3"/>
+        <w:pStyle w:val="Titolo3"/>
       </w:pPr>
       <w:r>
         <w:t xml:space="preserve">2.5 Riproducibilità</w:t>
@@ -1459,7 +1459,7 @@
     <w:bookmarkStart w:id="52" w:name="risultati"/>
     <w:p>
       <w:pPr>
-        <w:pStyle w:val="Heading2"/>
+        <w:pStyle w:val="Titolo2"/>
       </w:pPr>
       <w:r>
         <w:t xml:space="preserve">3. RISULTATI</w:t>
@@ -1468,7 +1468,7 @@
     <w:bookmarkStart w:id="37" w:name="il-business-model-canvas-dellai-bm-kpi"/>
     <w:p>
       <w:pPr>
-        <w:pStyle w:val="Heading3"/>
+        <w:pStyle w:val="Titolo3"/>
       </w:pPr>
       <w:r>
         <w:t xml:space="preserve">3.1 Il Business Model Canvas dell’AI-BM (KPI)</w:t>
@@ -2404,7 +2404,7 @@
     <w:bookmarkStart w:id="38" w:name="la-catena-dato-informazione-valore"/>
     <w:p>
       <w:pPr>
-        <w:pStyle w:val="Heading3"/>
+        <w:pStyle w:val="Titolo3"/>
       </w:pPr>
       <w:r>
         <w:t xml:space="preserve">3.2 La catena dato → informazione → valore</w:t>
@@ -2517,7 +2517,7 @@
     <w:bookmarkStart w:id="42" w:name="analisi-swot-dellai-bm"/>
     <w:p>
       <w:pPr>
-        <w:pStyle w:val="Heading3"/>
+        <w:pStyle w:val="Titolo3"/>
       </w:pPr>
       <w:r>
         <w:t xml:space="preserve">3.3 Analisi SWOT dell’AI-BM</w:t>
@@ -2690,7 +2690,7 @@
     <w:bookmarkStart w:id="46" w:name="Xaabcf5fa73b2790af27c63e484473f75223c06b"/>
     <w:p>
       <w:pPr>
-        <w:pStyle w:val="Heading3"/>
+        <w:pStyle w:val="Titolo3"/>
       </w:pPr>
       <w:r>
         <w:t xml:space="preserve">3.4 Il transition model e le tensioni sistemiche</w:t>
@@ -2876,7 +2876,7 @@
     <w:bookmarkStart w:id="50" w:name="quantificazione-economica-roiroa"/>
     <w:p>
       <w:pPr>
-        <w:pStyle w:val="Heading3"/>
+        <w:pStyle w:val="Titolo3"/>
       </w:pPr>
       <w:r>
         <w:t xml:space="preserve">3.5 Quantificazione economica (ROI/ROA)</w:t>
@@ -3390,7 +3390,7 @@
     <w:bookmarkStart w:id="51" w:name="esito"/>
     <w:p>
       <w:pPr>
-        <w:pStyle w:val="Heading3"/>
+        <w:pStyle w:val="Titolo3"/>
       </w:pPr>
       <w:r>
         <w:t xml:space="preserve">3.6 Esito</w:t>
@@ -3445,7 +3445,7 @@
     <w:bookmarkStart w:id="58" w:name="discussione-e-conclusioni"/>
     <w:p>
       <w:pPr>
-        <w:pStyle w:val="Heading2"/>
+        <w:pStyle w:val="Titolo2"/>
       </w:pPr>
       <w:r>
         <w:t xml:space="preserve">4. DISCUSSIONE E CONCLUSIONI</w:t>
@@ -3454,7 +3454,7 @@
     <w:bookmarkStart w:id="53" w:name="discussione-critica"/>
     <w:p>
       <w:pPr>
-        <w:pStyle w:val="Heading3"/>
+        <w:pStyle w:val="Titolo3"/>
       </w:pPr>
       <w:r>
         <w:t xml:space="preserve">4.1 Discussione critica</w:t>
@@ -3562,7 +3562,7 @@
     <w:bookmarkStart w:id="54" w:name="X4a558afea6c9bb5f5308c7d4bb42ee93283a2dc"/>
     <w:p>
       <w:pPr>
-        <w:pStyle w:val="Heading3"/>
+        <w:pStyle w:val="Titolo3"/>
       </w:pPr>
       <w:r>
         <w:t xml:space="preserve">4.2 Interdipendenze con altri OR e chiusura dell’OR 7</w:t>
@@ -3834,7 +3834,7 @@
     <w:bookmarkStart w:id="55" w:name="X76edcf1af8cd26072153b698b980e8b0ef68e1a"/>
     <w:p>
       <w:pPr>
-        <w:pStyle w:val="Heading3"/>
+        <w:pStyle w:val="Titolo3"/>
       </w:pPr>
       <w:r>
         <w:t xml:space="preserve">4.3 Implicazioni operative rispetto alle Finalità del progetto</w:t>
@@ -3868,7 +3868,7 @@
     <w:bookmarkStart w:id="56" w:name="limiti-e-sviluppi"/>
     <w:p>
       <w:pPr>
-        <w:pStyle w:val="Heading3"/>
+        <w:pStyle w:val="Titolo3"/>
       </w:pPr>
       <w:r>
         <w:t xml:space="preserve">4.4 Limiti e sviluppi</w:t>
@@ -3966,7 +3966,7 @@
     <w:bookmarkStart w:id="57" w:name="conclusioni"/>
     <w:p>
       <w:pPr>
-        <w:pStyle w:val="Heading3"/>
+        <w:pStyle w:val="Titolo3"/>
       </w:pPr>
       <w:r>
         <w:t xml:space="preserve">4.5 Conclusioni</w:t>
@@ -4034,7 +4034,7 @@
     <w:bookmarkStart w:id="59" w:name="appendice-a-riproducibilità"/>
     <w:p>
       <w:pPr>
-        <w:pStyle w:val="Heading2"/>
+        <w:pStyle w:val="Titolo2"/>
       </w:pPr>
       <w:r>
         <w:t xml:space="preserve">Appendice A — Riproducibilità</w:t>
@@ -4210,7 +4210,7 @@
     <w:bookmarkStart w:id="60" w:name="appendice-b-riferimenti"/>
     <w:p>
       <w:pPr>
-        <w:pStyle w:val="Heading2"/>
+        <w:pStyle w:val="Titolo2"/>
       </w:pPr>
       <w:r>
         <w:t xml:space="preserve">Appendice B — Riferimenti</w:t>
@@ -4358,8 +4358,15 @@
     </w:p>
     <w:bookmarkEnd w:id="60"/>
     <w:sectPr>
-      <w:pgSz w:h="16838" w:w="11906"/>
-      <w:pgMar w:bottom="1701" w:left="567" w:right="567" w:top="1701"/>
+      <w:headerReference r:id="rId10" w:type="default"/>
+      <w:footerReference r:id="rId12" w:type="default"/>
+      <w:headerReference r:id="rId9" w:type="first"/>
+      <w:footerReference r:id="rId11" w:type="first"/>
+      <w:pgSz w:code="9" w:h="16838" w:w="11906"/>
+      <w:pgMar w:bottom="1701" w:footer="567" w:gutter="0" w:header="567" w:left="567" w:right="567" w:top="1701"/>
+      <w:cols w:space="708"/>
+      <w:titlePg/>
+      <w:docGrid w:linePitch="360"/>
     </w:sectPr>
   </w:body>
 </w:document>
@@ -4369,6 +4376,220 @@
 <w:comments xmlns:w="http://schemas.openxmlformats.org/wordprocessingml/2006/main" xmlns:m="http://schemas.openxmlformats.org/officeDocument/2006/math" xmlns:r="http://schemas.openxmlformats.org/officeDocument/2006/relationships" xmlns:o="urn:schemas-microsoft-com:office:office" xmlns:v="urn:schemas-microsoft-com:vml" xmlns:w10="urn:schemas-microsoft-com:office:word" xmlns:a="http://schemas.openxmlformats.org/drawingml/2006/main" xmlns:pic="http://schemas.openxmlformats.org/drawingml/2006/picture" xmlns:wp="http://schemas.openxmlformats.org/drawingml/2006/wordprocessingDrawing"/>
 </file>
 
+<file path=word/footer1.xml><?xml version="1.0" encoding="utf-8"?>
+<w:ftr xmlns:wpc="http://schemas.microsoft.com/office/word/2010/wordprocessingCanvas" xmlns:cx="http://schemas.microsoft.com/office/drawing/2014/chartex" xmlns:cx1="http://schemas.microsoft.com/office/drawing/2015/9/8/chartex" xmlns:cx2="http://schemas.microsoft.com/office/drawing/2015/10/21/chartex" xmlns:cx3="http://schemas.microsoft.com/office/drawing/2016/5/9/chartex" xmlns:cx4="http://schemas.microsoft.com/office/drawing/2016/5/10/chartex" xmlns:cx5="http://schemas.microsoft.com/office/drawing/2016/5/11/chartex" xmlns:cx6="http://schemas.microsoft.com/office/drawing/2016/5/12/chartex" xmlns:cx7="http://schemas.microsoft.com/office/drawing/2016/5/13/chartex" xmlns:cx8="http://schemas.microsoft.com/office/drawing/2016/5/14/chartex" xmlns:mc="http://schemas.openxmlformats.org/markup-compatibility/2006" xmlns:aink="http://schemas.microsoft.com/office/drawing/2016/ink" xmlns:am3d="http://schemas.microsoft.com/office/drawing/2017/model3d" xmlns:o="urn:schemas-microsoft-com:office:office" xmlns:oel="http://schemas.microsoft.com/office/2019/extlst" xmlns:r="http://schemas.openxmlformats.org/officeDocument/2006/relationships" xmlns:m="http://schemas.openxmlformats.org/officeDocument/2006/math" xmlns:v="urn:schemas-microsoft-com:vml" xmlns:wp14="http://schemas.microsoft.com/office/word/2010/wordprocessingDrawing" xmlns:wp="http://schemas.openxmlformats.org/drawingml/2006/wordprocessingDrawing" xmlns:w10="urn:schemas-microsoft-com:office:word" xmlns:w="http://schemas.openxmlformats.org/wordprocessingml/2006/main" xmlns:w14="http://schemas.microsoft.com/office/word/2010/wordml" xmlns:w15="http://schemas.microsoft.com/office/word/2012/wordml" xmlns:w16cei="http://schemas.microsoft.com/office/word/2026/wordml/cei" xmlns:w16cex="http://schemas.microsoft.com/office/word/2018/wordml/cex" xmlns:w16cid="http://schemas.microsoft.com/office/word/2016/wordml/cid" xmlns:w16="http://schemas.microsoft.com/office/word/2018/wordml" xmlns:w16du="http://schemas.microsoft.com/office/word/2023/wordml/word16du" xmlns:w16sdtdh="http://schemas.microsoft.com/office/word/2020/wordml/sdtdatahash" xmlns:w16sdtfl="http://schemas.microsoft.com/office/word/2024/wordml/sdtformatlock" xmlns:w16se="http://schemas.microsoft.com/office/word/2015/wordml/symex" xmlns:wpg="http://schemas.microsoft.com/office/word/2010/wordprocessingGroup" xmlns:wpi="http://schemas.microsoft.com/office/word/2010/wordprocessingInk" xmlns:wne="http://schemas.microsoft.com/office/word/2006/wordml" xmlns:wps="http://schemas.microsoft.com/office/word/2010/wordprocessingShape" mc:Ignorable="w14 w15 w16se w16cid w16 w16cex w16sdtdh w16sdtfl w16du wp14">
+  <w:sdt>
+    <w:sdtPr>
+      <w:id w:val="-973605069"/>
+      <w:docPartObj>
+        <w:docPartGallery w:val="Page Numbers (Bottom of Page)"/>
+        <w:docPartUnique/>
+      </w:docPartObj>
+    </w:sdtPr>
+    <w:sdtContent>
+      <w:p>
+        <w:pPr>
+          <w:pStyle w:val="Pidipagina"/>
+          <w:jc w:val="center"/>
+        </w:pPr>
+        <w:r>
+          <w:fldChar w:fldCharType="begin"/>
+        </w:r>
+        <w:r>
+          <w:instrText>PAGE   \* MERGEFORMAT</w:instrText>
+        </w:r>
+        <w:r>
+          <w:fldChar w:fldCharType="separate"/>
+        </w:r>
+        <w:r>
+          <w:rPr>
+            <w:noProof/>
+          </w:rPr>
+          <w:t>2</w:t>
+        </w:r>
+        <w:r>
+          <w:fldChar w:fldCharType="end"/>
+        </w:r>
+      </w:p>
+    </w:sdtContent>
+  </w:sdt>
+  <w:p>
+    <w:pPr>
+      <w:pStyle w:val="Intestazione"/>
+      <w:spacing w:before="60" w:after="240"/>
+      <w:jc w:val="center"/>
+      <w:rPr>
+        <w:rFonts w:ascii="Arial" w:hAnsi="Arial" w:cs="Arial"/>
+        <w:b/>
+        <w:color w:val="FC4F02"/>
+        <w:szCs w:val="36"/>
+      </w:rPr>
+    </w:pPr>
+  </w:p>
+</w:ftr>
+</file>
+
+<file path=word/footer2.xml><?xml version="1.0" encoding="utf-8"?>
+<w:ftr xmlns:wpc="http://schemas.microsoft.com/office/word/2010/wordprocessingCanvas" xmlns:cx="http://schemas.microsoft.com/office/drawing/2014/chartex" xmlns:cx1="http://schemas.microsoft.com/office/drawing/2015/9/8/chartex" xmlns:cx2="http://schemas.microsoft.com/office/drawing/2015/10/21/chartex" xmlns:cx3="http://schemas.microsoft.com/office/drawing/2016/5/9/chartex" xmlns:cx4="http://schemas.microsoft.com/office/drawing/2016/5/10/chartex" xmlns:cx5="http://schemas.microsoft.com/office/drawing/2016/5/11/chartex" xmlns:cx6="http://schemas.microsoft.com/office/drawing/2016/5/12/chartex" xmlns:cx7="http://schemas.microsoft.com/office/drawing/2016/5/13/chartex" xmlns:cx8="http://schemas.microsoft.com/office/drawing/2016/5/14/chartex" xmlns:mc="http://schemas.openxmlformats.org/markup-compatibility/2006" xmlns:aink="http://schemas.microsoft.com/office/drawing/2016/ink" xmlns:am3d="http://schemas.microsoft.com/office/drawing/2017/model3d" xmlns:o="urn:schemas-microsoft-com:office:office" xmlns:oel="http://schemas.microsoft.com/office/2019/extlst" xmlns:r="http://schemas.openxmlformats.org/officeDocument/2006/relationships" xmlns:m="http://schemas.openxmlformats.org/officeDocument/2006/math" xmlns:v="urn:schemas-microsoft-com:vml" xmlns:wp14="http://schemas.microsoft.com/office/word/2010/wordprocessingDrawing" xmlns:wp="http://schemas.openxmlformats.org/drawingml/2006/wordprocessingDrawing" xmlns:w10="urn:schemas-microsoft-com:office:word" xmlns:w="http://schemas.openxmlformats.org/wordprocessingml/2006/main" xmlns:w14="http://schemas.microsoft.com/office/word/2010/wordml" xmlns:w15="http://schemas.microsoft.com/office/word/2012/wordml" xmlns:w16cei="http://schemas.microsoft.com/office/word/2026/wordml/cei" xmlns:w16cex="http://schemas.microsoft.com/office/word/2018/wordml/cex" xmlns:w16cid="http://schemas.microsoft.com/office/word/2016/wordml/cid" xmlns:w16="http://schemas.microsoft.com/office/word/2018/wordml" xmlns:w16du="http://schemas.microsoft.com/office/word/2023/wordml/word16du" xmlns:w16sdtdh="http://schemas.microsoft.com/office/word/2020/wordml/sdtdatahash" xmlns:w16sdtfl="http://schemas.microsoft.com/office/word/2024/wordml/sdtformatlock" xmlns:w16se="http://schemas.microsoft.com/office/word/2015/wordml/symex" xmlns:wpg="http://schemas.microsoft.com/office/word/2010/wordprocessingGroup" xmlns:wpi="http://schemas.microsoft.com/office/word/2010/wordprocessingInk" xmlns:wne="http://schemas.microsoft.com/office/word/2006/wordml" xmlns:wps="http://schemas.microsoft.com/office/word/2010/wordprocessingShape" mc:Ignorable="w14 w15 w16se w16cid w16 w16cex w16sdtdh w16sdtfl w16du wp14">
+  <w:p>
+    <w:pPr>
+      <w:pStyle w:val="Intestazione"/>
+      <w:pBdr>
+        <w:bottom w:val="single" w:sz="18" w:space="1" w:color="024C41"/>
+      </w:pBdr>
+      <w:spacing w:before="60" w:after="240"/>
+      <w:rPr>
+        <w:rFonts w:asciiTheme="minorHAnsi" w:hAnsiTheme="minorHAnsi" w:cstheme="minorHAnsi"/>
+        <w:color w:val="00A98E"/>
+        <w:sz w:val="28"/>
+        <w:szCs w:val="36"/>
+      </w:rPr>
+    </w:pPr>
+  </w:p>
+  <w:p>
+    <w:pPr>
+      <w:pStyle w:val="Intestazione"/>
+      <w:spacing w:before="60" w:after="240"/>
+      <w:jc w:val="center"/>
+      <w:rPr>
+        <w:rFonts w:asciiTheme="minorHAnsi" w:hAnsiTheme="minorHAnsi" w:cstheme="minorHAnsi"/>
+        <w:color w:val="00A98E"/>
+        <w:sz w:val="28"/>
+        <w:szCs w:val="36"/>
+      </w:rPr>
+    </w:pPr>
+    <w:r>
+      <w:rPr>
+        <w:rFonts w:asciiTheme="minorHAnsi" w:hAnsiTheme="minorHAnsi" w:cstheme="minorHAnsi"/>
+        <w:noProof/>
+        <w:color w:val="00A98E"/>
+        <w:sz w:val="28"/>
+        <w:szCs w:val="36"/>
+      </w:rPr>
+      <w:drawing>
+        <wp:inline distT="0" distB="0" distL="0" distR="0" wp14:anchorId="74F50D69" wp14:editId="74F50D6A">
+          <wp:extent cx="6840220" cy="584835"/>
+          <wp:effectExtent l="0" t="0" r="0" b="5715"/>
+          <wp:docPr id="1401487893" name="Immagine 26">
+            <a:extLst xmlns:a="http://schemas.openxmlformats.org/drawingml/2006/main">
+              <a:ext uri="{FF2B5EF4-FFF2-40B4-BE49-F238E27FC236}">
+                <a16:creationId xmlns:a16="http://schemas.microsoft.com/office/drawing/2014/main" id="{534DBD57-FA8C-4557-94E5-9E23A699C807}"/>
+              </a:ext>
+            </a:extLst>
+          </wp:docPr>
+          <wp:cNvGraphicFramePr>
+            <a:graphicFrameLocks xmlns:a="http://schemas.openxmlformats.org/drawingml/2006/main" noChangeAspect="1"/>
+          </wp:cNvGraphicFramePr>
+          <a:graphic xmlns:a="http://schemas.openxmlformats.org/drawingml/2006/main">
+            <a:graphicData uri="http://schemas.openxmlformats.org/drawingml/2006/picture">
+              <pic:pic xmlns:pic="http://schemas.openxmlformats.org/drawingml/2006/picture">
+                <pic:nvPicPr>
+                  <pic:cNvPr id="27" name="Immagine 26">
+                    <a:extLst>
+                      <a:ext uri="{FF2B5EF4-FFF2-40B4-BE49-F238E27FC236}">
+                        <a16:creationId xmlns:a16="http://schemas.microsoft.com/office/drawing/2014/main" id="{534DBD57-FA8C-4557-94E5-9E23A699C807}"/>
+                      </a:ext>
+                    </a:extLst>
+                  </pic:cNvPr>
+                  <pic:cNvPicPr>
+                    <a:picLocks noChangeAspect="1"/>
+                  </pic:cNvPicPr>
+                </pic:nvPicPr>
+                <pic:blipFill>
+                  <a:blip r:embed="rId1"/>
+                  <a:stretch>
+                    <a:fillRect/>
+                  </a:stretch>
+                </pic:blipFill>
+                <pic:spPr>
+                  <a:xfrm>
+                    <a:off x="0" y="0"/>
+                    <a:ext cx="6840220" cy="584835"/>
+                  </a:xfrm>
+                  <a:prstGeom prst="rect">
+                    <a:avLst/>
+                  </a:prstGeom>
+                </pic:spPr>
+              </pic:pic>
+            </a:graphicData>
+          </a:graphic>
+        </wp:inline>
+      </w:drawing>
+    </w:r>
+  </w:p>
+  <w:p>
+    <w:pPr>
+      <w:pStyle w:val="Intestazione"/>
+      <w:spacing w:before="60" w:after="240"/>
+      <w:jc w:val="center"/>
+      <w:rPr>
+        <w:rFonts w:asciiTheme="minorHAnsi" w:hAnsiTheme="minorHAnsi" w:cstheme="minorHAnsi"/>
+        <w:b/>
+        <w:bCs/>
+        <w:color w:val="00A98E"/>
+        <w:sz w:val="28"/>
+        <w:szCs w:val="36"/>
+      </w:rPr>
+    </w:pPr>
+    <w:r>
+      <w:rPr>
+        <w:rFonts w:asciiTheme="minorHAnsi" w:hAnsiTheme="minorHAnsi" w:cstheme="minorHAnsi"/>
+        <w:b/>
+        <w:bCs/>
+        <w:color w:val="00A98E"/>
+        <w:sz w:val="28"/>
+        <w:szCs w:val="36"/>
+      </w:rPr>
+      <w:t>www.</w:t>
+    </w:r>
+    <w:r>
+      <w:rPr>
+        <w:rFonts w:asciiTheme="minorHAnsi" w:hAnsiTheme="minorHAnsi" w:cstheme="minorHAnsi"/>
+        <w:b/>
+        <w:bCs/>
+        <w:color w:val="00A98E"/>
+        <w:sz w:val="28"/>
+        <w:szCs w:val="36"/>
+      </w:rPr>
+      <w:t>start</w:t>
+    </w:r>
+    <w:r>
+      <w:rPr>
+        <w:rFonts w:asciiTheme="minorHAnsi" w:hAnsiTheme="minorHAnsi" w:cstheme="minorHAnsi"/>
+        <w:b/>
+        <w:bCs/>
+        <w:color w:val="00A98E"/>
+        <w:sz w:val="28"/>
+        <w:szCs w:val="36"/>
+      </w:rPr>
+      <w:t>-innovability</w:t>
+    </w:r>
+    <w:r>
+      <w:rPr>
+        <w:rFonts w:asciiTheme="minorHAnsi" w:hAnsiTheme="minorHAnsi" w:cstheme="minorHAnsi"/>
+        <w:b/>
+        <w:bCs/>
+        <w:color w:val="00A98E"/>
+        <w:sz w:val="28"/>
+        <w:szCs w:val="36"/>
+      </w:rPr>
+      <w:t>.</w:t>
+    </w:r>
+    <w:r>
+      <w:rPr>
+        <w:rFonts w:asciiTheme="minorHAnsi" w:hAnsiTheme="minorHAnsi" w:cstheme="minorHAnsi"/>
+        <w:b/>
+        <w:bCs/>
+        <w:color w:val="00A98E"/>
+        <w:sz w:val="28"/>
+        <w:szCs w:val="36"/>
+      </w:rPr>
+      <w:t>it</w:t>
+    </w:r>
+  </w:p>
+</w:ftr>
+</file>
+
 <file path=word/footnotes.xml><?xml version="1.0" encoding="utf-8"?>
 <w:footnotes xmlns:w="http://schemas.openxmlformats.org/wordprocessingml/2006/main" xmlns:m="http://schemas.openxmlformats.org/officeDocument/2006/math" xmlns:r="http://schemas.openxmlformats.org/officeDocument/2006/relationships" xmlns:o="urn:schemas-microsoft-com:office:office" xmlns:v="urn:schemas-microsoft-com:vml" xmlns:w10="urn:schemas-microsoft-com:office:word" xmlns:a="http://schemas.openxmlformats.org/drawingml/2006/main" xmlns:pic="http://schemas.openxmlformats.org/drawingml/2006/picture" xmlns:wp="http://schemas.openxmlformats.org/drawingml/2006/wordprocessingDrawing">
   <w:footnote w:type="continuationSeparator" w:id="0">
@@ -4388,8 +4609,1466 @@
 </w:footnotes>
 </file>
 
+<file path=word/header1.xml><?xml version="1.0" encoding="utf-8"?>
+<w:hdr xmlns:wpc="http://schemas.microsoft.com/office/word/2010/wordprocessingCanvas" xmlns:cx="http://schemas.microsoft.com/office/drawing/2014/chartex" xmlns:cx1="http://schemas.microsoft.com/office/drawing/2015/9/8/chartex" xmlns:cx2="http://schemas.microsoft.com/office/drawing/2015/10/21/chartex" xmlns:cx3="http://schemas.microsoft.com/office/drawing/2016/5/9/chartex" xmlns:cx4="http://schemas.microsoft.com/office/drawing/2016/5/10/chartex" xmlns:cx5="http://schemas.microsoft.com/office/drawing/2016/5/11/chartex" xmlns:cx6="http://schemas.microsoft.com/office/drawing/2016/5/12/chartex" xmlns:cx7="http://schemas.microsoft.com/office/drawing/2016/5/13/chartex" xmlns:cx8="http://schemas.microsoft.com/office/drawing/2016/5/14/chartex" xmlns:mc="http://schemas.openxmlformats.org/markup-compatibility/2006" xmlns:aink="http://schemas.microsoft.com/office/drawing/2016/ink" xmlns:am3d="http://schemas.microsoft.com/office/drawing/2017/model3d" xmlns:o="urn:schemas-microsoft-com:office:office" xmlns:oel="http://schemas.microsoft.com/office/2019/extlst" xmlns:r="http://schemas.openxmlformats.org/officeDocument/2006/relationships" xmlns:m="http://schemas.openxmlformats.org/officeDocument/2006/math" xmlns:v="urn:schemas-microsoft-com:vml" xmlns:wp14="http://schemas.microsoft.com/office/word/2010/wordprocessingDrawing" xmlns:wp="http://schemas.openxmlformats.org/drawingml/2006/wordprocessingDrawing" xmlns:w10="urn:schemas-microsoft-com:office:word" xmlns:w="http://schemas.openxmlformats.org/wordprocessingml/2006/main" xmlns:w14="http://schemas.microsoft.com/office/word/2010/wordml" xmlns:w15="http://schemas.microsoft.com/office/word/2012/wordml" xmlns:w16cei="http://schemas.microsoft.com/office/word/2026/wordml/cei" xmlns:w16cex="http://schemas.microsoft.com/office/word/2018/wordml/cex" xmlns:w16cid="http://schemas.microsoft.com/office/word/2016/wordml/cid" xmlns:w16="http://schemas.microsoft.com/office/word/2018/wordml" xmlns:w16du="http://schemas.microsoft.com/office/word/2023/wordml/word16du" xmlns:w16sdtdh="http://schemas.microsoft.com/office/word/2020/wordml/sdtdatahash" xmlns:w16sdtfl="http://schemas.microsoft.com/office/word/2024/wordml/sdtformatlock" xmlns:w16se="http://schemas.microsoft.com/office/word/2015/wordml/symex" xmlns:wpg="http://schemas.microsoft.com/office/word/2010/wordprocessingGroup" xmlns:wpi="http://schemas.microsoft.com/office/word/2010/wordprocessingInk" xmlns:wne="http://schemas.microsoft.com/office/word/2006/wordml" xmlns:wps="http://schemas.microsoft.com/office/word/2010/wordprocessingShape" mc:Ignorable="w14 w15 w16se w16cid w16 w16cex w16sdtdh w16sdtfl w16du wp14">
+  <w:tbl>
+    <w:tblPr>
+      <w:tblStyle w:val="Grigliatabella"/>
+      <w:tblW w:w="10762" w:type="dxa"/>
+      <w:tblInd w:w="-108" w:type="dxa"/>
+      <w:tblBorders>
+        <w:top w:val="single" w:sz="18" w:space="0" w:color="024C41"/>
+        <w:left w:val="none" w:sz="0" w:space="0" w:color="auto"/>
+        <w:bottom w:val="single" w:sz="18" w:space="0" w:color="024C41"/>
+        <w:right w:val="none" w:sz="0" w:space="0" w:color="auto"/>
+        <w:insideH w:val="none" w:sz="0" w:space="0" w:color="auto"/>
+        <w:insideV w:val="none" w:sz="0" w:space="0" w:color="auto"/>
+      </w:tblBorders>
+      <w:tblLook w:val="04A0" w:firstRow="1" w:lastRow="0" w:firstColumn="1" w:lastColumn="0" w:noHBand="0" w:noVBand="1"/>
+    </w:tblPr>
+    <w:tblGrid>
+      <w:gridCol w:w="4542"/>
+      <w:gridCol w:w="6220"/>
+    </w:tblGrid>
+    <w:tr>
+      <w:tc>
+        <w:tcPr>
+          <w:tcW w:w="4542" w:type="dxa"/>
+        </w:tcPr>
+        <w:p>
+          <w:pPr>
+            <w:rPr>
+              <w:sz w:val="10"/>
+              <w:szCs w:val="10"/>
+            </w:rPr>
+          </w:pPr>
+        </w:p>
+        <w:p>
+          <w:r>
+            <w:rPr>
+              <w:noProof/>
+            </w:rPr>
+            <w:drawing>
+              <wp:inline distT="0" distB="0" distL="0" distR="0" wp14:anchorId="74F50D65" wp14:editId="74F50D66">
+                <wp:extent cx="2047875" cy="1134548"/>
+                <wp:effectExtent l="0" t="0" r="0" b="8890"/>
+                <wp:docPr id="526394239" name="Immagine 526394239"/>
+                <wp:cNvGraphicFramePr>
+                  <a:graphicFrameLocks xmlns:a="http://schemas.openxmlformats.org/drawingml/2006/main" noChangeAspect="1"/>
+                </wp:cNvGraphicFramePr>
+                <a:graphic xmlns:a="http://schemas.openxmlformats.org/drawingml/2006/main">
+                  <a:graphicData uri="http://schemas.openxmlformats.org/drawingml/2006/picture">
+                    <pic:pic xmlns:pic="http://schemas.openxmlformats.org/drawingml/2006/picture">
+                      <pic:nvPicPr>
+                        <pic:cNvPr id="88862020" name=""/>
+                        <pic:cNvPicPr/>
+                      </pic:nvPicPr>
+                      <pic:blipFill>
+                        <a:blip r:embed="rId1"/>
+                        <a:stretch>
+                          <a:fillRect/>
+                        </a:stretch>
+                      </pic:blipFill>
+                      <pic:spPr>
+                        <a:xfrm>
+                          <a:off x="0" y="0"/>
+                          <a:ext cx="2058155" cy="1140243"/>
+                        </a:xfrm>
+                        <a:prstGeom prst="rect">
+                          <a:avLst/>
+                        </a:prstGeom>
+                      </pic:spPr>
+                    </pic:pic>
+                  </a:graphicData>
+                </a:graphic>
+              </wp:inline>
+            </w:drawing>
+          </w:r>
+        </w:p>
+        <w:p>
+          <w:pPr>
+            <w:rPr>
+              <w:sz w:val="10"/>
+              <w:szCs w:val="10"/>
+            </w:rPr>
+          </w:pPr>
+        </w:p>
+      </w:tc>
+      <w:tc>
+        <w:tcPr>
+          <w:tcW w:w="6220" w:type="dxa"/>
+        </w:tcPr>
+        <w:p>
+          <w:pPr>
+            <w:jc w:val="center"/>
+            <w:rPr>
+              <w:rFonts w:asciiTheme="minorHAnsi" w:hAnsiTheme="minorHAnsi" w:cstheme="minorHAnsi"/>
+              <w:b/>
+              <w:color w:val="595959"/>
+              <w:szCs w:val="24"/>
+              <w:lang w:val="en-US"/>
+            </w:rPr>
+          </w:pPr>
+        </w:p>
+        <w:p>
+          <w:pPr>
+            <w:jc w:val="center"/>
+            <w:rPr>
+              <w:rFonts w:asciiTheme="minorHAnsi" w:hAnsiTheme="minorHAnsi" w:cstheme="minorHAnsi"/>
+              <w:b/>
+              <w:color w:val="024C41"/>
+              <w:sz w:val="32"/>
+              <w:szCs w:val="36"/>
+              <w:lang w:val="en-US"/>
+            </w:rPr>
+          </w:pPr>
+          <w:proofErr w:type="spellStart"/>
+          <w:r>
+            <w:rPr>
+              <w:rFonts w:asciiTheme="minorHAnsi" w:hAnsiTheme="minorHAnsi" w:cstheme="minorHAnsi"/>
+              <w:b/>
+              <w:color w:val="024C41"/>
+              <w:sz w:val="32"/>
+              <w:szCs w:val="36"/>
+              <w:lang w:val="en-US"/>
+            </w:rPr>
+            <w:t>SusTainable</w:t>
+          </w:r>
+          <w:proofErr w:type="spellEnd"/>
+          <w:r>
+            <w:rPr>
+              <w:rFonts w:asciiTheme="minorHAnsi" w:hAnsiTheme="minorHAnsi" w:cstheme="minorHAnsi"/>
+              <w:b/>
+              <w:color w:val="024C41"/>
+              <w:sz w:val="32"/>
+              <w:szCs w:val="36"/>
+              <w:lang w:val="en-US"/>
+            </w:rPr>
+            <w:t xml:space="preserve"> </w:t>
+          </w:r>
+          <w:proofErr w:type="spellStart"/>
+          <w:r>
+            <w:rPr>
+              <w:rFonts w:asciiTheme="minorHAnsi" w:hAnsiTheme="minorHAnsi" w:cstheme="minorHAnsi"/>
+              <w:b/>
+              <w:color w:val="024C41"/>
+              <w:sz w:val="32"/>
+              <w:szCs w:val="36"/>
+              <w:lang w:val="en-US"/>
+            </w:rPr>
+            <w:t>dAta-dRiven</w:t>
+          </w:r>
+          <w:proofErr w:type="spellEnd"/>
+          <w:r>
+            <w:rPr>
+              <w:rFonts w:asciiTheme="minorHAnsi" w:hAnsiTheme="minorHAnsi" w:cstheme="minorHAnsi"/>
+              <w:b/>
+              <w:color w:val="024C41"/>
+              <w:sz w:val="32"/>
+              <w:szCs w:val="36"/>
+              <w:lang w:val="en-US"/>
+            </w:rPr>
+            <w:t xml:space="preserve"> </w:t>
+          </w:r>
+          <w:proofErr w:type="spellStart"/>
+          <w:r>
+            <w:rPr>
+              <w:rFonts w:asciiTheme="minorHAnsi" w:hAnsiTheme="minorHAnsi" w:cstheme="minorHAnsi"/>
+              <w:b/>
+              <w:color w:val="024C41"/>
+              <w:sz w:val="32"/>
+              <w:szCs w:val="36"/>
+              <w:lang w:val="en-US"/>
+            </w:rPr>
+            <w:t>manufacTuring</w:t>
+          </w:r>
+          <w:proofErr w:type="spellEnd"/>
+        </w:p>
+        <w:p>
+          <w:pPr>
+            <w:jc w:val="center"/>
+            <w:rPr>
+              <w:rFonts w:asciiTheme="minorHAnsi" w:hAnsiTheme="minorHAnsi" w:cstheme="minorHAnsi"/>
+              <w:b/>
+              <w:color w:val="525252" w:themeColor="accent3" w:themeShade="80"/>
+              <w:sz w:val="16"/>
+              <w:szCs w:val="20"/>
+              <w:lang w:val="en-US"/>
+            </w:rPr>
+          </w:pPr>
+        </w:p>
+        <w:p>
+          <w:pPr>
+            <w:jc w:val="center"/>
+            <w:rPr>
+              <w:rFonts w:asciiTheme="minorHAnsi" w:hAnsiTheme="minorHAnsi" w:cstheme="minorHAnsi"/>
+              <w:b/>
+              <w:color w:val="00A98E"/>
+              <w:sz w:val="24"/>
+              <w:szCs w:val="32"/>
+            </w:rPr>
+          </w:pPr>
+          <w:r>
+            <w:rPr>
+              <w:rFonts w:asciiTheme="minorHAnsi" w:hAnsiTheme="minorHAnsi" w:cstheme="minorHAnsi"/>
+              <w:b/>
+              <w:color w:val="00A98E"/>
+              <w:sz w:val="24"/>
+              <w:szCs w:val="32"/>
+            </w:rPr>
+            <w:t>Accordo Innovazione DM 31/12/2021</w:t>
+          </w:r>
+        </w:p>
+        <w:p>
+          <w:pPr>
+            <w:jc w:val="center"/>
+            <w:rPr>
+              <w:rFonts w:asciiTheme="minorHAnsi" w:hAnsiTheme="minorHAnsi" w:cstheme="minorHAnsi"/>
+              <w:b/>
+              <w:color w:val="595959"/>
+              <w:szCs w:val="24"/>
+            </w:rPr>
+          </w:pPr>
+          <w:r>
+            <w:rPr>
+              <w:rFonts w:asciiTheme="minorHAnsi" w:hAnsiTheme="minorHAnsi" w:cstheme="minorHAnsi"/>
+              <w:b/>
+              <w:color w:val="00A98E"/>
+              <w:sz w:val="24"/>
+              <w:szCs w:val="32"/>
+            </w:rPr>
+            <w:t xml:space="preserve">Prog. n. </w:t>
+          </w:r>
+          <w:r>
+            <w:rPr>
+              <w:rFonts w:asciiTheme="minorHAnsi" w:hAnsiTheme="minorHAnsi" w:cstheme="minorHAnsi"/>
+              <w:b/>
+              <w:color w:val="00A98E"/>
+              <w:sz w:val="24"/>
+              <w:szCs w:val="32"/>
+            </w:rPr>
+            <w:t>F/310087/01-05/X56</w:t>
+          </w:r>
+          <w:r>
+            <w:rPr>
+              <w:rFonts w:asciiTheme="minorHAnsi" w:hAnsiTheme="minorHAnsi" w:cstheme="minorHAnsi"/>
+              <w:b/>
+              <w:color w:val="595959"/>
+              <w:sz w:val="24"/>
+              <w:szCs w:val="32"/>
+            </w:rPr>
+            <w:t xml:space="preserve"> </w:t>
+          </w:r>
+        </w:p>
+      </w:tc>
+    </w:tr>
+  </w:tbl>
+  <w:p>
+    <w:pPr>
+      <w:pStyle w:val="Intestazione"/>
+    </w:pPr>
+  </w:p>
+</w:hdr>
+</file>
+
+<file path=word/header2.xml><?xml version="1.0" encoding="utf-8"?>
+<w:hdr xmlns:wpc="http://schemas.microsoft.com/office/word/2010/wordprocessingCanvas" xmlns:cx="http://schemas.microsoft.com/office/drawing/2014/chartex" xmlns:cx1="http://schemas.microsoft.com/office/drawing/2015/9/8/chartex" xmlns:cx2="http://schemas.microsoft.com/office/drawing/2015/10/21/chartex" xmlns:cx3="http://schemas.microsoft.com/office/drawing/2016/5/9/chartex" xmlns:cx4="http://schemas.microsoft.com/office/drawing/2016/5/10/chartex" xmlns:cx5="http://schemas.microsoft.com/office/drawing/2016/5/11/chartex" xmlns:cx6="http://schemas.microsoft.com/office/drawing/2016/5/12/chartex" xmlns:cx7="http://schemas.microsoft.com/office/drawing/2016/5/13/chartex" xmlns:cx8="http://schemas.microsoft.com/office/drawing/2016/5/14/chartex" xmlns:mc="http://schemas.openxmlformats.org/markup-compatibility/2006" xmlns:aink="http://schemas.microsoft.com/office/drawing/2016/ink" xmlns:am3d="http://schemas.microsoft.com/office/drawing/2017/model3d" xmlns:o="urn:schemas-microsoft-com:office:office" xmlns:oel="http://schemas.microsoft.com/office/2019/extlst" xmlns:r="http://schemas.openxmlformats.org/officeDocument/2006/relationships" xmlns:m="http://schemas.openxmlformats.org/officeDocument/2006/math" xmlns:v="urn:schemas-microsoft-com:vml" xmlns:wp14="http://schemas.microsoft.com/office/word/2010/wordprocessingDrawing" xmlns:wp="http://schemas.openxmlformats.org/drawingml/2006/wordprocessingDrawing" xmlns:w10="urn:schemas-microsoft-com:office:word" xmlns:w="http://schemas.openxmlformats.org/wordprocessingml/2006/main" xmlns:w14="http://schemas.microsoft.com/office/word/2010/wordml" xmlns:w15="http://schemas.microsoft.com/office/word/2012/wordml" xmlns:w16cei="http://schemas.microsoft.com/office/word/2026/wordml/cei" xmlns:w16cex="http://schemas.microsoft.com/office/word/2018/wordml/cex" xmlns:w16cid="http://schemas.microsoft.com/office/word/2016/wordml/cid" xmlns:w16="http://schemas.microsoft.com/office/word/2018/wordml" xmlns:w16du="http://schemas.microsoft.com/office/word/2023/wordml/word16du" xmlns:w16sdtdh="http://schemas.microsoft.com/office/word/2020/wordml/sdtdatahash" xmlns:w16sdtfl="http://schemas.microsoft.com/office/word/2024/wordml/sdtformatlock" xmlns:w16se="http://schemas.microsoft.com/office/word/2015/wordml/symex" xmlns:wpg="http://schemas.microsoft.com/office/word/2010/wordprocessingGroup" xmlns:wpi="http://schemas.microsoft.com/office/word/2010/wordprocessingInk" xmlns:wne="http://schemas.microsoft.com/office/word/2006/wordml" xmlns:wps="http://schemas.microsoft.com/office/word/2010/wordprocessingShape" mc:Ignorable="w14 w15 w16se w16cid w16 w16cex w16sdtdh w16sdtfl w16du wp14">
+  <w:tbl>
+    <w:tblPr>
+      <w:tblStyle w:val="Grigliatabella"/>
+      <w:tblW w:w="0" w:type="auto"/>
+      <w:tblBorders>
+        <w:top w:val="single" w:sz="18" w:space="0" w:color="024C41"/>
+        <w:left w:val="none" w:sz="0" w:space="0" w:color="auto"/>
+        <w:bottom w:val="single" w:sz="18" w:space="0" w:color="024C41"/>
+        <w:right w:val="none" w:sz="0" w:space="0" w:color="auto"/>
+        <w:insideH w:val="none" w:sz="0" w:space="0" w:color="auto"/>
+        <w:insideV w:val="none" w:sz="0" w:space="0" w:color="auto"/>
+      </w:tblBorders>
+      <w:tblLook w:val="04A0" w:firstRow="1" w:lastRow="0" w:firstColumn="1" w:lastColumn="0" w:noHBand="0" w:noVBand="1"/>
+    </w:tblPr>
+    <w:tblGrid>
+      <w:gridCol w:w="4542"/>
+      <w:gridCol w:w="6220"/>
+    </w:tblGrid>
+    <w:tr>
+      <w:tc>
+        <w:tcPr>
+          <w:tcW w:w="4542" w:type="dxa"/>
+        </w:tcPr>
+        <w:p>
+          <w:pPr>
+            <w:rPr>
+              <w:sz w:val="10"/>
+              <w:szCs w:val="10"/>
+            </w:rPr>
+          </w:pPr>
+        </w:p>
+        <w:p>
+          <w:r>
+            <w:rPr>
+              <w:noProof/>
+            </w:rPr>
+            <w:drawing>
+              <wp:inline distT="0" distB="0" distL="0" distR="0" wp14:anchorId="74F50D67" wp14:editId="74F50D68">
+                <wp:extent cx="2047875" cy="1134548"/>
+                <wp:effectExtent l="0" t="0" r="0" b="8890"/>
+                <wp:docPr id="88862020" name="Immagine 1"/>
+                <wp:cNvGraphicFramePr>
+                  <a:graphicFrameLocks xmlns:a="http://schemas.openxmlformats.org/drawingml/2006/main" noChangeAspect="1"/>
+                </wp:cNvGraphicFramePr>
+                <a:graphic xmlns:a="http://schemas.openxmlformats.org/drawingml/2006/main">
+                  <a:graphicData uri="http://schemas.openxmlformats.org/drawingml/2006/picture">
+                    <pic:pic xmlns:pic="http://schemas.openxmlformats.org/drawingml/2006/picture">
+                      <pic:nvPicPr>
+                        <pic:cNvPr id="88862020" name=""/>
+                        <pic:cNvPicPr/>
+                      </pic:nvPicPr>
+                      <pic:blipFill>
+                        <a:blip r:embed="rId1"/>
+                        <a:stretch>
+                          <a:fillRect/>
+                        </a:stretch>
+                      </pic:blipFill>
+                      <pic:spPr>
+                        <a:xfrm>
+                          <a:off x="0" y="0"/>
+                          <a:ext cx="2058155" cy="1140243"/>
+                        </a:xfrm>
+                        <a:prstGeom prst="rect">
+                          <a:avLst/>
+                        </a:prstGeom>
+                      </pic:spPr>
+                    </pic:pic>
+                  </a:graphicData>
+                </a:graphic>
+              </wp:inline>
+            </w:drawing>
+          </w:r>
+        </w:p>
+        <w:p>
+          <w:pPr>
+            <w:rPr>
+              <w:sz w:val="10"/>
+              <w:szCs w:val="10"/>
+            </w:rPr>
+          </w:pPr>
+        </w:p>
+      </w:tc>
+      <w:tc>
+        <w:tcPr>
+          <w:tcW w:w="6220" w:type="dxa"/>
+        </w:tcPr>
+        <w:p>
+          <w:pPr>
+            <w:jc w:val="center"/>
+            <w:rPr>
+              <w:rFonts w:asciiTheme="minorHAnsi" w:hAnsiTheme="minorHAnsi" w:cstheme="minorHAnsi"/>
+              <w:color w:val="525252" w:themeColor="accent3" w:themeShade="80"/>
+              <w:sz w:val="28"/>
+              <w:szCs w:val="24"/>
+            </w:rPr>
+          </w:pPr>
+        </w:p>
+        <w:p>
+          <w:pPr>
+            <w:jc w:val="center"/>
+            <w:rPr>
+              <w:rFonts w:asciiTheme="minorHAnsi" w:hAnsiTheme="minorHAnsi" w:cstheme="minorHAnsi"/>
+              <w:b/>
+              <w:color w:val="024C41"/>
+              <w:sz w:val="32"/>
+              <w:szCs w:val="36"/>
+              <w:lang w:val="en-US"/>
+            </w:rPr>
+          </w:pPr>
+          <w:proofErr w:type="spellStart"/>
+          <w:r>
+            <w:rPr>
+              <w:rFonts w:asciiTheme="minorHAnsi" w:hAnsiTheme="minorHAnsi" w:cstheme="minorHAnsi"/>
+              <w:b/>
+              <w:color w:val="024C41"/>
+              <w:sz w:val="32"/>
+              <w:szCs w:val="36"/>
+              <w:lang w:val="en-US"/>
+            </w:rPr>
+            <w:t>SusTainable</w:t>
+          </w:r>
+          <w:proofErr w:type="spellEnd"/>
+          <w:r>
+            <w:rPr>
+              <w:rFonts w:asciiTheme="minorHAnsi" w:hAnsiTheme="minorHAnsi" w:cstheme="minorHAnsi"/>
+              <w:b/>
+              <w:color w:val="024C41"/>
+              <w:sz w:val="32"/>
+              <w:szCs w:val="36"/>
+              <w:lang w:val="en-US"/>
+            </w:rPr>
+            <w:t xml:space="preserve"> </w:t>
+          </w:r>
+          <w:proofErr w:type="spellStart"/>
+          <w:r>
+            <w:rPr>
+              <w:rFonts w:asciiTheme="minorHAnsi" w:hAnsiTheme="minorHAnsi" w:cstheme="minorHAnsi"/>
+              <w:b/>
+              <w:color w:val="024C41"/>
+              <w:sz w:val="32"/>
+              <w:szCs w:val="36"/>
+              <w:lang w:val="en-US"/>
+            </w:rPr>
+            <w:t>dAta-dRiven</w:t>
+          </w:r>
+          <w:proofErr w:type="spellEnd"/>
+          <w:r>
+            <w:rPr>
+              <w:rFonts w:asciiTheme="minorHAnsi" w:hAnsiTheme="minorHAnsi" w:cstheme="minorHAnsi"/>
+              <w:b/>
+              <w:color w:val="024C41"/>
+              <w:sz w:val="32"/>
+              <w:szCs w:val="36"/>
+              <w:lang w:val="en-US"/>
+            </w:rPr>
+            <w:t xml:space="preserve"> </w:t>
+          </w:r>
+          <w:proofErr w:type="spellStart"/>
+          <w:r>
+            <w:rPr>
+              <w:rFonts w:asciiTheme="minorHAnsi" w:hAnsiTheme="minorHAnsi" w:cstheme="minorHAnsi"/>
+              <w:b/>
+              <w:color w:val="024C41"/>
+              <w:sz w:val="32"/>
+              <w:szCs w:val="36"/>
+              <w:lang w:val="en-US"/>
+            </w:rPr>
+            <w:t>manufacTuring</w:t>
+          </w:r>
+          <w:proofErr w:type="spellEnd"/>
+        </w:p>
+        <w:p>
+          <w:pPr>
+            <w:jc w:val="center"/>
+            <w:rPr>
+              <w:rFonts w:asciiTheme="minorHAnsi" w:hAnsiTheme="minorHAnsi" w:cstheme="minorHAnsi"/>
+              <w:b/>
+              <w:color w:val="525252" w:themeColor="accent3" w:themeShade="80"/>
+              <w:sz w:val="16"/>
+              <w:szCs w:val="20"/>
+              <w:lang w:val="en-US"/>
+            </w:rPr>
+          </w:pPr>
+        </w:p>
+        <w:p>
+          <w:pPr>
+            <w:jc w:val="center"/>
+            <w:rPr>
+              <w:rFonts w:asciiTheme="minorHAnsi" w:hAnsiTheme="minorHAnsi" w:cstheme="minorHAnsi"/>
+              <w:b/>
+              <w:color w:val="00A98E"/>
+              <w:sz w:val="24"/>
+              <w:szCs w:val="32"/>
+            </w:rPr>
+          </w:pPr>
+          <w:r>
+            <w:rPr>
+              <w:rFonts w:asciiTheme="minorHAnsi" w:hAnsiTheme="minorHAnsi" w:cstheme="minorHAnsi"/>
+              <w:b/>
+              <w:color w:val="00A98E"/>
+              <w:sz w:val="24"/>
+              <w:szCs w:val="32"/>
+            </w:rPr>
+            <w:t>Accordo Innovazione DM 31/12/2021</w:t>
+          </w:r>
+        </w:p>
+        <w:p>
+          <w:pPr>
+            <w:jc w:val="center"/>
+            <w:rPr>
+              <w:rFonts w:asciiTheme="minorHAnsi" w:hAnsiTheme="minorHAnsi" w:cstheme="minorHAnsi"/>
+              <w:b/>
+              <w:color w:val="595959"/>
+              <w:szCs w:val="24"/>
+              <w:lang w:val="en-US"/>
+            </w:rPr>
+          </w:pPr>
+          <w:r>
+            <w:rPr>
+              <w:rFonts w:asciiTheme="minorHAnsi" w:hAnsiTheme="minorHAnsi" w:cstheme="minorHAnsi"/>
+              <w:b/>
+              <w:color w:val="00A98E"/>
+              <w:sz w:val="24"/>
+              <w:szCs w:val="32"/>
+            </w:rPr>
+            <w:t>Prog. n. F/310087/01-05/X56</w:t>
+          </w:r>
+        </w:p>
+      </w:tc>
+    </w:tr>
+  </w:tbl>
+  <w:p>
+    <w:pPr>
+      <w:pStyle w:val="Intestazione"/>
+      <w:rPr>
+        <w:lang w:val="en-US"/>
+      </w:rPr>
+    </w:pPr>
+  </w:p>
+</w:hdr>
+</file>
+
 <file path=word/numbering.xml><?xml version="1.0" encoding="utf-8"?>
-<w:numbering xmlns:w="http://schemas.openxmlformats.org/wordprocessingml/2006/main">
+<w:numbering xmlns:aink="http://schemas.microsoft.com/office/drawing/2016/ink" xmlns:am3d="http://schemas.microsoft.com/office/drawing/2017/model3d" xmlns:cx="http://schemas.microsoft.com/office/drawing/2014/chartex" xmlns:cx1="http://schemas.microsoft.com/office/drawing/2015/9/8/chartex" xmlns:cx2="http://schemas.microsoft.com/office/drawing/2015/10/21/chartex" xmlns:cx3="http://schemas.microsoft.com/office/drawing/2016/5/9/chartex" xmlns:cx4="http://schemas.microsoft.com/office/drawing/2016/5/10/chartex" xmlns:cx5="http://schemas.microsoft.com/office/drawing/2016/5/11/chartex" xmlns:cx6="http://schemas.microsoft.com/office/drawing/2016/5/12/chartex" xmlns:cx7="http://schemas.microsoft.com/office/drawing/2016/5/13/chartex" xmlns:cx8="http://schemas.microsoft.com/office/drawing/2016/5/14/chartex" xmlns:m="http://schemas.openxmlformats.org/officeDocument/2006/math" xmlns:mc="http://schemas.openxmlformats.org/markup-compatibility/2006" xmlns:o="urn:schemas-microsoft-com:office:office" xmlns:oel="http://schemas.microsoft.com/office/2019/extlst" xmlns:r="http://schemas.openxmlformats.org/officeDocument/2006/relationships" xmlns:v="urn:schemas-microsoft-com:vml" xmlns:w="http://schemas.openxmlformats.org/wordprocessingml/2006/main" xmlns:w10="urn:schemas-microsoft-com:office:word" xmlns:w14="http://schemas.microsoft.com/office/word/2010/wordml" xmlns:w15="http://schemas.microsoft.com/office/word/2012/wordml" xmlns:w16="http://schemas.microsoft.com/office/word/2018/wordml" xmlns:w16cei="http://schemas.microsoft.com/office/word/2026/wordml/cei" xmlns:w16cex="http://schemas.microsoft.com/office/word/2018/wordml/cex" xmlns:w16cid="http://schemas.microsoft.com/office/word/2016/wordml/cid" xmlns:w16du="http://schemas.microsoft.com/office/word/2023/wordml/word16du" xmlns:w16sdtdh="http://schemas.microsoft.com/office/word/2020/wordml/sdtdatahash" xmlns:w16sdtfl="http://schemas.microsoft.com/office/word/2024/wordml/sdtformatlock" xmlns:w16se="http://schemas.microsoft.com/office/word/2015/wordml/symex" xmlns:wne="http://schemas.microsoft.com/office/word/2006/wordml" xmlns:wp="http://schemas.openxmlformats.org/drawingml/2006/wordprocessingDrawing" xmlns:wp14="http://schemas.microsoft.com/office/word/2010/wordprocessingDrawing" xmlns:wpc="http://schemas.microsoft.com/office/word/2010/wordprocessingCanvas" xmlns:wpg="http://schemas.microsoft.com/office/word/2010/wordprocessingGroup" xmlns:wpi="http://schemas.microsoft.com/office/word/2010/wordprocessingInk" xmlns:wps="http://schemas.microsoft.com/office/word/2010/wordprocessingShape" mc:Ignorable="w14 w15 w16se w16cid w16 w16cex w16sdtdh w16sdtfl w16du wp14">
+  <w:abstractNum w15:restartNumberingAfterBreak="0" w:abstractNumId="0">
+    <w:nsid w:val="0000A990"/>
+    <w:multiLevelType w:val="multilevel"/>
+    <w:tmpl w:val="2D6CDB2E"/>
+    <w:lvl w:ilvl="0">
+      <w:numFmt w:val="bullet"/>
+      <w:lvlText w:val=" "/>
+      <w:lvlJc w:val="left"/>
+      <w:pPr>
+        <w:ind w:hanging="360" w:left="720"/>
+      </w:pPr>
+    </w:lvl>
+    <w:lvl w:ilvl="1">
+      <w:numFmt w:val="bullet"/>
+      <w:lvlText w:val=" "/>
+      <w:lvlJc w:val="left"/>
+      <w:pPr>
+        <w:ind w:hanging="360" w:left="1440"/>
+      </w:pPr>
+    </w:lvl>
+    <w:lvl w:ilvl="2">
+      <w:numFmt w:val="bullet"/>
+      <w:lvlText w:val=" "/>
+      <w:lvlJc w:val="left"/>
+      <w:pPr>
+        <w:ind w:hanging="360" w:left="2160"/>
+      </w:pPr>
+    </w:lvl>
+    <w:lvl w:ilvl="3">
+      <w:numFmt w:val="bullet"/>
+      <w:lvlText w:val=" "/>
+      <w:lvlJc w:val="left"/>
+      <w:pPr>
+        <w:ind w:hanging="360" w:left="2880"/>
+      </w:pPr>
+    </w:lvl>
+    <w:lvl w:ilvl="4">
+      <w:numFmt w:val="bullet"/>
+      <w:lvlText w:val=" "/>
+      <w:lvlJc w:val="left"/>
+      <w:pPr>
+        <w:ind w:hanging="360" w:left="3600"/>
+      </w:pPr>
+    </w:lvl>
+    <w:lvl w:ilvl="5">
+      <w:numFmt w:val="bullet"/>
+      <w:lvlText w:val=" "/>
+      <w:lvlJc w:val="left"/>
+      <w:pPr>
+        <w:ind w:hanging="360" w:left="4320"/>
+      </w:pPr>
+    </w:lvl>
+    <w:lvl w:ilvl="6">
+      <w:numFmt w:val="bullet"/>
+      <w:lvlText w:val=" "/>
+      <w:lvlJc w:val="left"/>
+      <w:pPr>
+        <w:ind w:hanging="360" w:left="5040"/>
+      </w:pPr>
+    </w:lvl>
+    <w:lvl w:ilvl="7">
+      <w:numFmt w:val="bullet"/>
+      <w:lvlText w:val=" "/>
+      <w:lvlJc w:val="left"/>
+      <w:pPr>
+        <w:ind w:hanging="360" w:left="5760"/>
+      </w:pPr>
+    </w:lvl>
+    <w:lvl w:ilvl="8">
+      <w:numFmt w:val="bullet"/>
+      <w:lvlText w:val=" "/>
+      <w:lvlJc w:val="left"/>
+      <w:pPr>
+        <w:ind w:hanging="360" w:left="6480"/>
+      </w:pPr>
+    </w:lvl>
+  </w:abstractNum>
+  <w:abstractNum w15:restartNumberingAfterBreak="0" w:abstractNumId="1">
+    <w:nsid w:val="0000A991"/>
+    <w:multiLevelType w:val="multilevel"/>
+    <w:tmpl w:val="B6E2B1B6"/>
+    <w:lvl w:ilvl="0">
+      <w:numFmt w:val="bullet"/>
+      <w:lvlText w:val=""/>
+      <w:lvlJc w:val="left"/>
+      <w:pPr>
+        <w:ind w:hanging="360" w:left="720"/>
+      </w:pPr>
+      <w:rPr>
+        <w:rFonts w:ascii="Symbol" w:cs="Symbol" w:hAnsi="Symbol" w:hint="default"/>
+      </w:rPr>
+    </w:lvl>
+    <w:lvl w:ilvl="1">
+      <w:numFmt w:val="bullet"/>
+      <w:lvlText w:val="o"/>
+      <w:lvlJc w:val="left"/>
+      <w:pPr>
+        <w:ind w:hanging="360" w:left="1440"/>
+      </w:pPr>
+      <w:rPr>
+        <w:rFonts w:ascii="Courier New" w:cs="Courier New" w:hAnsi="Courier New" w:hint="default"/>
+      </w:rPr>
+    </w:lvl>
+    <w:lvl w:ilvl="2">
+      <w:numFmt w:val="bullet"/>
+      <w:lvlText w:val=""/>
+      <w:lvlJc w:val="left"/>
+      <w:pPr>
+        <w:ind w:hanging="360" w:left="2160"/>
+      </w:pPr>
+      <w:rPr>
+        <w:rFonts w:ascii="Wingdings" w:cs="Wingdings" w:hAnsi="Wingdings" w:hint="default"/>
+      </w:rPr>
+    </w:lvl>
+    <w:lvl w:ilvl="3">
+      <w:numFmt w:val="bullet"/>
+      <w:lvlText w:val=""/>
+      <w:lvlJc w:val="left"/>
+      <w:pPr>
+        <w:ind w:hanging="360" w:left="2880"/>
+      </w:pPr>
+      <w:rPr>
+        <w:rFonts w:ascii="Symbol" w:cs="Symbol" w:hAnsi="Symbol" w:hint="default"/>
+      </w:rPr>
+    </w:lvl>
+    <w:lvl w:ilvl="4">
+      <w:numFmt w:val="bullet"/>
+      <w:lvlText w:val="o"/>
+      <w:lvlJc w:val="left"/>
+      <w:pPr>
+        <w:ind w:hanging="360" w:left="3600"/>
+      </w:pPr>
+      <w:rPr>
+        <w:rFonts w:ascii="Courier New" w:cs="Courier New" w:hAnsi="Courier New" w:hint="default"/>
+      </w:rPr>
+    </w:lvl>
+    <w:lvl w:ilvl="5">
+      <w:numFmt w:val="bullet"/>
+      <w:lvlText w:val=""/>
+      <w:lvlJc w:val="left"/>
+      <w:pPr>
+        <w:ind w:hanging="360" w:left="4320"/>
+      </w:pPr>
+      <w:rPr>
+        <w:rFonts w:ascii="Wingdings" w:cs="Wingdings" w:hAnsi="Wingdings" w:hint="default"/>
+      </w:rPr>
+    </w:lvl>
+    <w:lvl w:ilvl="6">
+      <w:numFmt w:val="bullet"/>
+      <w:lvlText w:val=""/>
+      <w:lvlJc w:val="left"/>
+      <w:pPr>
+        <w:ind w:hanging="360" w:left="5040"/>
+      </w:pPr>
+      <w:rPr>
+        <w:rFonts w:ascii="Symbol" w:cs="Symbol" w:hAnsi="Symbol" w:hint="default"/>
+      </w:rPr>
+    </w:lvl>
+    <w:lvl w:ilvl="7">
+      <w:numFmt w:val="bullet"/>
+      <w:lvlText w:val="o"/>
+      <w:lvlJc w:val="left"/>
+      <w:pPr>
+        <w:ind w:hanging="360" w:left="5760"/>
+      </w:pPr>
+      <w:rPr>
+        <w:rFonts w:ascii="Courier New" w:cs="Courier New" w:hAnsi="Courier New" w:hint="default"/>
+      </w:rPr>
+    </w:lvl>
+    <w:lvl w:ilvl="8">
+      <w:numFmt w:val="bullet"/>
+      <w:lvlText w:val=""/>
+      <w:lvlJc w:val="left"/>
+      <w:pPr>
+        <w:ind w:hanging="360" w:left="6480"/>
+      </w:pPr>
+      <w:rPr>
+        <w:rFonts w:ascii="Wingdings" w:cs="Wingdings" w:hAnsi="Wingdings" w:hint="default"/>
+      </w:rPr>
+    </w:lvl>
+  </w:abstractNum>
+  <w:abstractNum w15:restartNumberingAfterBreak="0" w:abstractNumId="2">
+    <w:nsid w:val="00A99411"/>
+    <w:multiLevelType w:val="multilevel"/>
+    <w:tmpl w:val="D5EC3574"/>
+    <w:lvl w:ilvl="0">
+      <w:start w:val="1"/>
+      <w:numFmt w:val="decimal"/>
+      <w:lvlText w:val="%1."/>
+      <w:lvlJc w:val="left"/>
+      <w:pPr>
+        <w:ind w:hanging="360" w:left="720"/>
+      </w:pPr>
+    </w:lvl>
+    <w:lvl w:ilvl="1">
+      <w:start w:val="1"/>
+      <w:numFmt w:val="decimal"/>
+      <w:lvlText w:val="%2."/>
+      <w:lvlJc w:val="left"/>
+      <w:pPr>
+        <w:ind w:hanging="360" w:left="1440"/>
+      </w:pPr>
+    </w:lvl>
+    <w:lvl w:ilvl="2">
+      <w:start w:val="1"/>
+      <w:numFmt w:val="decimal"/>
+      <w:lvlText w:val="%3."/>
+      <w:lvlJc w:val="left"/>
+      <w:pPr>
+        <w:ind w:hanging="360" w:left="2160"/>
+      </w:pPr>
+    </w:lvl>
+    <w:lvl w:ilvl="3">
+      <w:start w:val="1"/>
+      <w:numFmt w:val="decimal"/>
+      <w:lvlText w:val="%4."/>
+      <w:lvlJc w:val="left"/>
+      <w:pPr>
+        <w:ind w:hanging="360" w:left="2880"/>
+      </w:pPr>
+    </w:lvl>
+    <w:lvl w:ilvl="4">
+      <w:start w:val="1"/>
+      <w:numFmt w:val="decimal"/>
+      <w:lvlText w:val="%5."/>
+      <w:lvlJc w:val="left"/>
+      <w:pPr>
+        <w:ind w:hanging="360" w:left="3600"/>
+      </w:pPr>
+    </w:lvl>
+    <w:lvl w:ilvl="5">
+      <w:start w:val="1"/>
+      <w:numFmt w:val="decimal"/>
+      <w:lvlText w:val="%6."/>
+      <w:lvlJc w:val="left"/>
+      <w:pPr>
+        <w:ind w:hanging="360" w:left="4320"/>
+      </w:pPr>
+    </w:lvl>
+    <w:lvl w:ilvl="6">
+      <w:start w:val="1"/>
+      <w:numFmt w:val="decimal"/>
+      <w:lvlText w:val="%7."/>
+      <w:lvlJc w:val="left"/>
+      <w:pPr>
+        <w:ind w:hanging="360" w:left="5040"/>
+      </w:pPr>
+    </w:lvl>
+    <w:lvl w:ilvl="7">
+      <w:start w:val="1"/>
+      <w:numFmt w:val="decimal"/>
+      <w:lvlText w:val="%8."/>
+      <w:lvlJc w:val="left"/>
+      <w:pPr>
+        <w:ind w:hanging="360" w:left="5760"/>
+      </w:pPr>
+    </w:lvl>
+    <w:lvl w:ilvl="8">
+      <w:start w:val="1"/>
+      <w:numFmt w:val="decimal"/>
+      <w:lvlText w:val="%9."/>
+      <w:lvlJc w:val="left"/>
+      <w:pPr>
+        <w:ind w:hanging="360" w:left="6480"/>
+      </w:pPr>
+    </w:lvl>
+  </w:abstractNum>
+  <w:abstractNum w15:restartNumberingAfterBreak="0" w:abstractNumId="3">
+    <w:nsid w:val="0CBD5014"/>
+    <w:multiLevelType w:val="hybridMultilevel"/>
+    <w:tmpl w:val="93769E98"/>
+    <w:lvl w:ilvl="0" w:tplc="0410000F">
+      <w:start w:val="1"/>
+      <w:numFmt w:val="decimal"/>
+      <w:lvlText w:val="%1."/>
+      <w:lvlJc w:val="left"/>
+      <w:pPr>
+        <w:ind w:hanging="360" w:left="1004"/>
+      </w:pPr>
+    </w:lvl>
+    <w:lvl w:ilvl="1" w:tentative="1" w:tplc="04100019">
+      <w:start w:val="1"/>
+      <w:numFmt w:val="lowerLetter"/>
+      <w:lvlText w:val="%2."/>
+      <w:lvlJc w:val="left"/>
+      <w:pPr>
+        <w:ind w:hanging="360" w:left="1724"/>
+      </w:pPr>
+    </w:lvl>
+    <w:lvl w:ilvl="2" w:tentative="1" w:tplc="0410001B">
+      <w:start w:val="1"/>
+      <w:numFmt w:val="lowerRoman"/>
+      <w:lvlText w:val="%3."/>
+      <w:lvlJc w:val="right"/>
+      <w:pPr>
+        <w:ind w:hanging="180" w:left="2444"/>
+      </w:pPr>
+    </w:lvl>
+    <w:lvl w:ilvl="3" w:tentative="1" w:tplc="0410000F">
+      <w:start w:val="1"/>
+      <w:numFmt w:val="decimal"/>
+      <w:lvlText w:val="%4."/>
+      <w:lvlJc w:val="left"/>
+      <w:pPr>
+        <w:ind w:hanging="360" w:left="3164"/>
+      </w:pPr>
+    </w:lvl>
+    <w:lvl w:ilvl="4" w:tentative="1" w:tplc="04100019">
+      <w:start w:val="1"/>
+      <w:numFmt w:val="lowerLetter"/>
+      <w:lvlText w:val="%5."/>
+      <w:lvlJc w:val="left"/>
+      <w:pPr>
+        <w:ind w:hanging="360" w:left="3884"/>
+      </w:pPr>
+    </w:lvl>
+    <w:lvl w:ilvl="5" w:tentative="1" w:tplc="0410001B">
+      <w:start w:val="1"/>
+      <w:numFmt w:val="lowerRoman"/>
+      <w:lvlText w:val="%6."/>
+      <w:lvlJc w:val="right"/>
+      <w:pPr>
+        <w:ind w:hanging="180" w:left="4604"/>
+      </w:pPr>
+    </w:lvl>
+    <w:lvl w:ilvl="6" w:tentative="1" w:tplc="0410000F">
+      <w:start w:val="1"/>
+      <w:numFmt w:val="decimal"/>
+      <w:lvlText w:val="%7."/>
+      <w:lvlJc w:val="left"/>
+      <w:pPr>
+        <w:ind w:hanging="360" w:left="5324"/>
+      </w:pPr>
+    </w:lvl>
+    <w:lvl w:ilvl="7" w:tentative="1" w:tplc="04100019">
+      <w:start w:val="1"/>
+      <w:numFmt w:val="lowerLetter"/>
+      <w:lvlText w:val="%8."/>
+      <w:lvlJc w:val="left"/>
+      <w:pPr>
+        <w:ind w:hanging="360" w:left="6044"/>
+      </w:pPr>
+    </w:lvl>
+    <w:lvl w:ilvl="8" w:tentative="1" w:tplc="0410001B">
+      <w:start w:val="1"/>
+      <w:numFmt w:val="lowerRoman"/>
+      <w:lvlText w:val="%9."/>
+      <w:lvlJc w:val="right"/>
+      <w:pPr>
+        <w:ind w:hanging="180" w:left="6764"/>
+      </w:pPr>
+    </w:lvl>
+  </w:abstractNum>
+  <w:abstractNum w15:restartNumberingAfterBreak="0" w:abstractNumId="4">
+    <w:nsid w:val="14121B98"/>
+    <w:multiLevelType w:val="hybridMultilevel"/>
+    <w:tmpl w:val="AD8680F6"/>
+    <w:lvl w:ilvl="0" w:tplc="8AC64D14">
+      <w:start w:val="1"/>
+      <w:numFmt w:val="bullet"/>
+      <w:pStyle w:val="cElencoPuntato"/>
+      <w:lvlText w:val=""/>
+      <w:lvlJc w:val="left"/>
+      <w:pPr>
+        <w:tabs>
+          <w:tab w:pos="720" w:val="num"/>
+        </w:tabs>
+        <w:ind w:hanging="360" w:left="720"/>
+      </w:pPr>
+      <w:rPr>
+        <w:rFonts w:ascii="Symbol" w:hAnsi="Symbol" w:hint="default"/>
+      </w:rPr>
+    </w:lvl>
+    <w:lvl w:ilvl="1" w:tplc="C91830AC">
+      <w:start w:val="1"/>
+      <w:numFmt w:val="decimal"/>
+      <w:pStyle w:val="cElencoNumerato"/>
+      <w:lvlText w:val="%2."/>
+      <w:lvlJc w:val="left"/>
+      <w:pPr>
+        <w:tabs>
+          <w:tab w:pos="1440" w:val="num"/>
+        </w:tabs>
+        <w:ind w:hanging="360" w:left="1440"/>
+      </w:pPr>
+      <w:rPr>
+        <w:rFonts w:hint="default"/>
+      </w:rPr>
+    </w:lvl>
+    <w:lvl w:ilvl="2" w:tentative="1" w:tplc="04100005">
+      <w:start w:val="1"/>
+      <w:numFmt w:val="bullet"/>
+      <w:lvlText w:val=""/>
+      <w:lvlJc w:val="left"/>
+      <w:pPr>
+        <w:tabs>
+          <w:tab w:pos="2160" w:val="num"/>
+        </w:tabs>
+        <w:ind w:hanging="360" w:left="2160"/>
+      </w:pPr>
+      <w:rPr>
+        <w:rFonts w:ascii="Wingdings" w:hAnsi="Wingdings" w:hint="default"/>
+      </w:rPr>
+    </w:lvl>
+    <w:lvl w:ilvl="3" w:tentative="1" w:tplc="04100001">
+      <w:start w:val="1"/>
+      <w:numFmt w:val="bullet"/>
+      <w:lvlText w:val=""/>
+      <w:lvlJc w:val="left"/>
+      <w:pPr>
+        <w:tabs>
+          <w:tab w:pos="2880" w:val="num"/>
+        </w:tabs>
+        <w:ind w:hanging="360" w:left="2880"/>
+      </w:pPr>
+      <w:rPr>
+        <w:rFonts w:ascii="Symbol" w:hAnsi="Symbol" w:hint="default"/>
+      </w:rPr>
+    </w:lvl>
+    <w:lvl w:ilvl="4" w:tentative="1" w:tplc="04100003">
+      <w:start w:val="1"/>
+      <w:numFmt w:val="bullet"/>
+      <w:lvlText w:val="o"/>
+      <w:lvlJc w:val="left"/>
+      <w:pPr>
+        <w:tabs>
+          <w:tab w:pos="3600" w:val="num"/>
+        </w:tabs>
+        <w:ind w:hanging="360" w:left="3600"/>
+      </w:pPr>
+      <w:rPr>
+        <w:rFonts w:ascii="Courier New" w:cs="Courier New" w:hAnsi="Courier New" w:hint="default"/>
+      </w:rPr>
+    </w:lvl>
+    <w:lvl w:ilvl="5" w:tentative="1" w:tplc="04100005">
+      <w:start w:val="1"/>
+      <w:numFmt w:val="bullet"/>
+      <w:lvlText w:val=""/>
+      <w:lvlJc w:val="left"/>
+      <w:pPr>
+        <w:tabs>
+          <w:tab w:pos="4320" w:val="num"/>
+        </w:tabs>
+        <w:ind w:hanging="360" w:left="4320"/>
+      </w:pPr>
+      <w:rPr>
+        <w:rFonts w:ascii="Wingdings" w:hAnsi="Wingdings" w:hint="default"/>
+      </w:rPr>
+    </w:lvl>
+    <w:lvl w:ilvl="6" w:tentative="1" w:tplc="04100001">
+      <w:start w:val="1"/>
+      <w:numFmt w:val="bullet"/>
+      <w:lvlText w:val=""/>
+      <w:lvlJc w:val="left"/>
+      <w:pPr>
+        <w:tabs>
+          <w:tab w:pos="5040" w:val="num"/>
+        </w:tabs>
+        <w:ind w:hanging="360" w:left="5040"/>
+      </w:pPr>
+      <w:rPr>
+        <w:rFonts w:ascii="Symbol" w:hAnsi="Symbol" w:hint="default"/>
+      </w:rPr>
+    </w:lvl>
+    <w:lvl w:ilvl="7" w:tentative="1" w:tplc="04100003">
+      <w:start w:val="1"/>
+      <w:numFmt w:val="bullet"/>
+      <w:lvlText w:val="o"/>
+      <w:lvlJc w:val="left"/>
+      <w:pPr>
+        <w:tabs>
+          <w:tab w:pos="5760" w:val="num"/>
+        </w:tabs>
+        <w:ind w:hanging="360" w:left="5760"/>
+      </w:pPr>
+      <w:rPr>
+        <w:rFonts w:ascii="Courier New" w:cs="Courier New" w:hAnsi="Courier New" w:hint="default"/>
+      </w:rPr>
+    </w:lvl>
+    <w:lvl w:ilvl="8" w:tentative="1" w:tplc="04100005">
+      <w:start w:val="1"/>
+      <w:numFmt w:val="bullet"/>
+      <w:lvlText w:val=""/>
+      <w:lvlJc w:val="left"/>
+      <w:pPr>
+        <w:tabs>
+          <w:tab w:pos="6480" w:val="num"/>
+        </w:tabs>
+        <w:ind w:hanging="360" w:left="6480"/>
+      </w:pPr>
+      <w:rPr>
+        <w:rFonts w:ascii="Wingdings" w:hAnsi="Wingdings" w:hint="default"/>
+      </w:rPr>
+    </w:lvl>
+  </w:abstractNum>
+  <w:abstractNum w15:restartNumberingAfterBreak="0" w:abstractNumId="5">
+    <w:nsid w:val="220557A6"/>
+    <w:multiLevelType w:val="hybridMultilevel"/>
+    <w:tmpl w:val="7F88E97C"/>
+    <w:lvl w:ilvl="0" w:tplc="0410000F">
+      <w:start w:val="1"/>
+      <w:numFmt w:val="decimal"/>
+      <w:lvlText w:val="%1."/>
+      <w:lvlJc w:val="left"/>
+      <w:pPr>
+        <w:ind w:hanging="360" w:left="1068"/>
+      </w:pPr>
+    </w:lvl>
+    <w:lvl w:ilvl="1" w:tentative="1" w:tplc="04100019">
+      <w:start w:val="1"/>
+      <w:numFmt w:val="lowerLetter"/>
+      <w:lvlText w:val="%2."/>
+      <w:lvlJc w:val="left"/>
+      <w:pPr>
+        <w:ind w:hanging="360" w:left="1788"/>
+      </w:pPr>
+    </w:lvl>
+    <w:lvl w:ilvl="2" w:tentative="1" w:tplc="0410001B">
+      <w:start w:val="1"/>
+      <w:numFmt w:val="lowerRoman"/>
+      <w:lvlText w:val="%3."/>
+      <w:lvlJc w:val="right"/>
+      <w:pPr>
+        <w:ind w:hanging="180" w:left="2508"/>
+      </w:pPr>
+    </w:lvl>
+    <w:lvl w:ilvl="3" w:tentative="1" w:tplc="0410000F">
+      <w:start w:val="1"/>
+      <w:numFmt w:val="decimal"/>
+      <w:lvlText w:val="%4."/>
+      <w:lvlJc w:val="left"/>
+      <w:pPr>
+        <w:ind w:hanging="360" w:left="3228"/>
+      </w:pPr>
+    </w:lvl>
+    <w:lvl w:ilvl="4" w:tentative="1" w:tplc="04100019">
+      <w:start w:val="1"/>
+      <w:numFmt w:val="lowerLetter"/>
+      <w:lvlText w:val="%5."/>
+      <w:lvlJc w:val="left"/>
+      <w:pPr>
+        <w:ind w:hanging="360" w:left="3948"/>
+      </w:pPr>
+    </w:lvl>
+    <w:lvl w:ilvl="5" w:tentative="1" w:tplc="0410001B">
+      <w:start w:val="1"/>
+      <w:numFmt w:val="lowerRoman"/>
+      <w:lvlText w:val="%6."/>
+      <w:lvlJc w:val="right"/>
+      <w:pPr>
+        <w:ind w:hanging="180" w:left="4668"/>
+      </w:pPr>
+    </w:lvl>
+    <w:lvl w:ilvl="6" w:tentative="1" w:tplc="0410000F">
+      <w:start w:val="1"/>
+      <w:numFmt w:val="decimal"/>
+      <w:lvlText w:val="%7."/>
+      <w:lvlJc w:val="left"/>
+      <w:pPr>
+        <w:ind w:hanging="360" w:left="5388"/>
+      </w:pPr>
+    </w:lvl>
+    <w:lvl w:ilvl="7" w:tentative="1" w:tplc="04100019">
+      <w:start w:val="1"/>
+      <w:numFmt w:val="lowerLetter"/>
+      <w:lvlText w:val="%8."/>
+      <w:lvlJc w:val="left"/>
+      <w:pPr>
+        <w:ind w:hanging="360" w:left="6108"/>
+      </w:pPr>
+    </w:lvl>
+    <w:lvl w:ilvl="8" w:tentative="1" w:tplc="0410001B">
+      <w:start w:val="1"/>
+      <w:numFmt w:val="lowerRoman"/>
+      <w:lvlText w:val="%9."/>
+      <w:lvlJc w:val="right"/>
+      <w:pPr>
+        <w:ind w:hanging="180" w:left="6828"/>
+      </w:pPr>
+    </w:lvl>
+  </w:abstractNum>
+  <w:abstractNum w15:restartNumberingAfterBreak="0" w:abstractNumId="6">
+    <w:nsid w:val="2D960A9C"/>
+    <w:multiLevelType w:val="hybridMultilevel"/>
+    <w:tmpl w:val="93769E98"/>
+    <w:lvl w:ilvl="0" w:tplc="0410000F">
+      <w:start w:val="1"/>
+      <w:numFmt w:val="decimal"/>
+      <w:lvlText w:val="%1."/>
+      <w:lvlJc w:val="left"/>
+      <w:pPr>
+        <w:ind w:hanging="360" w:left="1004"/>
+      </w:pPr>
+    </w:lvl>
+    <w:lvl w:ilvl="1" w:tentative="1" w:tplc="04100019">
+      <w:start w:val="1"/>
+      <w:numFmt w:val="lowerLetter"/>
+      <w:lvlText w:val="%2."/>
+      <w:lvlJc w:val="left"/>
+      <w:pPr>
+        <w:ind w:hanging="360" w:left="1724"/>
+      </w:pPr>
+    </w:lvl>
+    <w:lvl w:ilvl="2" w:tentative="1" w:tplc="0410001B">
+      <w:start w:val="1"/>
+      <w:numFmt w:val="lowerRoman"/>
+      <w:lvlText w:val="%3."/>
+      <w:lvlJc w:val="right"/>
+      <w:pPr>
+        <w:ind w:hanging="180" w:left="2444"/>
+      </w:pPr>
+    </w:lvl>
+    <w:lvl w:ilvl="3" w:tentative="1" w:tplc="0410000F">
+      <w:start w:val="1"/>
+      <w:numFmt w:val="decimal"/>
+      <w:lvlText w:val="%4."/>
+      <w:lvlJc w:val="left"/>
+      <w:pPr>
+        <w:ind w:hanging="360" w:left="3164"/>
+      </w:pPr>
+    </w:lvl>
+    <w:lvl w:ilvl="4" w:tentative="1" w:tplc="04100019">
+      <w:start w:val="1"/>
+      <w:numFmt w:val="lowerLetter"/>
+      <w:lvlText w:val="%5."/>
+      <w:lvlJc w:val="left"/>
+      <w:pPr>
+        <w:ind w:hanging="360" w:left="3884"/>
+      </w:pPr>
+    </w:lvl>
+    <w:lvl w:ilvl="5" w:tentative="1" w:tplc="0410001B">
+      <w:start w:val="1"/>
+      <w:numFmt w:val="lowerRoman"/>
+      <w:lvlText w:val="%6."/>
+      <w:lvlJc w:val="right"/>
+      <w:pPr>
+        <w:ind w:hanging="180" w:left="4604"/>
+      </w:pPr>
+    </w:lvl>
+    <w:lvl w:ilvl="6" w:tentative="1" w:tplc="0410000F">
+      <w:start w:val="1"/>
+      <w:numFmt w:val="decimal"/>
+      <w:lvlText w:val="%7."/>
+      <w:lvlJc w:val="left"/>
+      <w:pPr>
+        <w:ind w:hanging="360" w:left="5324"/>
+      </w:pPr>
+    </w:lvl>
+    <w:lvl w:ilvl="7" w:tentative="1" w:tplc="04100019">
+      <w:start w:val="1"/>
+      <w:numFmt w:val="lowerLetter"/>
+      <w:lvlText w:val="%8."/>
+      <w:lvlJc w:val="left"/>
+      <w:pPr>
+        <w:ind w:hanging="360" w:left="6044"/>
+      </w:pPr>
+    </w:lvl>
+    <w:lvl w:ilvl="8" w:tentative="1" w:tplc="0410001B">
+      <w:start w:val="1"/>
+      <w:numFmt w:val="lowerRoman"/>
+      <w:lvlText w:val="%9."/>
+      <w:lvlJc w:val="right"/>
+      <w:pPr>
+        <w:ind w:hanging="180" w:left="6764"/>
+      </w:pPr>
+    </w:lvl>
+  </w:abstractNum>
+  <w:abstractNum w15:restartNumberingAfterBreak="0" w:abstractNumId="7">
+    <w:nsid w:val="2DF2637A"/>
+    <w:multiLevelType w:val="hybridMultilevel"/>
+    <w:tmpl w:val="22441060"/>
+    <w:lvl w:ilvl="0" w:tplc="04100001">
+      <w:start w:val="1"/>
+      <w:numFmt w:val="bullet"/>
+      <w:lvlText w:val=""/>
+      <w:lvlJc w:val="left"/>
+      <w:pPr>
+        <w:ind w:hanging="360" w:left="720"/>
+      </w:pPr>
+      <w:rPr>
+        <w:rFonts w:ascii="Symbol" w:hAnsi="Symbol" w:hint="default"/>
+      </w:rPr>
+    </w:lvl>
+    <w:lvl w:ilvl="1" w:tentative="1" w:tplc="04100003">
+      <w:start w:val="1"/>
+      <w:numFmt w:val="bullet"/>
+      <w:lvlText w:val="o"/>
+      <w:lvlJc w:val="left"/>
+      <w:pPr>
+        <w:ind w:hanging="360" w:left="1440"/>
+      </w:pPr>
+      <w:rPr>
+        <w:rFonts w:ascii="Courier New" w:cs="Courier New" w:hAnsi="Courier New" w:hint="default"/>
+      </w:rPr>
+    </w:lvl>
+    <w:lvl w:ilvl="2" w:tentative="1" w:tplc="04100005">
+      <w:start w:val="1"/>
+      <w:numFmt w:val="bullet"/>
+      <w:lvlText w:val=""/>
+      <w:lvlJc w:val="left"/>
+      <w:pPr>
+        <w:ind w:hanging="360" w:left="2160"/>
+      </w:pPr>
+      <w:rPr>
+        <w:rFonts w:ascii="Wingdings" w:hAnsi="Wingdings" w:hint="default"/>
+      </w:rPr>
+    </w:lvl>
+    <w:lvl w:ilvl="3" w:tentative="1" w:tplc="04100001">
+      <w:start w:val="1"/>
+      <w:numFmt w:val="bullet"/>
+      <w:lvlText w:val=""/>
+      <w:lvlJc w:val="left"/>
+      <w:pPr>
+        <w:ind w:hanging="360" w:left="2880"/>
+      </w:pPr>
+      <w:rPr>
+        <w:rFonts w:ascii="Symbol" w:hAnsi="Symbol" w:hint="default"/>
+      </w:rPr>
+    </w:lvl>
+    <w:lvl w:ilvl="4" w:tentative="1" w:tplc="04100003">
+      <w:start w:val="1"/>
+      <w:numFmt w:val="bullet"/>
+      <w:lvlText w:val="o"/>
+      <w:lvlJc w:val="left"/>
+      <w:pPr>
+        <w:ind w:hanging="360" w:left="3600"/>
+      </w:pPr>
+      <w:rPr>
+        <w:rFonts w:ascii="Courier New" w:cs="Courier New" w:hAnsi="Courier New" w:hint="default"/>
+      </w:rPr>
+    </w:lvl>
+    <w:lvl w:ilvl="5" w:tentative="1" w:tplc="04100005">
+      <w:start w:val="1"/>
+      <w:numFmt w:val="bullet"/>
+      <w:lvlText w:val=""/>
+      <w:lvlJc w:val="left"/>
+      <w:pPr>
+        <w:ind w:hanging="360" w:left="4320"/>
+      </w:pPr>
+      <w:rPr>
+        <w:rFonts w:ascii="Wingdings" w:hAnsi="Wingdings" w:hint="default"/>
+      </w:rPr>
+    </w:lvl>
+    <w:lvl w:ilvl="6" w:tentative="1" w:tplc="04100001">
+      <w:start w:val="1"/>
+      <w:numFmt w:val="bullet"/>
+      <w:lvlText w:val=""/>
+      <w:lvlJc w:val="left"/>
+      <w:pPr>
+        <w:ind w:hanging="360" w:left="5040"/>
+      </w:pPr>
+      <w:rPr>
+        <w:rFonts w:ascii="Symbol" w:hAnsi="Symbol" w:hint="default"/>
+      </w:rPr>
+    </w:lvl>
+    <w:lvl w:ilvl="7" w:tentative="1" w:tplc="04100003">
+      <w:start w:val="1"/>
+      <w:numFmt w:val="bullet"/>
+      <w:lvlText w:val="o"/>
+      <w:lvlJc w:val="left"/>
+      <w:pPr>
+        <w:ind w:hanging="360" w:left="5760"/>
+      </w:pPr>
+      <w:rPr>
+        <w:rFonts w:ascii="Courier New" w:cs="Courier New" w:hAnsi="Courier New" w:hint="default"/>
+      </w:rPr>
+    </w:lvl>
+    <w:lvl w:ilvl="8" w:tentative="1" w:tplc="04100005">
+      <w:start w:val="1"/>
+      <w:numFmt w:val="bullet"/>
+      <w:lvlText w:val=""/>
+      <w:lvlJc w:val="left"/>
+      <w:pPr>
+        <w:ind w:hanging="360" w:left="6480"/>
+      </w:pPr>
+      <w:rPr>
+        <w:rFonts w:ascii="Wingdings" w:hAnsi="Wingdings" w:hint="default"/>
+      </w:rPr>
+    </w:lvl>
+  </w:abstractNum>
+  <w:abstractNum w15:restartNumberingAfterBreak="0" w:abstractNumId="8">
+    <w:nsid w:val="475E36B0"/>
+    <w:multiLevelType w:val="hybridMultilevel"/>
+    <w:tmpl w:val="85B4CF3C"/>
+    <w:lvl w:ilvl="0" w:tplc="0410001B">
+      <w:start w:val="1"/>
+      <w:numFmt w:val="lowerRoman"/>
+      <w:lvlText w:val="%1."/>
+      <w:lvlJc w:val="right"/>
+      <w:pPr>
+        <w:ind w:hanging="360" w:left="720"/>
+      </w:pPr>
+    </w:lvl>
+    <w:lvl w:ilvl="1" w:tentative="1" w:tplc="04100019">
+      <w:start w:val="1"/>
+      <w:numFmt w:val="lowerLetter"/>
+      <w:lvlText w:val="%2."/>
+      <w:lvlJc w:val="left"/>
+      <w:pPr>
+        <w:ind w:hanging="360" w:left="1440"/>
+      </w:pPr>
+    </w:lvl>
+    <w:lvl w:ilvl="2" w:tentative="1" w:tplc="0410001B">
+      <w:start w:val="1"/>
+      <w:numFmt w:val="lowerRoman"/>
+      <w:lvlText w:val="%3."/>
+      <w:lvlJc w:val="right"/>
+      <w:pPr>
+        <w:ind w:hanging="180" w:left="2160"/>
+      </w:pPr>
+    </w:lvl>
+    <w:lvl w:ilvl="3" w:tentative="1" w:tplc="0410000F">
+      <w:start w:val="1"/>
+      <w:numFmt w:val="decimal"/>
+      <w:lvlText w:val="%4."/>
+      <w:lvlJc w:val="left"/>
+      <w:pPr>
+        <w:ind w:hanging="360" w:left="2880"/>
+      </w:pPr>
+    </w:lvl>
+    <w:lvl w:ilvl="4" w:tentative="1" w:tplc="04100019">
+      <w:start w:val="1"/>
+      <w:numFmt w:val="lowerLetter"/>
+      <w:lvlText w:val="%5."/>
+      <w:lvlJc w:val="left"/>
+      <w:pPr>
+        <w:ind w:hanging="360" w:left="3600"/>
+      </w:pPr>
+    </w:lvl>
+    <w:lvl w:ilvl="5" w:tentative="1" w:tplc="0410001B">
+      <w:start w:val="1"/>
+      <w:numFmt w:val="lowerRoman"/>
+      <w:lvlText w:val="%6."/>
+      <w:lvlJc w:val="right"/>
+      <w:pPr>
+        <w:ind w:hanging="180" w:left="4320"/>
+      </w:pPr>
+    </w:lvl>
+    <w:lvl w:ilvl="6" w:tentative="1" w:tplc="0410000F">
+      <w:start w:val="1"/>
+      <w:numFmt w:val="decimal"/>
+      <w:lvlText w:val="%7."/>
+      <w:lvlJc w:val="left"/>
+      <w:pPr>
+        <w:ind w:hanging="360" w:left="5040"/>
+      </w:pPr>
+    </w:lvl>
+    <w:lvl w:ilvl="7" w:tentative="1" w:tplc="04100019">
+      <w:start w:val="1"/>
+      <w:numFmt w:val="lowerLetter"/>
+      <w:lvlText w:val="%8."/>
+      <w:lvlJc w:val="left"/>
+      <w:pPr>
+        <w:ind w:hanging="360" w:left="5760"/>
+      </w:pPr>
+    </w:lvl>
+    <w:lvl w:ilvl="8" w:tentative="1" w:tplc="0410001B">
+      <w:start w:val="1"/>
+      <w:numFmt w:val="lowerRoman"/>
+      <w:lvlText w:val="%9."/>
+      <w:lvlJc w:val="right"/>
+      <w:pPr>
+        <w:ind w:hanging="180" w:left="6480"/>
+      </w:pPr>
+    </w:lvl>
+  </w:abstractNum>
+  <w:abstractNum w15:restartNumberingAfterBreak="0" w:abstractNumId="9">
+    <w:nsid w:val="4F5123DF"/>
+    <w:multiLevelType w:val="hybridMultilevel"/>
+    <w:tmpl w:val="BF0CD848"/>
+    <w:lvl w:ilvl="0" w:tplc="0410000F">
+      <w:start w:val="1"/>
+      <w:numFmt w:val="decimal"/>
+      <w:lvlText w:val="%1."/>
+      <w:lvlJc w:val="left"/>
+      <w:pPr>
+        <w:ind w:hanging="360" w:left="720"/>
+      </w:pPr>
+    </w:lvl>
+    <w:lvl w:ilvl="1" w:tentative="1" w:tplc="04100019">
+      <w:start w:val="1"/>
+      <w:numFmt w:val="lowerLetter"/>
+      <w:lvlText w:val="%2."/>
+      <w:lvlJc w:val="left"/>
+      <w:pPr>
+        <w:ind w:hanging="360" w:left="1440"/>
+      </w:pPr>
+    </w:lvl>
+    <w:lvl w:ilvl="2" w:tentative="1" w:tplc="0410001B">
+      <w:start w:val="1"/>
+      <w:numFmt w:val="lowerRoman"/>
+      <w:lvlText w:val="%3."/>
+      <w:lvlJc w:val="right"/>
+      <w:pPr>
+        <w:ind w:hanging="180" w:left="2160"/>
+      </w:pPr>
+    </w:lvl>
+    <w:lvl w:ilvl="3" w:tentative="1" w:tplc="0410000F">
+      <w:start w:val="1"/>
+      <w:numFmt w:val="decimal"/>
+      <w:lvlText w:val="%4."/>
+      <w:lvlJc w:val="left"/>
+      <w:pPr>
+        <w:ind w:hanging="360" w:left="2880"/>
+      </w:pPr>
+    </w:lvl>
+    <w:lvl w:ilvl="4" w:tentative="1" w:tplc="04100019">
+      <w:start w:val="1"/>
+      <w:numFmt w:val="lowerLetter"/>
+      <w:lvlText w:val="%5."/>
+      <w:lvlJc w:val="left"/>
+      <w:pPr>
+        <w:ind w:hanging="360" w:left="3600"/>
+      </w:pPr>
+    </w:lvl>
+    <w:lvl w:ilvl="5" w:tentative="1" w:tplc="0410001B">
+      <w:start w:val="1"/>
+      <w:numFmt w:val="lowerRoman"/>
+      <w:lvlText w:val="%6."/>
+      <w:lvlJc w:val="right"/>
+      <w:pPr>
+        <w:ind w:hanging="180" w:left="4320"/>
+      </w:pPr>
+    </w:lvl>
+    <w:lvl w:ilvl="6" w:tentative="1" w:tplc="0410000F">
+      <w:start w:val="1"/>
+      <w:numFmt w:val="decimal"/>
+      <w:lvlText w:val="%7."/>
+      <w:lvlJc w:val="left"/>
+      <w:pPr>
+        <w:ind w:hanging="360" w:left="5040"/>
+      </w:pPr>
+    </w:lvl>
+    <w:lvl w:ilvl="7" w:tentative="1" w:tplc="04100019">
+      <w:start w:val="1"/>
+      <w:numFmt w:val="lowerLetter"/>
+      <w:lvlText w:val="%8."/>
+      <w:lvlJc w:val="left"/>
+      <w:pPr>
+        <w:ind w:hanging="360" w:left="5760"/>
+      </w:pPr>
+    </w:lvl>
+    <w:lvl w:ilvl="8" w:tentative="1" w:tplc="0410001B">
+      <w:start w:val="1"/>
+      <w:numFmt w:val="lowerRoman"/>
+      <w:lvlText w:val="%9."/>
+      <w:lvlJc w:val="right"/>
+      <w:pPr>
+        <w:ind w:hanging="180" w:left="6480"/>
+      </w:pPr>
+    </w:lvl>
+  </w:abstractNum>
   <w:abstractNum w:abstractNumId="990">
     <w:nsid w:val="A990"/>
     <w:multiLevelType w:val="multilevel"/>
@@ -4542,6 +6221,96 @@
       </w:pPr>
     </w:lvl>
   </w:abstractNum>
+  <w:num w16cid:durableId="1869414988" w:numId="1">
+    <w:abstractNumId w:val="4"/>
+  </w:num>
+  <w:num w16cid:durableId="191889600" w:numId="2">
+    <w:abstractNumId w:val="3"/>
+  </w:num>
+  <w:num w16cid:durableId="1405685383" w:numId="3">
+    <w:abstractNumId w:val="6"/>
+  </w:num>
+  <w:num w16cid:durableId="905260640" w:numId="4">
+    <w:abstractNumId w:val="9"/>
+  </w:num>
+  <w:num w16cid:durableId="453256951" w:numId="5">
+    <w:abstractNumId w:val="5"/>
+  </w:num>
+  <w:num w16cid:durableId="522670935" w:numId="6">
+    <w:abstractNumId w:val="7"/>
+  </w:num>
+  <w:num w16cid:durableId="1079059330" w:numId="7">
+    <w:abstractNumId w:val="8"/>
+  </w:num>
+  <w:num w16cid:durableId="1011294559" w:numId="8">
+    <w:abstractNumId w:val="0"/>
+  </w:num>
+  <w:num w16cid:durableId="1541935265" w:numId="9">
+    <w:abstractNumId w:val="2"/>
+    <w:lvlOverride w:ilvl="0">
+      <w:startOverride w:val="1"/>
+    </w:lvlOverride>
+    <w:lvlOverride w:ilvl="1">
+      <w:startOverride w:val="1"/>
+    </w:lvlOverride>
+    <w:lvlOverride w:ilvl="2">
+      <w:startOverride w:val="1"/>
+    </w:lvlOverride>
+    <w:lvlOverride w:ilvl="3">
+      <w:startOverride w:val="1"/>
+    </w:lvlOverride>
+    <w:lvlOverride w:ilvl="4">
+      <w:startOverride w:val="1"/>
+    </w:lvlOverride>
+    <w:lvlOverride w:ilvl="5">
+      <w:startOverride w:val="1"/>
+    </w:lvlOverride>
+    <w:lvlOverride w:ilvl="6">
+      <w:startOverride w:val="1"/>
+    </w:lvlOverride>
+    <w:lvlOverride w:ilvl="7">
+      <w:startOverride w:val="1"/>
+    </w:lvlOverride>
+    <w:lvlOverride w:ilvl="8">
+      <w:startOverride w:val="1"/>
+    </w:lvlOverride>
+  </w:num>
+  <w:num w16cid:durableId="468672640" w:numId="10">
+    <w:abstractNumId w:val="2"/>
+    <w:lvlOverride w:ilvl="0">
+      <w:startOverride w:val="1"/>
+    </w:lvlOverride>
+    <w:lvlOverride w:ilvl="1">
+      <w:startOverride w:val="1"/>
+    </w:lvlOverride>
+    <w:lvlOverride w:ilvl="2">
+      <w:startOverride w:val="1"/>
+    </w:lvlOverride>
+    <w:lvlOverride w:ilvl="3">
+      <w:startOverride w:val="1"/>
+    </w:lvlOverride>
+    <w:lvlOverride w:ilvl="4">
+      <w:startOverride w:val="1"/>
+    </w:lvlOverride>
+    <w:lvlOverride w:ilvl="5">
+      <w:startOverride w:val="1"/>
+    </w:lvlOverride>
+    <w:lvlOverride w:ilvl="6">
+      <w:startOverride w:val="1"/>
+    </w:lvlOverride>
+    <w:lvlOverride w:ilvl="7">
+      <w:startOverride w:val="1"/>
+    </w:lvlOverride>
+    <w:lvlOverride w:ilvl="8">
+      <w:startOverride w:val="1"/>
+    </w:lvlOverride>
+  </w:num>
+  <w:num w16cid:durableId="1995602661" w:numId="11">
+    <w:abstractNumId w:val="1"/>
+  </w:num>
+  <w:num w16cid:durableId="151265824" w:numId="12">
+    <w:abstractNumId w:val="1"/>
+  </w:num>
   <w:num w:numId="1000">
     <w:abstractNumId w:val="990"/>
   </w:num>
@@ -4561,182 +6330,314 @@
 </file>
 
 <file path=word/styles.xml><?xml version="1.0" encoding="utf-8"?>
-<w:styles xmlns:r="http://schemas.openxmlformats.org/officeDocument/2006/relationships" xmlns:w="http://schemas.openxmlformats.org/wordprocessingml/2006/main">
+<w:styles xmlns:mc="http://schemas.openxmlformats.org/markup-compatibility/2006" xmlns:r="http://schemas.openxmlformats.org/officeDocument/2006/relationships" xmlns:w="http://schemas.openxmlformats.org/wordprocessingml/2006/main" xmlns:w14="http://schemas.microsoft.com/office/word/2010/wordml" xmlns:w15="http://schemas.microsoft.com/office/word/2012/wordml" xmlns:w16="http://schemas.microsoft.com/office/word/2018/wordml" xmlns:w16cex="http://schemas.microsoft.com/office/word/2018/wordml/cex" xmlns:w16cid="http://schemas.microsoft.com/office/word/2016/wordml/cid" xmlns:w16du="http://schemas.microsoft.com/office/word/2023/wordml/word16du" xmlns:w16sdtdh="http://schemas.microsoft.com/office/word/2020/wordml/sdtdatahash" xmlns:w16sdtfl="http://schemas.microsoft.com/office/word/2024/wordml/sdtformatlock" xmlns:w16se="http://schemas.microsoft.com/office/word/2015/wordml/symex" mc:Ignorable="w14 w15 w16se w16cid w16 w16cex w16sdtdh w16sdtfl w16du">
   <w:docDefaults>
     <w:rPrDefault>
       <w:rPr>
-        <w:rFonts w:asciiTheme="minorHAnsi" w:cstheme="minorBidi" w:eastAsiaTheme="minorHAnsi" w:hAnsiTheme="minorHAnsi"/>
-        <w:sz w:val="24"/>
-        <w:szCs w:val="24"/>
-        <w:lang w:bidi="ar-SA" w:eastAsia="en-US" w:val="en-US"/>
+        <w:rFonts w:ascii="Times New Roman" w:cs="Times New Roman" w:eastAsia="Times New Roman" w:hAnsi="Times New Roman"/>
+        <w:lang w:bidi="ar-SA" w:eastAsia="it-IT" w:val="it-IT"/>
       </w:rPr>
     </w:rPrDefault>
-    <w:pPrDefault>
-      <w:pPr>
-        <w:spacing w:after="200"/>
-      </w:pPr>
-    </w:pPrDefault>
+    <w:pPrDefault/>
   </w:docDefaults>
-  <w:latentStyles w:count="276" w:defLockedState="0" w:defQFormat="0" w:defSemiHidden="0" w:defUIPriority="0" w:defUnhideWhenUsed="0"/>
-  <w:style w:default="1" w:styleId="Normal" w:type="paragraph">
+  <w:latentStyles w:count="376" w:defLockedState="0" w:defQFormat="0" w:defSemiHidden="0" w:defUIPriority="0" w:defUnhideWhenUsed="0">
+    <w:lsdException w:name="Normal" w:qFormat="1"/>
+    <w:lsdException w:name="heading 1" w:qFormat="1"/>
+    <w:lsdException w:name="heading 2" w:qFormat="1" w:semiHidden="1" w:unhideWhenUsed="1"/>
+    <w:lsdException w:name="heading 3" w:qFormat="1" w:semiHidden="1" w:unhideWhenUsed="1"/>
+    <w:lsdException w:name="heading 4" w:qFormat="1" w:semiHidden="1" w:unhideWhenUsed="1"/>
+    <w:lsdException w:name="heading 5" w:qFormat="1" w:semiHidden="1" w:unhideWhenUsed="1"/>
+    <w:lsdException w:name="heading 6" w:qFormat="1" w:semiHidden="1" w:unhideWhenUsed="1"/>
+    <w:lsdException w:name="heading 7" w:qFormat="1" w:semiHidden="1" w:unhideWhenUsed="1"/>
+    <w:lsdException w:name="heading 8" w:qFormat="1" w:semiHidden="1" w:unhideWhenUsed="1"/>
+    <w:lsdException w:name="heading 9" w:qFormat="1" w:semiHidden="1" w:unhideWhenUsed="1"/>
+    <w:lsdException w:name="footer" w:uiPriority="99"/>
+    <w:lsdException w:name="caption" w:qFormat="1" w:semiHidden="1" w:unhideWhenUsed="1"/>
+    <w:lsdException w:name="Title" w:qFormat="1"/>
+    <w:lsdException w:name="Default Paragraph Font" w:uiPriority="1"/>
+    <w:lsdException w:name="Subtitle" w:qFormat="1"/>
+    <w:lsdException w:name="Strong" w:qFormat="1"/>
+    <w:lsdException w:name="Emphasis" w:qFormat="1"/>
+    <w:lsdException w:name="Normal Table" w:semiHidden="1" w:unhideWhenUsed="1"/>
+    <w:lsdException w:name="No List" w:uiPriority="99"/>
+    <w:lsdException w:name="Table Simple 1" w:semiHidden="1" w:unhideWhenUsed="1"/>
+    <w:lsdException w:name="Table Simple 2" w:semiHidden="1" w:unhideWhenUsed="1"/>
+    <w:lsdException w:name="Table Simple 3" w:semiHidden="1" w:unhideWhenUsed="1"/>
+    <w:lsdException w:name="Table Classic 1" w:semiHidden="1" w:unhideWhenUsed="1"/>
+    <w:lsdException w:name="Table Classic 2" w:semiHidden="1" w:unhideWhenUsed="1"/>
+    <w:lsdException w:name="Table Classic 3" w:semiHidden="1" w:unhideWhenUsed="1"/>
+    <w:lsdException w:name="Table Classic 4" w:semiHidden="1" w:unhideWhenUsed="1"/>
+    <w:lsdException w:name="Table Colorful 1" w:semiHidden="1" w:unhideWhenUsed="1"/>
+    <w:lsdException w:name="Table Colorful 2" w:semiHidden="1" w:unhideWhenUsed="1"/>
+    <w:lsdException w:name="Table Colorful 3" w:semiHidden="1" w:unhideWhenUsed="1"/>
+    <w:lsdException w:name="Table Columns 1" w:semiHidden="1" w:unhideWhenUsed="1"/>
+    <w:lsdException w:name="Table Columns 2" w:semiHidden="1" w:unhideWhenUsed="1"/>
+    <w:lsdException w:name="Table Columns 3" w:semiHidden="1" w:unhideWhenUsed="1"/>
+    <w:lsdException w:name="Table Columns 4" w:semiHidden="1" w:unhideWhenUsed="1"/>
+    <w:lsdException w:name="Table Columns 5" w:semiHidden="1" w:unhideWhenUsed="1"/>
+    <w:lsdException w:name="Table Grid 1" w:semiHidden="1" w:unhideWhenUsed="1"/>
+    <w:lsdException w:name="Table Grid 2" w:semiHidden="1" w:unhideWhenUsed="1"/>
+    <w:lsdException w:name="Table Grid 3" w:semiHidden="1" w:unhideWhenUsed="1"/>
+    <w:lsdException w:name="Table Grid 4" w:semiHidden="1" w:unhideWhenUsed="1"/>
+    <w:lsdException w:name="Table Grid 5" w:semiHidden="1" w:unhideWhenUsed="1"/>
+    <w:lsdException w:name="Table Grid 6" w:semiHidden="1" w:unhideWhenUsed="1"/>
+    <w:lsdException w:name="Table Grid 7" w:semiHidden="1" w:unhideWhenUsed="1"/>
+    <w:lsdException w:name="Table Grid 8" w:semiHidden="1" w:unhideWhenUsed="1"/>
+    <w:lsdException w:name="Table List 1" w:semiHidden="1" w:unhideWhenUsed="1"/>
+    <w:lsdException w:name="Table List 2" w:semiHidden="1" w:unhideWhenUsed="1"/>
+    <w:lsdException w:name="Table List 3" w:semiHidden="1" w:unhideWhenUsed="1"/>
+    <w:lsdException w:name="Table List 4" w:semiHidden="1" w:unhideWhenUsed="1"/>
+    <w:lsdException w:name="Table List 5" w:semiHidden="1" w:unhideWhenUsed="1"/>
+    <w:lsdException w:name="Table List 6" w:semiHidden="1" w:unhideWhenUsed="1"/>
+    <w:lsdException w:name="Table List 7" w:semiHidden="1" w:unhideWhenUsed="1"/>
+    <w:lsdException w:name="Table List 8" w:semiHidden="1" w:unhideWhenUsed="1"/>
+    <w:lsdException w:name="Table 3D effects 1" w:semiHidden="1" w:unhideWhenUsed="1"/>
+    <w:lsdException w:name="Table 3D effects 2" w:semiHidden="1" w:unhideWhenUsed="1"/>
+    <w:lsdException w:name="Table 3D effects 3" w:semiHidden="1" w:unhideWhenUsed="1"/>
+    <w:lsdException w:name="Table Contemporary" w:semiHidden="1" w:unhideWhenUsed="1"/>
+    <w:lsdException w:name="Table Elegant" w:semiHidden="1" w:unhideWhenUsed="1"/>
+    <w:lsdException w:name="Table Professional" w:semiHidden="1" w:unhideWhenUsed="1"/>
+    <w:lsdException w:name="Table Subtle 1" w:semiHidden="1" w:unhideWhenUsed="1"/>
+    <w:lsdException w:name="Table Subtle 2" w:semiHidden="1" w:unhideWhenUsed="1"/>
+    <w:lsdException w:name="Table Web 1" w:semiHidden="1" w:unhideWhenUsed="1"/>
+    <w:lsdException w:name="Table Web 2" w:semiHidden="1" w:unhideWhenUsed="1"/>
+    <w:lsdException w:name="Table Web 3" w:semiHidden="1" w:unhideWhenUsed="1"/>
+    <w:lsdException w:name="Table Theme" w:semiHidden="1" w:unhideWhenUsed="1"/>
+    <w:lsdException w:name="Placeholder Text" w:semiHidden="1" w:uiPriority="99"/>
+    <w:lsdException w:name="No Spacing" w:qFormat="1" w:uiPriority="1"/>
+    <w:lsdException w:name="Light Shading" w:uiPriority="60"/>
+    <w:lsdException w:name="Light List" w:uiPriority="61"/>
+    <w:lsdException w:name="Light Grid" w:uiPriority="62"/>
+    <w:lsdException w:name="Medium Shading 1" w:uiPriority="63"/>
+    <w:lsdException w:name="Medium Shading 2" w:uiPriority="64"/>
+    <w:lsdException w:name="Medium List 1" w:uiPriority="65"/>
+    <w:lsdException w:name="Medium List 2" w:uiPriority="66"/>
+    <w:lsdException w:name="Medium Grid 1" w:uiPriority="67"/>
+    <w:lsdException w:name="Medium Grid 2" w:uiPriority="68"/>
+    <w:lsdException w:name="Medium Grid 3" w:uiPriority="69"/>
+    <w:lsdException w:name="Dark List" w:uiPriority="70"/>
+    <w:lsdException w:name="Colorful Shading" w:uiPriority="71"/>
+    <w:lsdException w:name="Colorful List" w:uiPriority="72"/>
+    <w:lsdException w:name="Colorful Grid" w:uiPriority="73"/>
+    <w:lsdException w:name="Light Shading Accent 1" w:uiPriority="60"/>
+    <w:lsdException w:name="Light List Accent 1" w:uiPriority="61"/>
+    <w:lsdException w:name="Light Grid Accent 1" w:uiPriority="62"/>
+    <w:lsdException w:name="Medium Shading 1 Accent 1" w:uiPriority="63"/>
+    <w:lsdException w:name="Medium Shading 2 Accent 1" w:uiPriority="64"/>
+    <w:lsdException w:name="Medium List 1 Accent 1" w:uiPriority="65"/>
+    <w:lsdException w:name="Revision" w:semiHidden="1" w:uiPriority="99"/>
+    <w:lsdException w:name="List Paragraph" w:qFormat="1" w:uiPriority="34"/>
+    <w:lsdException w:name="Quote" w:qFormat="1" w:uiPriority="29"/>
+    <w:lsdException w:name="Intense Quote" w:qFormat="1" w:uiPriority="30"/>
+    <w:lsdException w:name="Medium List 2 Accent 1" w:uiPriority="66"/>
+    <w:lsdException w:name="Medium Grid 1 Accent 1" w:uiPriority="67"/>
+    <w:lsdException w:name="Medium Grid 2 Accent 1" w:uiPriority="68"/>
+    <w:lsdException w:name="Medium Grid 3 Accent 1" w:uiPriority="69"/>
+    <w:lsdException w:name="Dark List Accent 1" w:uiPriority="70"/>
+    <w:lsdException w:name="Colorful Shading Accent 1" w:uiPriority="71"/>
+    <w:lsdException w:name="Colorful List Accent 1" w:uiPriority="72"/>
+    <w:lsdException w:name="Colorful Grid Accent 1" w:uiPriority="73"/>
+    <w:lsdException w:name="Light Shading Accent 2" w:uiPriority="60"/>
+    <w:lsdException w:name="Light List Accent 2" w:uiPriority="61"/>
+    <w:lsdException w:name="Light Grid Accent 2" w:uiPriority="62"/>
+    <w:lsdException w:name="Medium Shading 1 Accent 2" w:uiPriority="63"/>
+    <w:lsdException w:name="Medium Shading 2 Accent 2" w:uiPriority="64"/>
+    <w:lsdException w:name="Medium List 1 Accent 2" w:uiPriority="65"/>
+    <w:lsdException w:name="Medium List 2 Accent 2" w:uiPriority="66"/>
+    <w:lsdException w:name="Medium Grid 1 Accent 2" w:uiPriority="67"/>
+    <w:lsdException w:name="Medium Grid 2 Accent 2" w:uiPriority="68"/>
+    <w:lsdException w:name="Medium Grid 3 Accent 2" w:uiPriority="69"/>
+    <w:lsdException w:name="Dark List Accent 2" w:uiPriority="70"/>
+    <w:lsdException w:name="Colorful Shading Accent 2" w:uiPriority="71"/>
+    <w:lsdException w:name="Colorful List Accent 2" w:uiPriority="72"/>
+    <w:lsdException w:name="Colorful Grid Accent 2" w:uiPriority="73"/>
+    <w:lsdException w:name="Light Shading Accent 3" w:uiPriority="60"/>
+    <w:lsdException w:name="Light List Accent 3" w:uiPriority="61"/>
+    <w:lsdException w:name="Light Grid Accent 3" w:uiPriority="62"/>
+    <w:lsdException w:name="Medium Shading 1 Accent 3" w:uiPriority="63"/>
+    <w:lsdException w:name="Medium Shading 2 Accent 3" w:uiPriority="64"/>
+    <w:lsdException w:name="Medium List 1 Accent 3" w:uiPriority="65"/>
+    <w:lsdException w:name="Medium List 2 Accent 3" w:uiPriority="66"/>
+    <w:lsdException w:name="Medium Grid 1 Accent 3" w:uiPriority="67"/>
+    <w:lsdException w:name="Medium Grid 2 Accent 3" w:uiPriority="68"/>
+    <w:lsdException w:name="Medium Grid 3 Accent 3" w:uiPriority="69"/>
+    <w:lsdException w:name="Dark List Accent 3" w:uiPriority="70"/>
+    <w:lsdException w:name="Colorful Shading Accent 3" w:uiPriority="71"/>
+    <w:lsdException w:name="Colorful List Accent 3" w:uiPriority="72"/>
+    <w:lsdException w:name="Colorful Grid Accent 3" w:uiPriority="73"/>
+    <w:lsdException w:name="Light Shading Accent 4" w:uiPriority="60"/>
+    <w:lsdException w:name="Light List Accent 4" w:uiPriority="61"/>
+    <w:lsdException w:name="Light Grid Accent 4" w:uiPriority="62"/>
+    <w:lsdException w:name="Medium Shading 1 Accent 4" w:uiPriority="63"/>
+    <w:lsdException w:name="Medium Shading 2 Accent 4" w:uiPriority="64"/>
+    <w:lsdException w:name="Medium List 1 Accent 4" w:uiPriority="65"/>
+    <w:lsdException w:name="Medium List 2 Accent 4" w:uiPriority="66"/>
+    <w:lsdException w:name="Medium Grid 1 Accent 4" w:uiPriority="67"/>
+    <w:lsdException w:name="Medium Grid 2 Accent 4" w:uiPriority="68"/>
+    <w:lsdException w:name="Medium Grid 3 Accent 4" w:uiPriority="69"/>
+    <w:lsdException w:name="Dark List Accent 4" w:uiPriority="70"/>
+    <w:lsdException w:name="Colorful Shading Accent 4" w:uiPriority="71"/>
+    <w:lsdException w:name="Colorful List Accent 4" w:uiPriority="72"/>
+    <w:lsdException w:name="Colorful Grid Accent 4" w:uiPriority="73"/>
+    <w:lsdException w:name="Light Shading Accent 5" w:uiPriority="60"/>
+    <w:lsdException w:name="Light List Accent 5" w:uiPriority="61"/>
+    <w:lsdException w:name="Light Grid Accent 5" w:uiPriority="62"/>
+    <w:lsdException w:name="Medium Shading 1 Accent 5" w:uiPriority="63"/>
+    <w:lsdException w:name="Medium Shading 2 Accent 5" w:uiPriority="64"/>
+    <w:lsdException w:name="Medium List 1 Accent 5" w:uiPriority="65"/>
+    <w:lsdException w:name="Medium List 2 Accent 5" w:uiPriority="66"/>
+    <w:lsdException w:name="Medium Grid 1 Accent 5" w:uiPriority="67"/>
+    <w:lsdException w:name="Medium Grid 2 Accent 5" w:uiPriority="68"/>
+    <w:lsdException w:name="Medium Grid 3 Accent 5" w:uiPriority="69"/>
+    <w:lsdException w:name="Dark List Accent 5" w:uiPriority="70"/>
+    <w:lsdException w:name="Colorful Shading Accent 5" w:uiPriority="71"/>
+    <w:lsdException w:name="Colorful List Accent 5" w:uiPriority="72"/>
+    <w:lsdException w:name="Colorful Grid Accent 5" w:uiPriority="73"/>
+    <w:lsdException w:name="Light Shading Accent 6" w:uiPriority="60"/>
+    <w:lsdException w:name="Light List Accent 6" w:uiPriority="61"/>
+    <w:lsdException w:name="Light Grid Accent 6" w:uiPriority="62"/>
+    <w:lsdException w:name="Medium Shading 1 Accent 6" w:uiPriority="63"/>
+    <w:lsdException w:name="Medium Shading 2 Accent 6" w:uiPriority="64"/>
+    <w:lsdException w:name="Medium List 1 Accent 6" w:uiPriority="65"/>
+    <w:lsdException w:name="Medium List 2 Accent 6" w:uiPriority="66"/>
+    <w:lsdException w:name="Medium Grid 1 Accent 6" w:uiPriority="67"/>
+    <w:lsdException w:name="Medium Grid 2 Accent 6" w:uiPriority="68"/>
+    <w:lsdException w:name="Medium Grid 3 Accent 6" w:uiPriority="69"/>
+    <w:lsdException w:name="Dark List Accent 6" w:uiPriority="70"/>
+    <w:lsdException w:name="Colorful Shading Accent 6" w:uiPriority="71"/>
+    <w:lsdException w:name="Colorful List Accent 6" w:uiPriority="72"/>
+    <w:lsdException w:name="Colorful Grid Accent 6" w:uiPriority="73"/>
+    <w:lsdException w:name="Subtle Emphasis" w:qFormat="1" w:uiPriority="19"/>
+    <w:lsdException w:name="Intense Emphasis" w:qFormat="1" w:uiPriority="21"/>
+    <w:lsdException w:name="Subtle Reference" w:qFormat="1" w:uiPriority="31"/>
+    <w:lsdException w:name="Intense Reference" w:qFormat="1" w:uiPriority="32"/>
+    <w:lsdException w:name="Book Title" w:qFormat="1" w:uiPriority="33"/>
+    <w:lsdException w:name="Bibliography" w:semiHidden="1" w:uiPriority="37" w:unhideWhenUsed="1"/>
+    <w:lsdException w:name="TOC Heading" w:qFormat="1" w:semiHidden="1" w:uiPriority="39" w:unhideWhenUsed="1"/>
+    <w:lsdException w:name="Plain Table 1" w:uiPriority="41"/>
+    <w:lsdException w:name="Plain Table 2" w:uiPriority="42"/>
+    <w:lsdException w:name="Plain Table 3" w:uiPriority="43"/>
+    <w:lsdException w:name="Plain Table 4" w:uiPriority="44"/>
+    <w:lsdException w:name="Plain Table 5" w:uiPriority="45"/>
+    <w:lsdException w:name="Grid Table Light" w:uiPriority="40"/>
+    <w:lsdException w:name="Grid Table 1 Light" w:uiPriority="46"/>
+    <w:lsdException w:name="Grid Table 2" w:uiPriority="47"/>
+    <w:lsdException w:name="Grid Table 3" w:uiPriority="48"/>
+    <w:lsdException w:name="Grid Table 4" w:uiPriority="49"/>
+    <w:lsdException w:name="Grid Table 5 Dark" w:uiPriority="50"/>
+    <w:lsdException w:name="Grid Table 6 Colorful" w:uiPriority="51"/>
+    <w:lsdException w:name="Grid Table 7 Colorful" w:uiPriority="52"/>
+    <w:lsdException w:name="Grid Table 1 Light Accent 1" w:uiPriority="46"/>
+    <w:lsdException w:name="Grid Table 2 Accent 1" w:uiPriority="47"/>
+    <w:lsdException w:name="Grid Table 3 Accent 1" w:uiPriority="48"/>
+    <w:lsdException w:name="Grid Table 4 Accent 1" w:uiPriority="49"/>
+    <w:lsdException w:name="Grid Table 5 Dark Accent 1" w:uiPriority="50"/>
+    <w:lsdException w:name="Grid Table 6 Colorful Accent 1" w:uiPriority="51"/>
+    <w:lsdException w:name="Grid Table 7 Colorful Accent 1" w:uiPriority="52"/>
+    <w:lsdException w:name="Grid Table 1 Light Accent 2" w:uiPriority="46"/>
+    <w:lsdException w:name="Grid Table 2 Accent 2" w:uiPriority="47"/>
+    <w:lsdException w:name="Grid Table 3 Accent 2" w:uiPriority="48"/>
+    <w:lsdException w:name="Grid Table 4 Accent 2" w:uiPriority="49"/>
+    <w:lsdException w:name="Grid Table 5 Dark Accent 2" w:uiPriority="50"/>
+    <w:lsdException w:name="Grid Table 6 Colorful Accent 2" w:uiPriority="51"/>
+    <w:lsdException w:name="Grid Table 7 Colorful Accent 2" w:uiPriority="52"/>
+    <w:lsdException w:name="Grid Table 1 Light Accent 3" w:uiPriority="46"/>
+    <w:lsdException w:name="Grid Table 2 Accent 3" w:uiPriority="47"/>
+    <w:lsdException w:name="Grid Table 3 Accent 3" w:uiPriority="48"/>
+    <w:lsdException w:name="Grid Table 4 Accent 3" w:uiPriority="49"/>
+    <w:lsdException w:name="Grid Table 5 Dark Accent 3" w:uiPriority="50"/>
+    <w:lsdException w:name="Grid Table 6 Colorful Accent 3" w:uiPriority="51"/>
+    <w:lsdException w:name="Grid Table 7 Colorful Accent 3" w:uiPriority="52"/>
+    <w:lsdException w:name="Grid Table 1 Light Accent 4" w:uiPriority="46"/>
+    <w:lsdException w:name="Grid Table 2 Accent 4" w:uiPriority="47"/>
+    <w:lsdException w:name="Grid Table 3 Accent 4" w:uiPriority="48"/>
+    <w:lsdException w:name="Grid Table 4 Accent 4" w:uiPriority="49"/>
+    <w:lsdException w:name="Grid Table 5 Dark Accent 4" w:uiPriority="50"/>
+    <w:lsdException w:name="Grid Table 6 Colorful Accent 4" w:uiPriority="51"/>
+    <w:lsdException w:name="Grid Table 7 Colorful Accent 4" w:uiPriority="52"/>
+    <w:lsdException w:name="Grid Table 1 Light Accent 5" w:uiPriority="46"/>
+    <w:lsdException w:name="Grid Table 2 Accent 5" w:uiPriority="47"/>
+    <w:lsdException w:name="Grid Table 3 Accent 5" w:uiPriority="48"/>
+    <w:lsdException w:name="Grid Table 4 Accent 5" w:uiPriority="49"/>
+    <w:lsdException w:name="Grid Table 5 Dark Accent 5" w:uiPriority="50"/>
+    <w:lsdException w:name="Grid Table 6 Colorful Accent 5" w:uiPriority="51"/>
+    <w:lsdException w:name="Grid Table 7 Colorful Accent 5" w:uiPriority="52"/>
+    <w:lsdException w:name="Grid Table 1 Light Accent 6" w:uiPriority="46"/>
+    <w:lsdException w:name="Grid Table 2 Accent 6" w:uiPriority="47"/>
+    <w:lsdException w:name="Grid Table 3 Accent 6" w:uiPriority="48"/>
+    <w:lsdException w:name="Grid Table 4 Accent 6" w:uiPriority="49"/>
+    <w:lsdException w:name="Grid Table 5 Dark Accent 6" w:uiPriority="50"/>
+    <w:lsdException w:name="Grid Table 6 Colorful Accent 6" w:uiPriority="51"/>
+    <w:lsdException w:name="Grid Table 7 Colorful Accent 6" w:uiPriority="52"/>
+    <w:lsdException w:name="List Table 1 Light" w:uiPriority="46"/>
+    <w:lsdException w:name="List Table 2" w:uiPriority="47"/>
+    <w:lsdException w:name="List Table 3" w:uiPriority="48"/>
+    <w:lsdException w:name="List Table 4" w:uiPriority="49"/>
+    <w:lsdException w:name="List Table 5 Dark" w:uiPriority="50"/>
+    <w:lsdException w:name="List Table 6 Colorful" w:uiPriority="51"/>
+    <w:lsdException w:name="List Table 7 Colorful" w:uiPriority="52"/>
+    <w:lsdException w:name="List Table 1 Light Accent 1" w:uiPriority="46"/>
+    <w:lsdException w:name="List Table 2 Accent 1" w:uiPriority="47"/>
+    <w:lsdException w:name="List Table 3 Accent 1" w:uiPriority="48"/>
+    <w:lsdException w:name="List Table 4 Accent 1" w:uiPriority="49"/>
+    <w:lsdException w:name="List Table 5 Dark Accent 1" w:uiPriority="50"/>
+    <w:lsdException w:name="List Table 6 Colorful Accent 1" w:uiPriority="51"/>
+    <w:lsdException w:name="List Table 7 Colorful Accent 1" w:uiPriority="52"/>
+    <w:lsdException w:name="List Table 1 Light Accent 2" w:uiPriority="46"/>
+    <w:lsdException w:name="List Table 2 Accent 2" w:uiPriority="47"/>
+    <w:lsdException w:name="List Table 3 Accent 2" w:uiPriority="48"/>
+    <w:lsdException w:name="List Table 4 Accent 2" w:uiPriority="49"/>
+    <w:lsdException w:name="List Table 5 Dark Accent 2" w:uiPriority="50"/>
+    <w:lsdException w:name="List Table 6 Colorful Accent 2" w:uiPriority="51"/>
+    <w:lsdException w:name="List Table 7 Colorful Accent 2" w:uiPriority="52"/>
+    <w:lsdException w:name="List Table 1 Light Accent 3" w:uiPriority="46"/>
+    <w:lsdException w:name="List Table 2 Accent 3" w:uiPriority="47"/>
+    <w:lsdException w:name="List Table 3 Accent 3" w:uiPriority="48"/>
+    <w:lsdException w:name="List Table 4 Accent 3" w:uiPriority="49"/>
+    <w:lsdException w:name="List Table 5 Dark Accent 3" w:uiPriority="50"/>
+    <w:lsdException w:name="List Table 6 Colorful Accent 3" w:uiPriority="51"/>
+    <w:lsdException w:name="List Table 7 Colorful Accent 3" w:uiPriority="52"/>
+    <w:lsdException w:name="List Table 1 Light Accent 4" w:uiPriority="46"/>
+    <w:lsdException w:name="List Table 2 Accent 4" w:uiPriority="47"/>
+    <w:lsdException w:name="List Table 3 Accent 4" w:uiPriority="48"/>
+    <w:lsdException w:name="List Table 4 Accent 4" w:uiPriority="49"/>
+    <w:lsdException w:name="List Table 5 Dark Accent 4" w:uiPriority="50"/>
+    <w:lsdException w:name="List Table 6 Colorful Accent 4" w:uiPriority="51"/>
+    <w:lsdException w:name="List Table 7 Colorful Accent 4" w:uiPriority="52"/>
+    <w:lsdException w:name="List Table 1 Light Accent 5" w:uiPriority="46"/>
+    <w:lsdException w:name="List Table 2 Accent 5" w:uiPriority="47"/>
+    <w:lsdException w:name="List Table 3 Accent 5" w:uiPriority="48"/>
+    <w:lsdException w:name="List Table 4 Accent 5" w:uiPriority="49"/>
+    <w:lsdException w:name="List Table 5 Dark Accent 5" w:uiPriority="50"/>
+    <w:lsdException w:name="List Table 6 Colorful Accent 5" w:uiPriority="51"/>
+    <w:lsdException w:name="List Table 7 Colorful Accent 5" w:uiPriority="52"/>
+    <w:lsdException w:name="List Table 1 Light Accent 6" w:uiPriority="46"/>
+    <w:lsdException w:name="List Table 2 Accent 6" w:uiPriority="47"/>
+    <w:lsdException w:name="List Table 3 Accent 6" w:uiPriority="48"/>
+    <w:lsdException w:name="List Table 4 Accent 6" w:uiPriority="49"/>
+    <w:lsdException w:name="List Table 5 Dark Accent 6" w:uiPriority="50"/>
+    <w:lsdException w:name="List Table 6 Colorful Accent 6" w:uiPriority="51"/>
+    <w:lsdException w:name="List Table 7 Colorful Accent 6" w:uiPriority="52"/>
+    <w:lsdException w:name="Mention" w:semiHidden="1" w:uiPriority="99" w:unhideWhenUsed="1"/>
+    <w:lsdException w:name="Smart Hyperlink" w:semiHidden="1" w:uiPriority="99" w:unhideWhenUsed="1"/>
+    <w:lsdException w:name="Hashtag" w:semiHidden="1" w:uiPriority="99" w:unhideWhenUsed="1"/>
+    <w:lsdException w:name="Unresolved Mention" w:semiHidden="1" w:uiPriority="99" w:unhideWhenUsed="1"/>
+    <w:lsdException w:name="Smart Link" w:semiHidden="1" w:uiPriority="99" w:unhideWhenUsed="1"/>
+  </w:latentStyles>
+  <w:style w:default="1" w:styleId="Normale" w:type="paragraph">
     <w:name w:val="Normal"/>
     <w:qFormat/>
-    <w:pPr>
-      <w:spacing w:after="120"/>
-      <w:jc w:val="both"/>
-    </w:pPr>
+    <w:rsid w:val="00A42963"/>
     <w:rPr>
-      <w:rFonts w:ascii="Arial Narrow" w:cs="Arial Narrow" w:hAnsi="Arial Narrow"/>
-      <w:color w:val="000000"/>
+      <w:rFonts w:ascii="Arial Narrow" w:hAnsi="Arial Narrow"/>
       <w:sz w:val="22"/>
+      <w:szCs w:val="22"/>
     </w:rPr>
   </w:style>
-  <w:style w:styleId="BodyText" w:type="paragraph">
-    <w:name w:val="Body Text"/>
-    <w:basedOn w:val="Normal"/>
-    <w:link w:val="BodyTextChar"/>
-    <w:pPr>
-      <w:spacing w:after="180" w:before="180"/>
-      <w:jc w:val="both"/>
-    </w:pPr>
-    <w:qFormat/>
-    <w:rPr>
-      <w:rFonts w:ascii="Arial Narrow" w:cs="Arial Narrow" w:hAnsi="Arial Narrow"/>
-      <w:color w:val="000000"/>
-      <w:sz w:val="22"/>
-    </w:rPr>
-  </w:style>
-  <w:style w:customStyle="1" w:styleId="FirstParagraph" w:type="paragraph">
-    <w:name w:val="First Paragraph"/>
-    <w:basedOn w:val="BodyText"/>
-    <w:next w:val="BodyText"/>
-    <w:qFormat/>
-    <w:pPr>
-      <w:jc w:val="both"/>
-    </w:pPr>
-    <w:rPr>
-      <w:rFonts w:ascii="Arial Narrow" w:cs="Arial Narrow" w:hAnsi="Arial Narrow"/>
-      <w:color w:val="000000"/>
-      <w:sz w:val="22"/>
-    </w:rPr>
-  </w:style>
-  <w:style w:customStyle="1" w:styleId="Compact" w:type="paragraph">
-    <w:name w:val="Compact"/>
-    <w:basedOn w:val="BodyText"/>
-    <w:qFormat/>
-    <w:pPr>
-      <w:spacing w:after="36" w:before="36"/>
-      <w:jc w:val="both"/>
-    </w:pPr>
-    <w:rPr>
-      <w:rFonts w:ascii="Arial Narrow" w:cs="Arial Narrow" w:hAnsi="Arial Narrow"/>
-      <w:color w:val="000000"/>
-      <w:sz w:val="22"/>
-    </w:rPr>
-  </w:style>
-  <w:style w:styleId="Title" w:type="paragraph">
-    <w:name w:val="Title"/>
-    <w:basedOn w:val="Normal"/>
-    <w:next w:val="BodyText"/>
-    <w:qFormat/>
-    <w:pPr>
-      <w:keepNext/>
-      <w:keepLines/>
-      <w:spacing w:after="240" w:before="480"/>
-      <w:jc w:val="center"/>
-    </w:pPr>
-    <w:rPr>
-      <w:rFonts w:asciiTheme="majorHAnsi" w:cstheme="majorBidi" w:eastAsiaTheme="majorEastAsia" w:hAnsiTheme="majorHAnsi"/>
-      <w:b/>
-      <w:bCs/>
-      <w:color w:themeColor="accent1" w:themeShade="B5" w:val="345A8A"/>
-      <w:sz w:val="36"/>
-      <w:szCs w:val="36"/>
-    </w:rPr>
-  </w:style>
-  <w:style w:styleId="Subtitle" w:type="paragraph">
-    <w:name w:val="Subtitle"/>
-    <w:basedOn w:val="Title"/>
-    <w:next w:val="BodyText"/>
-    <w:qFormat/>
-    <w:pPr>
-      <w:keepNext/>
-      <w:keepLines/>
-      <w:spacing w:after="240" w:before="240"/>
-      <w:jc w:val="center"/>
-    </w:pPr>
-    <w:rPr>
-      <w:sz w:val="30"/>
-      <w:szCs w:val="30"/>
-    </w:rPr>
-  </w:style>
-  <w:style w:customStyle="1" w:styleId="Author" w:type="paragraph">
-    <w:name w:val="Author"/>
-    <w:next w:val="BodyText"/>
-    <w:qFormat/>
-    <w:pPr>
-      <w:keepNext/>
-      <w:keepLines/>
-      <w:jc w:val="center"/>
-    </w:pPr>
-  </w:style>
-  <w:style w:styleId="Date" w:type="paragraph">
-    <w:name w:val="Date"/>
-    <w:next w:val="BodyText"/>
-    <w:qFormat/>
-    <w:pPr>
-      <w:keepNext/>
-      <w:keepLines/>
-      <w:jc w:val="center"/>
-    </w:pPr>
-  </w:style>
-  <w:style w:customStyle="1" w:styleId="AbstractTitle" w:type="paragraph">
-    <w:name w:val="Abstract Title"/>
-    <w:basedOn w:val="Normal"/>
-    <w:next w:val="Abstract"/>
-    <w:qFormat/>
-    <w:pPr>
-      <w:keepNext/>
-      <w:keepLines/>
-      <w:jc w:val="center"/>
-      <w:spacing w:after="0" w:before="300"/>
-    </w:pPr>
-    <w:rPr>
-      <w:sz w:val="20"/>
-      <w:szCs w:val="20"/>
-      <w:b/>
-      <w:color w:val="345A8A"/>
-      &gt;
-    </w:rPr>
-  </w:style>
-  <w:style w:customStyle="1" w:styleId="Abstract" w:type="paragraph">
-    <w:name w:val="Abstract"/>
-    <w:basedOn w:val="Normal"/>
-    <w:next w:val="BodyText"/>
-    <w:qFormat/>
-    <w:pPr>
-      <w:keepNext/>
-      <w:keepLines/>
-      <w:spacing w:after="300" w:before="100"/>
-    </w:pPr>
-    <w:rPr>
-      <w:sz w:val="20"/>
-      <w:szCs w:val="20"/>
-    </w:rPr>
-  </w:style>
-  <w:style w:styleId="Bibliography" w:type="paragraph">
-    <w:name w:val="Bibliography"/>
-    <w:basedOn w:val="Normal"/>
-    <w:next w:val="Bibliography"/>
-    <w:qFormat/>
-    <w:pPr/>
-    <w:rPr/>
-  </w:style>
-  <w:style w:styleId="Heading1" w:type="paragraph">
-    <w:name w:val="Heading 1"/>
-    <w:basedOn w:val="Normal"/>
-    <w:next w:val="BodyText"/>
-    <w:uiPriority w:val="9"/>
+  <w:style w:styleId="Titolo1" w:type="paragraph">
+    <w:name w:val="heading 1"/>
+    <w:basedOn w:val="Normale"/>
+    <w:next w:val="Normale"/>
     <w:qFormat/>
     <w:pPr>
       <w:keepNext/>
@@ -4746,214 +6647,62 @@
       <w:outlineLvl w:val="0"/>
     </w:pPr>
     <w:rPr>
-      <w:rFonts w:ascii="Times New Roman" w:asciiTheme="majorHAnsi" w:cs="Times New Roman" w:cstheme="majorBidi" w:eastAsiaTheme="majorEastAsia" w:hAnsi="Times New Roman" w:hAnsiTheme="majorHAnsi"/>
+      <w:rFonts w:ascii="Times New Roman" w:hAnsi="Times New Roman"/>
       <w:b/>
-      <w:bCs/>
       <w:color w:val="024C41"/>
       <w:sz w:val="40"/>
-      <w:szCs w:val="32"/>
+      <w:szCs w:val="40"/>
     </w:rPr>
   </w:style>
-  <w:style w:styleId="Heading2" w:type="paragraph">
-    <w:name w:val="Heading 2"/>
-    <w:basedOn w:val="Normal"/>
-    <w:next w:val="BodyText"/>
-    <w:uiPriority w:val="9"/>
-    <w:unhideWhenUsed/>
+  <w:style w:styleId="Titolo2" w:type="paragraph">
+    <w:name w:val="heading 2"/>
+    <w:basedOn w:val="Normale"/>
+    <w:next w:val="Normale"/>
     <w:qFormat/>
     <w:pPr>
       <w:keepNext/>
       <w:keepLines/>
       <w:spacing w:after="120" w:before="240"/>
-      <w:jc w:val="both"/>
       <w:outlineLvl w:val="1"/>
     </w:pPr>
     <w:rPr>
-      <w:rFonts w:ascii="Times New Roman" w:asciiTheme="majorHAnsi" w:cs="Times New Roman" w:cstheme="majorBidi" w:eastAsiaTheme="majorEastAsia" w:hAnsi="Times New Roman" w:hAnsiTheme="majorHAnsi"/>
+      <w:rFonts w:ascii="Times New Roman" w:hAnsi="Times New Roman"/>
       <w:b/>
-      <w:bCs/>
       <w:color w:val="024C41"/>
       <w:sz w:val="32"/>
-      <w:szCs w:val="28"/>
+      <w:szCs w:val="32"/>
     </w:rPr>
   </w:style>
-  <w:style w:styleId="Heading3" w:type="paragraph">
-    <w:name w:val="Heading 3"/>
-    <w:basedOn w:val="Normal"/>
-    <w:next w:val="BodyText"/>
-    <w:uiPriority w:val="9"/>
-    <w:unhideWhenUsed/>
+  <w:style w:styleId="Titolo3" w:type="paragraph">
+    <w:name w:val="heading 3"/>
+    <w:basedOn w:val="Normale"/>
+    <w:next w:val="Normale"/>
     <w:qFormat/>
     <w:pPr>
       <w:keepNext/>
       <w:keepLines/>
       <w:spacing w:after="120" w:before="240"/>
-      <w:jc w:val="both"/>
       <w:outlineLvl w:val="2"/>
     </w:pPr>
     <w:rPr>
-      <w:rFonts w:ascii="Times New Roman" w:asciiTheme="majorHAnsi" w:cs="Times New Roman" w:cstheme="majorBidi" w:eastAsiaTheme="majorEastAsia" w:hAnsi="Times New Roman" w:hAnsiTheme="majorHAnsi"/>
+      <w:rFonts w:ascii="Times New Roman" w:hAnsi="Times New Roman"/>
       <w:b/>
-      <w:bCs/>
       <w:color w:val="024C41"/>
       <w:sz w:val="26"/>
-      <w:szCs w:val="24"/>
+      <w:szCs w:val="26"/>
     </w:rPr>
   </w:style>
-  <w:style w:styleId="Heading4" w:type="paragraph">
-    <w:name w:val="Heading 4"/>
-    <w:basedOn w:val="Normal"/>
-    <w:next w:val="BodyText"/>
-    <w:uiPriority w:val="9"/>
-    <w:unhideWhenUsed/>
-    <w:qFormat/>
-    <w:pPr>
-      <w:keepNext/>
-      <w:keepLines/>
-      <w:spacing w:after="0" w:before="200"/>
-      <w:outlineLvl w:val="3"/>
-    </w:pPr>
-    <w:rPr>
-      <w:rFonts w:asciiTheme="majorHAnsi" w:cstheme="majorBidi" w:eastAsiaTheme="majorEastAsia" w:hAnsiTheme="majorHAnsi"/>
-      <w:i/>
-      <w:bCs/>
-      <w:color w:themeColor="accent1" w:val="4F81BD"/>
-      <w:sz w:val="24"/>
-      <w:szCs w:val="24"/>
-    </w:rPr>
-  </w:style>
-  <w:style w:styleId="Heading5" w:type="paragraph">
-    <w:name w:val="Heading 5"/>
-    <w:basedOn w:val="Normal"/>
-    <w:next w:val="BodyText"/>
-    <w:uiPriority w:val="9"/>
-    <w:unhideWhenUsed/>
-    <w:qFormat/>
-    <w:pPr>
-      <w:keepNext/>
-      <w:keepLines/>
-      <w:spacing w:after="0" w:before="200"/>
-      <w:outlineLvl w:val="4"/>
-    </w:pPr>
-    <w:rPr>
-      <w:rFonts w:asciiTheme="majorHAnsi" w:cstheme="majorBidi" w:eastAsiaTheme="majorEastAsia" w:hAnsiTheme="majorHAnsi"/>
-      <w:iCs/>
-      <w:color w:themeColor="accent1" w:val="4F81BD"/>
-      <w:sz w:val="24"/>
-      <w:szCs w:val="24"/>
-    </w:rPr>
-  </w:style>
-  <w:style w:styleId="Heading6" w:type="paragraph">
-    <w:name w:val="Heading 6"/>
-    <w:basedOn w:val="Normal"/>
-    <w:next w:val="BodyText"/>
-    <w:uiPriority w:val="9"/>
-    <w:unhideWhenUsed/>
-    <w:qFormat/>
-    <w:pPr>
-      <w:keepNext/>
-      <w:keepLines/>
-      <w:spacing w:after="0" w:before="200"/>
-      <w:outlineLvl w:val="5"/>
-    </w:pPr>
-    <w:rPr>
-      <w:rFonts w:asciiTheme="majorHAnsi" w:cstheme="majorBidi" w:eastAsiaTheme="majorEastAsia" w:hAnsiTheme="majorHAnsi"/>
-      <w:color w:themeColor="accent1" w:val="4F81BD"/>
-      <w:sz w:val="24"/>
-      <w:szCs w:val="24"/>
-    </w:rPr>
-  </w:style>
-  <w:style w:styleId="Heading7" w:type="paragraph">
-    <w:name w:val="Heading 7"/>
-    <w:basedOn w:val="Normal"/>
-    <w:next w:val="BodyText"/>
-    <w:uiPriority w:val="9"/>
-    <w:unhideWhenUsed/>
-    <w:qFormat/>
-    <w:pPr>
-      <w:keepNext/>
-      <w:keepLines/>
-      <w:spacing w:after="0" w:before="200"/>
-      <w:outlineLvl w:val="6"/>
-    </w:pPr>
-    <w:rPr>
-      <w:rFonts w:asciiTheme="majorHAnsi" w:cstheme="majorBidi" w:eastAsiaTheme="majorEastAsia" w:hAnsiTheme="majorHAnsi"/>
-      <w:color w:themeColor="accent1" w:val="4F81BD"/>
-      <w:sz w:val="24"/>
-      <w:szCs w:val="24"/>
-    </w:rPr>
-  </w:style>
-  <w:style w:styleId="Heading8" w:type="paragraph">
-    <w:name w:val="Heading 8"/>
-    <w:basedOn w:val="Normal"/>
-    <w:next w:val="BodyText"/>
-    <w:uiPriority w:val="9"/>
-    <w:unhideWhenUsed/>
-    <w:qFormat/>
-    <w:pPr>
-      <w:keepNext/>
-      <w:keepLines/>
-      <w:spacing w:after="0" w:before="200"/>
-      <w:outlineLvl w:val="7"/>
-    </w:pPr>
-    <w:rPr>
-      <w:rFonts w:asciiTheme="majorHAnsi" w:cstheme="majorBidi" w:eastAsiaTheme="majorEastAsia" w:hAnsiTheme="majorHAnsi"/>
-      <w:color w:themeColor="accent1" w:val="4F81BD"/>
-      <w:sz w:val="24"/>
-      <w:szCs w:val="24"/>
-    </w:rPr>
-  </w:style>
-  <w:style w:styleId="Heading9" w:type="paragraph">
-    <w:name w:val="Heading 9"/>
-    <w:basedOn w:val="Normal"/>
-    <w:next w:val="BodyText"/>
-    <w:uiPriority w:val="9"/>
-    <w:unhideWhenUsed/>
-    <w:qFormat/>
-    <w:pPr>
-      <w:keepNext/>
-      <w:keepLines/>
-      <w:spacing w:after="0" w:before="200"/>
-      <w:outlineLvl w:val="8"/>
-    </w:pPr>
-    <w:rPr>
-      <w:rFonts w:asciiTheme="majorHAnsi" w:cstheme="majorBidi" w:eastAsiaTheme="majorEastAsia" w:hAnsiTheme="majorHAnsi"/>
-      <w:color w:themeColor="accent1" w:val="4F81BD"/>
-      <w:sz w:val="24"/>
-      <w:szCs w:val="24"/>
-    </w:rPr>
-  </w:style>
-  <w:style w:styleId="BlockText" w:type="paragraph">
-    <w:name w:val="Block Text"/>
-    <w:basedOn w:val="BodyText"/>
-    <w:next w:val="BodyText"/>
-    <w:uiPriority w:val="9"/>
-    <w:unhideWhenUsed/>
-    <w:qFormat/>
-    <w:pPr>
-      <w:spacing w:after="100" w:before="100"/>
-      <w:ind w:firstLine="0" w:left="480" w:right="480"/>
-    </w:pPr>
-  </w:style>
-  <w:style w:styleId="FootnoteText" w:type="paragraph">
-    <w:name w:val="Footnote Text"/>
-    <w:basedOn w:val="Normal"/>
-    <w:next w:val="FootnoteText"/>
-    <w:uiPriority w:val="9"/>
-    <w:unhideWhenUsed/>
-    <w:qFormat/>
-  </w:style>
-  <w:style w:default="1" w:styleId="DefaultParagraphFont" w:type="character">
+  <w:style w:default="1" w:styleId="Carpredefinitoparagrafo" w:type="character">
     <w:name w:val="Default Paragraph Font"/>
+    <w:uiPriority w:val="1"/>
     <w:semiHidden/>
     <w:unhideWhenUsed/>
   </w:style>
-  <w:style w:default="1" w:styleId="Table" w:type="table">
-    <w:name w:val="Table"/>
-    <w:basedOn w:val="TableNormal"/>
+  <w:style w:default="1" w:styleId="Tabellanormale" w:type="table">
+    <w:name w:val="Normal Table"/>
+    <w:uiPriority w:val="99"/>
     <w:semiHidden/>
     <w:unhideWhenUsed/>
-    <w:qFormat/>
     <w:tblPr>
       <w:tblInd w:type="dxa" w:w="0"/>
       <w:tblCellMar>
@@ -4963,360 +6712,448 @@
         <w:right w:type="dxa" w:w="108"/>
       </w:tblCellMar>
     </w:tblPr>
-    <w:tblStylePr w:type="firstRow">
-      <w:tblPr>
-        <w:jc w:val="left"/>
-        <w:tblInd w:type="dxa" w:w="0"/>
-      </w:tblPr>
-      <w:trPr>
-        <w:jc w:val="left"/>
-      </w:trPr>
-      <w:tcPr>
-        <w:vAlign w:val="bottom"/>
-        <w:tcBorders>
-          <w:bottom w:val="single"/>
-        </w:tcBorders>
-      </w:tcPr>
-    </w:tblStylePr>
   </w:style>
-  <w:style w:customStyle="1" w:styleId="DefinitionTerm" w:type="paragraph">
-    <w:name w:val="Definition Term"/>
-    <w:basedOn w:val="Normal"/>
-    <w:next w:val="Definition"/>
+  <w:style w:default="1" w:styleId="Nessunelenco" w:type="numbering">
+    <w:name w:val="No List"/>
+    <w:uiPriority w:val="99"/>
+    <w:semiHidden/>
+    <w:unhideWhenUsed/>
+  </w:style>
+  <w:style w:styleId="Intestazione" w:type="paragraph">
+    <w:name w:val="header"/>
+    <w:basedOn w:val="Normale"/>
+    <w:rsid w:val="0083544C"/>
     <w:pPr>
-      <w:keepNext/>
-      <w:keepLines/>
-      <w:spacing w:after="0"/>
+      <w:tabs>
+        <w:tab w:pos="4819" w:val="center"/>
+        <w:tab w:pos="9638" w:val="right"/>
+      </w:tabs>
+    </w:pPr>
+  </w:style>
+  <w:style w:styleId="Pidipagina" w:type="paragraph">
+    <w:name w:val="footer"/>
+    <w:basedOn w:val="Normale"/>
+    <w:link w:val="PidipaginaCarattere"/>
+    <w:uiPriority w:val="99"/>
+    <w:rsid w:val="0083544C"/>
+    <w:pPr>
+      <w:tabs>
+        <w:tab w:pos="4819" w:val="center"/>
+        <w:tab w:pos="9638" w:val="right"/>
+      </w:tabs>
+    </w:pPr>
+  </w:style>
+  <w:style w:styleId="Collegamentoipertestuale" w:type="character">
+    <w:name w:val="Hyperlink"/>
+    <w:basedOn w:val="Carpredefinitoparagrafo"/>
+    <w:rsid w:val="00383873"/>
+    <w:rPr>
+      <w:color w:val="0000FF"/>
+      <w:u w:val="single"/>
+    </w:rPr>
+  </w:style>
+  <w:style w:customStyle="1" w:styleId="cIndirizzo" w:type="paragraph">
+    <w:name w:val="cIndirizzo"/>
+    <w:basedOn w:val="Normale"/>
+    <w:next w:val="Normale"/>
+    <w:rsid w:val="00893C53"/>
+    <w:pPr>
+      <w:ind w:left="6804"/>
+    </w:pPr>
+  </w:style>
+  <w:style w:customStyle="1" w:styleId="cCorteseAttenzione" w:type="paragraph">
+    <w:name w:val="cCorteseAttenzione"/>
+    <w:basedOn w:val="Normale"/>
+    <w:next w:val="cIndirizzo"/>
+    <w:rsid w:val="00893C53"/>
+    <w:pPr>
+      <w:ind w:left="6804"/>
+    </w:pPr>
+    <w:rPr>
+      <w:i/>
+    </w:rPr>
+  </w:style>
+  <w:style w:customStyle="1" w:styleId="cRagioneSociale" w:type="paragraph">
+    <w:name w:val="cRagioneSociale"/>
+    <w:basedOn w:val="Normale"/>
+    <w:next w:val="cCorteseAttenzione"/>
+    <w:rsid w:val="00E14603"/>
+    <w:pPr>
+      <w:spacing w:before="480"/>
+      <w:ind w:left="6804"/>
     </w:pPr>
     <w:rPr>
       <w:b/>
     </w:rPr>
   </w:style>
-  <w:style w:customStyle="1" w:styleId="Definition" w:type="paragraph">
-    <w:name w:val="Definition"/>
-    <w:basedOn w:val="Normal"/>
+  <w:style w:customStyle="1" w:styleId="cOggetto" w:type="paragraph">
+    <w:name w:val="cOggetto"/>
+    <w:basedOn w:val="Normale"/>
+    <w:next w:val="Normale"/>
+    <w:rsid w:val="00893C53"/>
+    <w:pPr>
+      <w:spacing w:after="360" w:before="480"/>
+    </w:pPr>
   </w:style>
-  <w:style w:styleId="Caption" w:type="paragraph">
-    <w:name w:val="Caption"/>
-    <w:basedOn w:val="Normal"/>
-    <w:link w:val="BodyTextChar"/>
+  <w:style w:customStyle="1" w:styleId="cElencoPuntato" w:type="paragraph">
+    <w:name w:val="cElencoPuntato"/>
+    <w:basedOn w:val="Normale"/>
+    <w:rsid w:val="00893C53"/>
     <w:pPr>
-      <w:spacing w:after="120" w:before="0"/>
+      <w:numPr>
+        <w:numId w:val="1"/>
+      </w:numPr>
+      <w:tabs>
+        <w:tab w:pos="720" w:val="clear"/>
+        <w:tab w:pos="360" w:val="num"/>
+      </w:tabs>
+      <w:ind w:hanging="180" w:left="360"/>
+    </w:pPr>
+  </w:style>
+  <w:style w:customStyle="1" w:styleId="cElencoNumerato" w:type="paragraph">
+    <w:name w:val="cElencoNumerato"/>
+    <w:basedOn w:val="Normale"/>
+    <w:rsid w:val="00893C53"/>
+    <w:pPr>
+      <w:numPr>
+        <w:ilvl w:val="1"/>
+        <w:numId w:val="1"/>
+      </w:numPr>
+      <w:tabs>
+        <w:tab w:pos="1440" w:val="clear"/>
+        <w:tab w:pos="360" w:val="num"/>
+      </w:tabs>
+      <w:ind w:hanging="180" w:left="360"/>
+    </w:pPr>
+  </w:style>
+  <w:style w:customStyle="1" w:styleId="cSaluto" w:type="paragraph">
+    <w:name w:val="cSaluto"/>
+    <w:basedOn w:val="Normale"/>
+    <w:next w:val="Normale"/>
+    <w:rsid w:val="00DE103F"/>
+    <w:pPr>
+      <w:spacing w:after="120"/>
     </w:pPr>
     <w:rPr>
       <w:i/>
     </w:rPr>
   </w:style>
-  <w:style w:customStyle="1" w:styleId="TableCaption" w:type="paragraph">
-    <w:name w:val="Table Caption"/>
-    <w:basedOn w:val="Caption"/>
+  <w:style w:customStyle="1" w:styleId="cFunzioneFirmatario" w:type="paragraph">
+    <w:name w:val="cFunzioneFirmatario"/>
+    <w:basedOn w:val="Normale"/>
+    <w:next w:val="Normale"/>
+    <w:rsid w:val="00D00B54"/>
     <w:pPr>
-      <w:keepNext/>
+      <w:ind w:left="6804"/>
+    </w:pPr>
+    <w:rPr>
+      <w:i/>
+    </w:rPr>
+  </w:style>
+  <w:style w:customStyle="1" w:styleId="cFirmatario" w:type="paragraph">
+    <w:name w:val="cFirmatario"/>
+    <w:basedOn w:val="Normale"/>
+    <w:next w:val="cFunzioneFirmatario"/>
+    <w:rsid w:val="00D00B54"/>
+    <w:pPr>
+      <w:spacing w:before="480"/>
+      <w:ind w:left="6804"/>
     </w:pPr>
   </w:style>
-  <w:style w:customStyle="1" w:styleId="ImageCaption" w:type="paragraph">
-    <w:name w:val="Image Caption"/>
-    <w:basedOn w:val="Caption"/>
+  <w:style w:styleId="Grigliatabella" w:type="table">
+    <w:name w:val="Table Grid"/>
+    <w:basedOn w:val="Tabellanormale"/>
+    <w:rsid w:val="00B751DC"/>
+    <w:tblPr>
+      <w:tblBorders>
+        <w:top w:color="auto" w:space="0" w:sz="4" w:val="single"/>
+        <w:left w:color="auto" w:space="0" w:sz="4" w:val="single"/>
+        <w:bottom w:color="auto" w:space="0" w:sz="4" w:val="single"/>
+        <w:right w:color="auto" w:space="0" w:sz="4" w:val="single"/>
+        <w:insideH w:color="auto" w:space="0" w:sz="4" w:val="single"/>
+        <w:insideV w:color="auto" w:space="0" w:sz="4" w:val="single"/>
+      </w:tblBorders>
+    </w:tblPr>
   </w:style>
-  <w:style w:customStyle="1" w:styleId="Figure" w:type="paragraph">
-    <w:name w:val="Figure"/>
-    <w:basedOn w:val="Normal"/>
+  <w:style w:styleId="Numeropagina" w:type="character">
+    <w:name w:val="page number"/>
+    <w:basedOn w:val="Carpredefinitoparagrafo"/>
+    <w:rsid w:val="00B751DC"/>
   </w:style>
-  <w:style w:customStyle="1" w:styleId="CaptionedFigure" w:type="paragraph">
-    <w:name w:val="Captioned Figure"/>
-    <w:basedOn w:val="Figure"/>
+  <w:style w:styleId="Paragrafoelenco" w:type="paragraph">
+    <w:name w:val="List Paragraph"/>
+    <w:basedOn w:val="Normale"/>
+    <w:uiPriority w:val="34"/>
+    <w:qFormat/>
+    <w:rsid w:val="00CA6DE6"/>
     <w:pPr>
-      <w:keepNext/>
+      <w:ind w:left="720"/>
+      <w:contextualSpacing/>
     </w:pPr>
   </w:style>
-  <w:style w:customStyle="1" w:styleId="BodyTextChar" w:type="character">
-    <w:name w:val="Body Text Char"/>
-    <w:basedOn w:val="DefaultParagraphFont"/>
-    <w:link w:val="BodyText"/>
-  </w:style>
-  <w:style w:customStyle="1" w:styleId="VerbatimChar" w:type="character">
-    <w:name w:val="Verbatim Char"/>
-    <w:basedOn w:val="BodyTextChar"/>
+  <w:style w:customStyle="1" w:styleId="PidipaginaCarattere" w:type="character">
+    <w:name w:val="Piè di pagina Carattere"/>
+    <w:basedOn w:val="Carpredefinitoparagrafo"/>
+    <w:link w:val="Pidipagina"/>
+    <w:uiPriority w:val="99"/>
+    <w:rsid w:val="00370626"/>
     <w:rPr>
-      <w:rFonts w:ascii="Consolas" w:hAnsi="Consolas"/>
+      <w:rFonts w:ascii="Arial Narrow" w:hAnsi="Arial Narrow"/>
       <w:sz w:val="22"/>
+      <w:szCs w:val="22"/>
     </w:rPr>
   </w:style>
-  <w:style w:customStyle="1" w:styleId="SectionNumber" w:type="character">
-    <w:name w:val="Section Number"/>
-    <w:basedOn w:val="BodyTextChar"/>
-  </w:style>
-  <w:style w:styleId="FootnoteReference" w:type="character">
-    <w:name w:val="Footnote Reference"/>
-    <w:basedOn w:val="BodyTextChar"/>
+  <w:style w:styleId="Collegamentovisitato" w:type="character">
+    <w:name w:val="FollowedHyperlink"/>
+    <w:basedOn w:val="Carpredefinitoparagrafo"/>
+    <w:rsid w:val="00F560E0"/>
     <w:rPr>
-      <w:vertAlign w:val="superscript"/>
+      <w:color w:themeColor="followedHyperlink" w:val="954F72"/>
+      <w:u w:val="single"/>
     </w:rPr>
   </w:style>
-  <w:style w:styleId="Hyperlink" w:type="character">
-    <w:name w:val="Hyperlink"/>
-    <w:basedOn w:val="BodyTextChar"/>
+  <w:style w:styleId="Didascalia" w:type="paragraph">
+    <w:name w:val="caption"/>
+    <w:basedOn w:val="Normale"/>
+    <w:qFormat/>
+    <w:pPr>
+      <w:spacing w:after="180" w:before="60"/>
+    </w:pPr>
     <w:rPr>
-      <w:color w:themeColor="accent1" w:val="4F81BD"/>
+      <w:rFonts w:ascii="Times New Roman" w:hAnsi="Times New Roman"/>
+      <w:i/>
+      <w:color w:val="404040"/>
+      <w:sz w:val="18"/>
+      <w:szCs w:val="18"/>
     </w:rPr>
   </w:style>
-  <w:style w:styleId="TOCHeading" w:type="paragraph">
-    <w:name w:val="TOC Heading"/>
-    <w:basedOn w:val="Heading1"/>
-    <w:next w:val="BodyText"/>
-    <w:uiPriority w:val="39"/>
-    <w:unhideWhenUsed/>
-    <w:qFormat/>
+  <w:style w:customStyle="1" w:styleId="Table" w:type="table">
+    <w:name w:val="Table"/>
+    <w:basedOn w:val="Tabellanormale"/>
+    <w:tblPr>
+      <w:tblBorders>
+        <w:top w:color="7F7F7F" w:space="0" w:sz="4" w:val="single"/>
+        <w:left w:color="7F7F7F" w:space="0" w:sz="4" w:val="single"/>
+        <w:bottom w:color="7F7F7F" w:space="0" w:sz="4" w:val="single"/>
+        <w:right w:color="7F7F7F" w:space="0" w:sz="4" w:val="single"/>
+        <w:insideH w:color="7F7F7F" w:space="0" w:sz="4" w:val="single"/>
+        <w:insideV w:color="7F7F7F" w:space="0" w:sz="4" w:val="single"/>
+      </w:tblBorders>
+    </w:tblPr>
+    <w:tblStylePr w:type="firstRow">
+      <w:rPr>
+        <w:b/>
+        <w:color w:val="FFFFFF"/>
+      </w:rPr>
+      <w:tblPr/>
+      <w:tcPr>
+        <w:shd w:color="auto" w:fill="0B5A3C" w:val="clear"/>
+      </w:tcPr>
+    </w:tblStylePr>
+  </w:style>
+  <w:style w:customStyle="1" w:styleId="SourceCode" w:type="paragraph">
+    <w:name w:val="Source Code"/>
     <w:pPr>
-      <w:spacing w:before="240" w:line="259" w:lineRule="auto"/>
-      <w:outlineLvl w:val="9"/>
+      <w:wordWrap w:val="0"/>
     </w:pPr>
+  </w:style>
+  <w:style w:customStyle="1" w:styleId="KeywordTok" w:type="character">
+    <w:name w:val="KeywordTok"/>
     <w:rPr>
-      <w:rFonts w:asciiTheme="majorHAnsi" w:cstheme="majorBidi" w:eastAsiaTheme="majorEastAsia" w:hAnsiTheme="majorHAnsi"/>
-      <w:b w:val="0"/>
-      <w:bCs w:val="0"/>
-      <w:color w:themeColor="accent1" w:themeShade="BF" w:val="365F91"/>
+      <w:b/>
+      <w:color w:val="007020"/>
     </w:rPr>
   </w:style>
-  <w:style w:type="paragraph" w:customStyle="1" w:styleId="SourceCode">
-    <w:name w:val="Source Code"/>
-    <w:basedOn w:val="Normal"/>
-    <w:link w:val="VerbatimChar"/>
-    <w:pPr>
-      <w:wordWrap w:val="off"/>
-    </w:pPr>
-  </w:style>
-  <w:style w:type="character" w:customStyle="1" w:styleId="KeywordTok">
-    <w:name w:val="KeywordTok"/>
-    <w:basedOn w:val="VerbatimChar"/>
-    <w:rPr>
-      <w:color w:val="007020"/>
-      <w:b/>
-    </w:rPr>
-  </w:style>
-  <w:style w:type="character" w:customStyle="1" w:styleId="DataTypeTok">
+  <w:style w:customStyle="1" w:styleId="DataTypeTok" w:type="character">
     <w:name w:val="DataTypeTok"/>
-    <w:basedOn w:val="VerbatimChar"/>
     <w:rPr>
       <w:color w:val="902000"/>
     </w:rPr>
   </w:style>
-  <w:style w:type="character" w:customStyle="1" w:styleId="DecValTok">
+  <w:style w:customStyle="1" w:styleId="DecValTok" w:type="character">
     <w:name w:val="DecValTok"/>
-    <w:basedOn w:val="VerbatimChar"/>
     <w:rPr>
-      <w:color w:val="40a070"/>
+      <w:color w:val="40A070"/>
     </w:rPr>
   </w:style>
-  <w:style w:type="character" w:customStyle="1" w:styleId="BaseNTok">
+  <w:style w:customStyle="1" w:styleId="BaseNTok" w:type="character">
     <w:name w:val="BaseNTok"/>
-    <w:basedOn w:val="VerbatimChar"/>
     <w:rPr>
-      <w:color w:val="40a070"/>
+      <w:color w:val="40A070"/>
     </w:rPr>
   </w:style>
-  <w:style w:type="character" w:customStyle="1" w:styleId="FloatTok">
+  <w:style w:customStyle="1" w:styleId="FloatTok" w:type="character">
     <w:name w:val="FloatTok"/>
-    <w:basedOn w:val="VerbatimChar"/>
     <w:rPr>
-      <w:color w:val="40a070"/>
+      <w:color w:val="40A070"/>
     </w:rPr>
   </w:style>
-  <w:style w:type="character" w:customStyle="1" w:styleId="ConstantTok">
+  <w:style w:customStyle="1" w:styleId="ConstantTok" w:type="character">
     <w:name w:val="ConstantTok"/>
-    <w:basedOn w:val="VerbatimChar"/>
     <w:rPr>
       <w:color w:val="880000"/>
     </w:rPr>
   </w:style>
-  <w:style w:type="character" w:customStyle="1" w:styleId="CharTok">
+  <w:style w:customStyle="1" w:styleId="CharTok" w:type="character">
     <w:name w:val="CharTok"/>
-    <w:basedOn w:val="VerbatimChar"/>
     <w:rPr>
-      <w:color w:val="4070a0"/>
+      <w:color w:val="4070A0"/>
     </w:rPr>
   </w:style>
-  <w:style w:type="character" w:customStyle="1" w:styleId="SpecialCharTok">
+  <w:style w:customStyle="1" w:styleId="SpecialCharTok" w:type="character">
     <w:name w:val="SpecialCharTok"/>
-    <w:basedOn w:val="VerbatimChar"/>
     <w:rPr>
-      <w:color w:val="4070a0"/>
+      <w:color w:val="4070A0"/>
     </w:rPr>
   </w:style>
-  <w:style w:type="character" w:customStyle="1" w:styleId="StringTok">
+  <w:style w:customStyle="1" w:styleId="StringTok" w:type="character">
     <w:name w:val="StringTok"/>
-    <w:basedOn w:val="VerbatimChar"/>
     <w:rPr>
-      <w:color w:val="4070a0"/>
+      <w:color w:val="4070A0"/>
     </w:rPr>
   </w:style>
-  <w:style w:type="character" w:customStyle="1" w:styleId="VerbatimStringTok">
+  <w:style w:customStyle="1" w:styleId="VerbatimStringTok" w:type="character">
     <w:name w:val="VerbatimStringTok"/>
-    <w:basedOn w:val="VerbatimChar"/>
     <w:rPr>
-      <w:color w:val="4070a0"/>
+      <w:color w:val="4070A0"/>
     </w:rPr>
   </w:style>
-  <w:style w:type="character" w:customStyle="1" w:styleId="SpecialStringTok">
+  <w:style w:customStyle="1" w:styleId="SpecialStringTok" w:type="character">
     <w:name w:val="SpecialStringTok"/>
-    <w:basedOn w:val="VerbatimChar"/>
     <w:rPr>
-      <w:color w:val="bb6688"/>
+      <w:color w:val="BB6688"/>
     </w:rPr>
   </w:style>
-  <w:style w:type="character" w:customStyle="1" w:styleId="ImportTok">
+  <w:style w:customStyle="1" w:styleId="ImportTok" w:type="character">
     <w:name w:val="ImportTok"/>
-    <w:basedOn w:val="VerbatimChar"/>
     <w:rPr>
+      <w:b/>
       <w:color w:val="008000"/>
-      <w:b/>
     </w:rPr>
   </w:style>
-  <w:style w:type="character" w:customStyle="1" w:styleId="CommentTok">
+  <w:style w:customStyle="1" w:styleId="CommentTok" w:type="character">
     <w:name w:val="CommentTok"/>
-    <w:basedOn w:val="VerbatimChar"/>
     <w:rPr>
-      <w:color w:val="60a0b0"/>
       <w:i/>
+      <w:color w:val="60A0B0"/>
     </w:rPr>
   </w:style>
-  <w:style w:type="character" w:customStyle="1" w:styleId="DocumentationTok">
+  <w:style w:customStyle="1" w:styleId="DocumentationTok" w:type="character">
     <w:name w:val="DocumentationTok"/>
-    <w:basedOn w:val="VerbatimChar"/>
     <w:rPr>
-      <w:color w:val="ba2121"/>
       <w:i/>
+      <w:color w:val="BA2121"/>
     </w:rPr>
   </w:style>
-  <w:style w:type="character" w:customStyle="1" w:styleId="AnnotationTok">
+  <w:style w:customStyle="1" w:styleId="AnnotationTok" w:type="character">
     <w:name w:val="AnnotationTok"/>
-    <w:basedOn w:val="VerbatimChar"/>
     <w:rPr>
-      <w:color w:val="60a0b0"/>
       <w:b/>
       <w:i/>
+      <w:color w:val="60A0B0"/>
     </w:rPr>
   </w:style>
-  <w:style w:type="character" w:customStyle="1" w:styleId="CommentVarTok">
+  <w:style w:customStyle="1" w:styleId="CommentVarTok" w:type="character">
     <w:name w:val="CommentVarTok"/>
-    <w:basedOn w:val="VerbatimChar"/>
     <w:rPr>
-      <w:color w:val="60a0b0"/>
       <w:b/>
       <w:i/>
+      <w:color w:val="60A0B0"/>
     </w:rPr>
   </w:style>
-  <w:style w:type="character" w:customStyle="1" w:styleId="OtherTok">
+  <w:style w:customStyle="1" w:styleId="OtherTok" w:type="character">
     <w:name w:val="OtherTok"/>
-    <w:basedOn w:val="VerbatimChar"/>
     <w:rPr>
       <w:color w:val="007020"/>
     </w:rPr>
   </w:style>
-  <w:style w:type="character" w:customStyle="1" w:styleId="FunctionTok">
+  <w:style w:customStyle="1" w:styleId="FunctionTok" w:type="character">
     <w:name w:val="FunctionTok"/>
-    <w:basedOn w:val="VerbatimChar"/>
     <w:rPr>
-      <w:color w:val="06287e"/>
+      <w:color w:val="06287E"/>
     </w:rPr>
   </w:style>
-  <w:style w:type="character" w:customStyle="1" w:styleId="VariableTok">
+  <w:style w:customStyle="1" w:styleId="VariableTok" w:type="character">
     <w:name w:val="VariableTok"/>
-    <w:basedOn w:val="VerbatimChar"/>
     <w:rPr>
-      <w:color w:val="19177c"/>
+      <w:color w:val="19177C"/>
     </w:rPr>
   </w:style>
-  <w:style w:type="character" w:customStyle="1" w:styleId="ControlFlowTok">
+  <w:style w:customStyle="1" w:styleId="ControlFlowTok" w:type="character">
     <w:name w:val="ControlFlowTok"/>
-    <w:basedOn w:val="VerbatimChar"/>
     <w:rPr>
+      <w:b/>
       <w:color w:val="007020"/>
-      <w:b/>
     </w:rPr>
   </w:style>
-  <w:style w:type="character" w:customStyle="1" w:styleId="OperatorTok">
+  <w:style w:customStyle="1" w:styleId="OperatorTok" w:type="character">
     <w:name w:val="OperatorTok"/>
-    <w:basedOn w:val="VerbatimChar"/>
     <w:rPr>
       <w:color w:val="666666"/>
     </w:rPr>
   </w:style>
-  <w:style w:type="character" w:customStyle="1" w:styleId="BuiltInTok">
+  <w:style w:customStyle="1" w:styleId="BuiltInTok" w:type="character">
     <w:name w:val="BuiltInTok"/>
-    <w:basedOn w:val="VerbatimChar"/>
     <w:rPr>
       <w:color w:val="008000"/>
     </w:rPr>
   </w:style>
-  <w:style w:type="character" w:customStyle="1" w:styleId="ExtensionTok">
+  <w:style w:customStyle="1" w:styleId="ExtensionTok" w:type="character">
     <w:name w:val="ExtensionTok"/>
-    <w:basedOn w:val="VerbatimChar"/>
-    <w:rPr/>
   </w:style>
-  <w:style w:type="character" w:customStyle="1" w:styleId="PreprocessorTok">
+  <w:style w:customStyle="1" w:styleId="PreprocessorTok" w:type="character">
     <w:name w:val="PreprocessorTok"/>
-    <w:basedOn w:val="VerbatimChar"/>
     <w:rPr>
-      <w:color w:val="bc7a00"/>
+      <w:color w:val="BC7A00"/>
     </w:rPr>
   </w:style>
-  <w:style w:type="character" w:customStyle="1" w:styleId="AttributeTok">
+  <w:style w:customStyle="1" w:styleId="AttributeTok" w:type="character">
     <w:name w:val="AttributeTok"/>
-    <w:basedOn w:val="VerbatimChar"/>
     <w:rPr>
-      <w:color w:val="7d9029"/>
+      <w:color w:val="7D9029"/>
     </w:rPr>
   </w:style>
-  <w:style w:type="character" w:customStyle="1" w:styleId="RegionMarkerTok">
+  <w:style w:customStyle="1" w:styleId="RegionMarkerTok" w:type="character">
     <w:name w:val="RegionMarkerTok"/>
-    <w:basedOn w:val="VerbatimChar"/>
-    <w:rPr/>
   </w:style>
-  <w:style w:type="character" w:customStyle="1" w:styleId="InformationTok">
+  <w:style w:customStyle="1" w:styleId="InformationTok" w:type="character">
     <w:name w:val="InformationTok"/>
-    <w:basedOn w:val="VerbatimChar"/>
     <w:rPr>
-      <w:color w:val="60a0b0"/>
       <w:b/>
       <w:i/>
+      <w:color w:val="60A0B0"/>
     </w:rPr>
   </w:style>
-  <w:style w:type="character" w:customStyle="1" w:styleId="WarningTok">
+  <w:style w:customStyle="1" w:styleId="WarningTok" w:type="character">
     <w:name w:val="WarningTok"/>
-    <w:basedOn w:val="VerbatimChar"/>
     <w:rPr>
-      <w:color w:val="60a0b0"/>
       <w:b/>
       <w:i/>
+      <w:color w:val="60A0B0"/>
     </w:rPr>
   </w:style>
-  <w:style w:type="character" w:customStyle="1" w:styleId="AlertTok">
+  <w:style w:customStyle="1" w:styleId="AlertTok" w:type="character">
     <w:name w:val="AlertTok"/>
-    <w:basedOn w:val="VerbatimChar"/>
     <w:rPr>
-      <w:color w:val="ff0000"/>
       <w:b/>
+      <w:color w:val="FF0000"/>
     </w:rPr>
   </w:style>
-  <w:style w:type="character" w:customStyle="1" w:styleId="ErrorTok">
+  <w:style w:customStyle="1" w:styleId="ErrorTok" w:type="character">
     <w:name w:val="ErrorTok"/>
-    <w:basedOn w:val="VerbatimChar"/>
     <w:rPr>
-      <w:color w:val="ff0000"/>
       <w:b/>
+      <w:color w:val="FF0000"/>
     </w:rPr>
   </w:style>
-  <w:style w:type="character" w:customStyle="1" w:styleId="NormalTok">
+  <w:style w:customStyle="1" w:styleId="NormalTok" w:type="character">
     <w:name w:val="NormalTok"/>
-    <w:basedOn w:val="VerbatimChar"/>
-    <w:rPr/>
   </w:style>
 </w:styles>
 </file>
 
 <file path=word/theme/theme1.xml><?xml version="1.0" encoding="utf-8"?>
-<a:theme xmlns:a="http://schemas.openxmlformats.org/drawingml/2006/main" name="Office Theme">
+<a:theme xmlns:a="http://schemas.openxmlformats.org/drawingml/2006/main" name="Tema di Office">
   <a:themeElements>
     <a:clrScheme name="Office">
       <a:dk1>
@@ -5326,44 +7163,44 @@
         <a:sysClr val="window" lastClr="FFFFFF"/>
       </a:lt1>
       <a:dk2>
-        <a:srgbClr val="1F497D"/>
+        <a:srgbClr val="44546A"/>
       </a:dk2>
       <a:lt2>
-        <a:srgbClr val="EEECE1"/>
+        <a:srgbClr val="E7E6E6"/>
       </a:lt2>
       <a:accent1>
-        <a:srgbClr val="4F81BD"/>
+        <a:srgbClr val="4472C4"/>
       </a:accent1>
       <a:accent2>
-        <a:srgbClr val="C0504D"/>
+        <a:srgbClr val="ED7D31"/>
       </a:accent2>
       <a:accent3>
-        <a:srgbClr val="9BBB59"/>
+        <a:srgbClr val="A5A5A5"/>
       </a:accent3>
       <a:accent4>
-        <a:srgbClr val="8064A2"/>
+        <a:srgbClr val="FFC000"/>
       </a:accent4>
       <a:accent5>
-        <a:srgbClr val="4BACC6"/>
+        <a:srgbClr val="5B9BD5"/>
       </a:accent5>
       <a:accent6>
-        <a:srgbClr val="F79646"/>
+        <a:srgbClr val="70AD47"/>
       </a:accent6>
       <a:hlink>
-        <a:srgbClr val="0000FF"/>
+        <a:srgbClr val="0563C1"/>
       </a:hlink>
       <a:folHlink>
-        <a:srgbClr val="800080"/>
+        <a:srgbClr val="954F72"/>
       </a:folHlink>
     </a:clrScheme>
     <a:fontScheme name="Office">
       <a:majorFont>
-        <a:latin typeface="Calibri"/>
+        <a:latin typeface="Calibri Light" panose="020F0302020204030204"/>
         <a:ea typeface=""/>
         <a:cs typeface=""/>
-        <a:font script="Jpan" typeface="ＭＳ ゴシック"/>
+        <a:font script="Jpan" typeface="游ゴシック Light"/>
         <a:font script="Hang" typeface="맑은 고딕"/>
-        <a:font script="Hans" typeface="宋体"/>
+        <a:font script="Hans" typeface="等线 Light"/>
         <a:font script="Hant" typeface="新細明體"/>
         <a:font script="Arab" typeface="Times New Roman"/>
         <a:font script="Hebr" typeface="Times New Roman"/>
@@ -5390,14 +7227,32 @@
         <a:font script="Mong" typeface="Mongolian Baiti"/>
         <a:font script="Viet" typeface="Times New Roman"/>
         <a:font script="Uigh" typeface="Microsoft Uighur"/>
+        <a:font script="Geor" typeface="Sylfaen"/>
+        <a:font script="Armn" typeface="Arial"/>
+        <a:font script="Bugi" typeface="Leelawadee UI"/>
+        <a:font script="Bopo" typeface="Microsoft JhengHei"/>
+        <a:font script="Java" typeface="Javanese Text"/>
+        <a:font script="Lisu" typeface="Segoe UI"/>
+        <a:font script="Mymr" typeface="Myanmar Text"/>
+        <a:font script="Nkoo" typeface="Ebrima"/>
+        <a:font script="Olck" typeface="Nirmala UI"/>
+        <a:font script="Osma" typeface="Ebrima"/>
+        <a:font script="Phag" typeface="Phagspa"/>
+        <a:font script="Syrn" typeface="Estrangelo Edessa"/>
+        <a:font script="Syrj" typeface="Estrangelo Edessa"/>
+        <a:font script="Syre" typeface="Estrangelo Edessa"/>
+        <a:font script="Sora" typeface="Nirmala UI"/>
+        <a:font script="Tale" typeface="Microsoft Tai Le"/>
+        <a:font script="Talu" typeface="Microsoft New Tai Lue"/>
+        <a:font script="Tfng" typeface="Ebrima"/>
       </a:majorFont>
       <a:minorFont>
-        <a:latin typeface="Cambria"/>
+        <a:latin typeface="Calibri" panose="020F0502020204030204"/>
         <a:ea typeface=""/>
         <a:cs typeface=""/>
-        <a:font script="Jpan" typeface="ＭＳ 明朝"/>
+        <a:font script="Jpan" typeface="游明朝"/>
         <a:font script="Hang" typeface="맑은 고딕"/>
-        <a:font script="Hans" typeface="宋体"/>
+        <a:font script="Hans" typeface="等线"/>
         <a:font script="Hant" typeface="新細明體"/>
         <a:font script="Arab" typeface="Arial"/>
         <a:font script="Hebr" typeface="Arial"/>
@@ -5424,6 +7279,24 @@
         <a:font script="Mong" typeface="Mongolian Baiti"/>
         <a:font script="Viet" typeface="Arial"/>
         <a:font script="Uigh" typeface="Microsoft Uighur"/>
+        <a:font script="Geor" typeface="Sylfaen"/>
+        <a:font script="Armn" typeface="Arial"/>
+        <a:font script="Bugi" typeface="Leelawadee UI"/>
+        <a:font script="Bopo" typeface="Microsoft JhengHei"/>
+        <a:font script="Java" typeface="Javanese Text"/>
+        <a:font script="Lisu" typeface="Segoe UI"/>
+        <a:font script="Mymr" typeface="Myanmar Text"/>
+        <a:font script="Nkoo" typeface="Ebrima"/>
+        <a:font script="Olck" typeface="Nirmala UI"/>
+        <a:font script="Osma" typeface="Ebrima"/>
+        <a:font script="Phag" typeface="Phagspa"/>
+        <a:font script="Syrn" typeface="Estrangelo Edessa"/>
+        <a:font script="Syrj" typeface="Estrangelo Edessa"/>
+        <a:font script="Syre" typeface="Estrangelo Edessa"/>
+        <a:font script="Sora" typeface="Nirmala UI"/>
+        <a:font script="Tale" typeface="Microsoft Tai Le"/>
+        <a:font script="Talu" typeface="Microsoft New Tai Lue"/>
+        <a:font script="Tfng" typeface="Ebrima"/>
       </a:minorFont>
     </a:fontScheme>
     <a:fmtScheme name="Office">
@@ -5435,200 +7308,141 @@
           <a:gsLst>
             <a:gs pos="0">
               <a:schemeClr val="phClr">
-                <a:tint val="50000"/>
-                <a:satMod val="300000"/>
+                <a:lumMod val="110000"/>
+                <a:satMod val="105000"/>
+                <a:tint val="67000"/>
               </a:schemeClr>
             </a:gs>
-            <a:gs pos="35000">
+            <a:gs pos="50000">
               <a:schemeClr val="phClr">
-                <a:tint val="37000"/>
-                <a:satMod val="300000"/>
+                <a:lumMod val="105000"/>
+                <a:satMod val="103000"/>
+                <a:tint val="73000"/>
               </a:schemeClr>
             </a:gs>
             <a:gs pos="100000">
               <a:schemeClr val="phClr">
-                <a:tint val="15000"/>
-                <a:satMod val="350000"/>
+                <a:lumMod val="105000"/>
+                <a:satMod val="109000"/>
+                <a:tint val="81000"/>
               </a:schemeClr>
             </a:gs>
           </a:gsLst>
-          <a:lin ang="16200000" scaled="1"/>
+          <a:lin ang="5400000" scaled="0"/>
         </a:gradFill>
         <a:gradFill rotWithShape="1">
           <a:gsLst>
             <a:gs pos="0">
               <a:schemeClr val="phClr">
-                <a:tint val="100000"/>
+                <a:satMod val="103000"/>
+                <a:lumMod val="102000"/>
+                <a:tint val="94000"/>
+              </a:schemeClr>
+            </a:gs>
+            <a:gs pos="50000">
+              <a:schemeClr val="phClr">
+                <a:satMod val="110000"/>
+                <a:lumMod val="100000"/>
                 <a:shade val="100000"/>
-                <a:satMod val="130000"/>
               </a:schemeClr>
             </a:gs>
             <a:gs pos="100000">
               <a:schemeClr val="phClr">
-                <a:tint val="50000"/>
-                <a:shade val="100000"/>
-                <a:satMod val="350000"/>
+                <a:lumMod val="99000"/>
+                <a:satMod val="120000"/>
+                <a:shade val="78000"/>
               </a:schemeClr>
             </a:gs>
           </a:gsLst>
-          <a:lin ang="16200000" scaled="0"/>
+          <a:lin ang="5400000" scaled="0"/>
         </a:gradFill>
       </a:fillStyleLst>
       <a:lnStyleLst>
-        <a:ln w="9525" cap="flat" cmpd="sng" algn="ctr">
-          <a:solidFill>
-            <a:schemeClr val="phClr">
-              <a:shade val="95000"/>
-              <a:satMod val="105000"/>
-            </a:schemeClr>
-          </a:solidFill>
-          <a:prstDash val="solid"/>
-        </a:ln>
-        <a:ln w="25400" cap="flat" cmpd="sng" algn="ctr">
+        <a:ln w="6350" cap="flat" cmpd="sng" algn="ctr">
           <a:solidFill>
             <a:schemeClr val="phClr"/>
           </a:solidFill>
           <a:prstDash val="solid"/>
+          <a:miter lim="800000"/>
         </a:ln>
-        <a:ln w="38100" cap="flat" cmpd="sng" algn="ctr">
+        <a:ln w="12700" cap="flat" cmpd="sng" algn="ctr">
           <a:solidFill>
             <a:schemeClr val="phClr"/>
           </a:solidFill>
           <a:prstDash val="solid"/>
+          <a:miter lim="800000"/>
+        </a:ln>
+        <a:ln w="19050" cap="flat" cmpd="sng" algn="ctr">
+          <a:solidFill>
+            <a:schemeClr val="phClr"/>
+          </a:solidFill>
+          <a:prstDash val="solid"/>
+          <a:miter lim="800000"/>
         </a:ln>
       </a:lnStyleLst>
       <a:effectStyleLst>
         <a:effectStyle>
+          <a:effectLst/>
+        </a:effectStyle>
+        <a:effectStyle>
+          <a:effectLst/>
+        </a:effectStyle>
+        <a:effectStyle>
           <a:effectLst>
-            <a:outerShdw blurRad="40000" dist="20000" dir="5400000" rotWithShape="0">
+            <a:outerShdw blurRad="57150" dist="19050" dir="5400000" algn="ctr" rotWithShape="0">
               <a:srgbClr val="000000">
-                <a:alpha val="38000"/>
+                <a:alpha val="63000"/>
               </a:srgbClr>
             </a:outerShdw>
           </a:effectLst>
-        </a:effectStyle>
-        <a:effectStyle>
-          <a:effectLst>
-            <a:outerShdw blurRad="40000" dist="23000" dir="5400000" rotWithShape="0">
-              <a:srgbClr val="000000">
-                <a:alpha val="35000"/>
-              </a:srgbClr>
-            </a:outerShdw>
-          </a:effectLst>
-        </a:effectStyle>
-        <a:effectStyle>
-          <a:effectLst>
-            <a:outerShdw blurRad="40000" dist="23000" dir="5400000" rotWithShape="0">
-              <a:srgbClr val="000000">
-                <a:alpha val="35000"/>
-              </a:srgbClr>
-            </a:outerShdw>
-          </a:effectLst>
-          <a:scene3d>
-            <a:camera prst="orthographicFront">
-              <a:rot lat="0" lon="0" rev="0"/>
-            </a:camera>
-            <a:lightRig rig="threePt" dir="t">
-              <a:rot lat="0" lon="0" rev="1200000"/>
-            </a:lightRig>
-          </a:scene3d>
-          <a:sp3d>
-            <a:bevelT w="63500" h="25400"/>
-          </a:sp3d>
         </a:effectStyle>
       </a:effectStyleLst>
       <a:bgFillStyleLst>
         <a:solidFill>
           <a:schemeClr val="phClr"/>
         </a:solidFill>
+        <a:solidFill>
+          <a:schemeClr val="phClr">
+            <a:tint val="95000"/>
+            <a:satMod val="170000"/>
+          </a:schemeClr>
+        </a:solidFill>
         <a:gradFill rotWithShape="1">
           <a:gsLst>
             <a:gs pos="0">
               <a:schemeClr val="phClr">
-                <a:tint val="40000"/>
-                <a:satMod val="350000"/>
+                <a:tint val="93000"/>
+                <a:satMod val="150000"/>
+                <a:shade val="98000"/>
+                <a:lumMod val="102000"/>
               </a:schemeClr>
             </a:gs>
-            <a:gs pos="40000">
+            <a:gs pos="50000">
               <a:schemeClr val="phClr">
-                <a:tint val="45000"/>
-                <a:shade val="99000"/>
-                <a:satMod val="350000"/>
+                <a:tint val="98000"/>
+                <a:satMod val="130000"/>
+                <a:shade val="90000"/>
+                <a:lumMod val="103000"/>
               </a:schemeClr>
             </a:gs>
             <a:gs pos="100000">
               <a:schemeClr val="phClr">
-                <a:shade val="20000"/>
-                <a:satMod val="255000"/>
+                <a:shade val="63000"/>
+                <a:satMod val="120000"/>
               </a:schemeClr>
             </a:gs>
           </a:gsLst>
-          <a:path path="circle">
-            <a:fillToRect l="50000" t="-80000" r="50000" b="180000"/>
-          </a:path>
-        </a:gradFill>
-        <a:gradFill rotWithShape="1">
-          <a:gsLst>
-            <a:gs pos="0">
-              <a:schemeClr val="phClr">
-                <a:tint val="80000"/>
-                <a:satMod val="300000"/>
-              </a:schemeClr>
-            </a:gs>
-            <a:gs pos="100000">
-              <a:schemeClr val="phClr">
-                <a:shade val="30000"/>
-                <a:satMod val="200000"/>
-              </a:schemeClr>
-            </a:gs>
-          </a:gsLst>
-          <a:path path="circle">
-            <a:fillToRect l="50000" t="50000" r="50000" b="50000"/>
-          </a:path>
+          <a:lin ang="5400000" scaled="0"/>
         </a:gradFill>
       </a:bgFillStyleLst>
     </a:fmtScheme>
   </a:themeElements>
-  <a:objectDefaults>
-    <a:spDef>
-      <a:spPr/>
-      <a:bodyPr/>
-      <a:lstStyle/>
-      <a:style>
-        <a:lnRef idx="1">
-          <a:schemeClr val="accent1"/>
-        </a:lnRef>
-        <a:fillRef idx="3">
-          <a:schemeClr val="accent1"/>
-        </a:fillRef>
-        <a:effectRef idx="2">
-          <a:schemeClr val="accent1"/>
-        </a:effectRef>
-        <a:fontRef idx="minor">
-          <a:schemeClr val="lt1"/>
-        </a:fontRef>
-      </a:style>
-    </a:spDef>
-    <a:lnDef>
-      <a:spPr/>
-      <a:bodyPr/>
-      <a:lstStyle/>
-      <a:style>
-        <a:lnRef idx="2">
-          <a:schemeClr val="accent1"/>
-        </a:lnRef>
-        <a:fillRef idx="0">
-          <a:schemeClr val="accent1"/>
-        </a:fillRef>
-        <a:effectRef idx="1">
-          <a:schemeClr val="accent1"/>
-        </a:effectRef>
-        <a:fontRef idx="minor">
-          <a:schemeClr val="tx1"/>
-        </a:fontRef>
-      </a:style>
-    </a:lnDef>
-  </a:objectDefaults>
+  <a:objectDefaults/>
   <a:extraClrSchemeLst/>
+  <a:extLst>
+    <a:ext uri="{05A4C25C-085E-4340-85A3-A5531E510DB2}">
+      <thm15:themeFamily xmlns:thm15="http://schemas.microsoft.com/office/thememl/2012/main" name="Office Theme" id="{62F939B6-93AF-4DB8-9C6B-D6C7DFDC589F}" vid="{4A3C46E8-61CC-4603-A589-7422A47A8E4A}"/>
+    </a:ext>
+  </a:extLst>
 </a:theme>
 </file>
</xml_diff>